<commit_message>
Reserva: Sincronizacao de arquivos e atualizacao de logica de propostas
</commit_message>
<xml_diff>
--- a/modelos_prod/ModeloPropostaDrone.docx
+++ b/modelos_prod/ModeloPropostaDrone.docx
@@ -132,7 +132,7 @@
           <w:rFonts w:ascii="Google Sans" w:eastAsia="Google Sans" w:hAnsi="Google Sans" w:cs="Google Sans"/>
           <w:color w:val="1F1F1F"/>
         </w:rPr>
-        <w:t>📌 Dados do Cliente</w:t>
+        <w:t>Dados do Cliente</w:t>
       </w:r>
     </w:p>
     <w:p>
@@ -325,7 +325,7 @@
           <w:rFonts w:ascii="Google Sans" w:eastAsia="Google Sans" w:hAnsi="Google Sans" w:cs="Google Sans"/>
           <w:color w:val="1F1F1F"/>
         </w:rPr>
-        <w:t>📍 Local da Obra</w:t>
+        <w:t>Local da Obra</w:t>
       </w:r>
     </w:p>
     <w:p>
@@ -558,6 +558,7 @@
           <w:color w:val="1F1F1F"/>
         </w:rPr>
       </w:pPr>
+      <w:bookmarkStart w:id="0" w:name="_Hlk222249897"/>
       <w:r>
         <w:rPr>
           <w:rFonts w:ascii="Google Sans" w:eastAsia="Google Sans" w:hAnsi="Google Sans" w:cs="Google Sans"/>
@@ -579,31 +580,17 @@
         <w:jc w:val="both"/>
         <w:rPr>
           <w:rFonts w:ascii="Google Sans Text" w:eastAsia="Google Sans Text" w:hAnsi="Google Sans Text" w:cs="Google Sans Text"/>
-          <w:color w:val="1F1F1F"/>
-        </w:rPr>
-      </w:pPr>
-      <w:r>
-        <w:rPr>
-          <w:rFonts w:ascii="Google Sans Text" w:eastAsia="Google Sans Text" w:hAnsi="Google Sans Text" w:cs="Google Sans Text"/>
-          <w:color w:val="1F1F1F"/>
-        </w:rPr>
-        <w:t xml:space="preserve">A </w:t>
-      </w:r>
-      <w:r>
-        <w:rPr>
-          <w:rFonts w:ascii="Google Sans Text" w:eastAsia="Google Sans Text" w:hAnsi="Google Sans Text" w:cs="Google Sans Text"/>
           <w:b/>
           <w:bCs/>
           <w:color w:val="1F1F1F"/>
         </w:rPr>
-        <w:t>${Empresa}</w:t>
-      </w:r>
-      <w:r>
-        <w:rPr>
-          <w:rFonts w:ascii="Google Sans Text" w:eastAsia="Google Sans Text" w:hAnsi="Google Sans Text" w:cs="Google Sans Text"/>
-          <w:color w:val="1F1F1F"/>
-        </w:rPr>
-        <w:t xml:space="preserve"> apresenta esta proposta técnica visando a execução de levantamento topográfico planialtimétrico através de </w:t>
+      </w:pPr>
+      <w:r>
+        <w:rPr>
+          <w:rFonts w:ascii="Google Sans Text" w:eastAsia="Google Sans Text" w:hAnsi="Google Sans Text" w:cs="Google Sans Text"/>
+          <w:color w:val="1F1F1F"/>
+        </w:rPr>
+        <w:t xml:space="preserve">A </w:t>
       </w:r>
       <w:r>
         <w:rPr>
@@ -612,9 +599,15 @@
           <w:bCs/>
           <w:color w:val="1F1F1F"/>
         </w:rPr>
-        <w:t>Aerofotogrametria com Drones (</w:t>
-      </w:r>
-      <w:proofErr w:type="spellStart"/>
+        <w:t>${Empresa}</w:t>
+      </w:r>
+      <w:r>
+        <w:rPr>
+          <w:rFonts w:ascii="Google Sans Text" w:eastAsia="Google Sans Text" w:hAnsi="Google Sans Text" w:cs="Google Sans Text"/>
+          <w:color w:val="1F1F1F"/>
+        </w:rPr>
+        <w:t xml:space="preserve"> apresenta esta proposta técnica visando a execução de levantamento topográfico planialtimétrico através de </w:t>
+      </w:r>
       <w:r>
         <w:rPr>
           <w:rFonts w:ascii="Google Sans Text" w:eastAsia="Google Sans Text" w:hAnsi="Google Sans Text" w:cs="Google Sans Text"/>
@@ -622,9 +615,9 @@
           <w:bCs/>
           <w:color w:val="1F1F1F"/>
         </w:rPr>
-        <w:t>VANTs</w:t>
-      </w:r>
-      <w:proofErr w:type="spellEnd"/>
+        <w:t>Aerofotogrametria com Drones (</w:t>
+      </w:r>
+      <w:proofErr w:type="spellStart"/>
       <w:r>
         <w:rPr>
           <w:rFonts w:ascii="Google Sans Text" w:eastAsia="Google Sans Text" w:hAnsi="Google Sans Text" w:cs="Google Sans Text"/>
@@ -632,6 +625,16 @@
           <w:bCs/>
           <w:color w:val="1F1F1F"/>
         </w:rPr>
+        <w:t>VANTs</w:t>
+      </w:r>
+      <w:proofErr w:type="spellEnd"/>
+      <w:r>
+        <w:rPr>
+          <w:rFonts w:ascii="Google Sans Text" w:eastAsia="Google Sans Text" w:hAnsi="Google Sans Text" w:cs="Google Sans Text"/>
+          <w:b/>
+          <w:bCs/>
+          <w:color w:val="1F1F1F"/>
+        </w:rPr>
         <w:t>)</w:t>
       </w:r>
       <w:r>
@@ -640,6 +643,39 @@
           <w:color w:val="1F1F1F"/>
         </w:rPr>
         <w:t>.</w:t>
+      </w:r>
+      <w:bookmarkEnd w:id="0"/>
+      <w:r>
+        <w:rPr>
+          <w:rFonts w:ascii="Google Sans Text" w:eastAsia="Google Sans Text" w:hAnsi="Google Sans Text" w:cs="Google Sans Text"/>
+          <w:color w:val="1F1F1F"/>
+        </w:rPr>
+        <w:t xml:space="preserve"> </w:t>
+      </w:r>
+      <w:r>
+        <w:rPr>
+          <w:rFonts w:ascii="Google Sans Text" w:eastAsia="Google Sans Text" w:hAnsi="Google Sans Text" w:cs="Google Sans Text"/>
+          <w:color w:val="1F1F1F"/>
+        </w:rPr>
+        <w:t>Diferente de simples filmagens aéreas, este serviço trata-se de Engenharia de Precisão. O objetivo é gerar uma representação digital fiel do terreno, com coordenadas exatas (Latitude, Longitude e Altitude), servindo de base legal e técnica para projetos de arquitetura, loteamentos, regularização fundiária e cálculos de volume, se necessário.</w:t>
+      </w:r>
+    </w:p>
+    <w:p/>
+    <w:p>
+      <w:pPr>
+        <w:pStyle w:val="Ttulo2"/>
+        <w:spacing w:before="120" w:after="120" w:line="275" w:lineRule="auto"/>
+        <w:rPr>
+          <w:rFonts w:ascii="Google Sans" w:eastAsia="Google Sans" w:hAnsi="Google Sans" w:cs="Google Sans"/>
+          <w:color w:val="1F1F1F"/>
+        </w:rPr>
+      </w:pPr>
+      <w:r>
+        <w:rPr>
+          <w:rFonts w:ascii="Google Sans" w:eastAsia="Google Sans" w:hAnsi="Google Sans" w:cs="Google Sans"/>
+          <w:color w:val="1F1F1F"/>
+        </w:rPr>
+        <w:t>2. Finalidade</w:t>
       </w:r>
     </w:p>
     <w:p>
@@ -655,31 +691,726 @@
         <w:jc w:val="both"/>
         <w:rPr>
           <w:rFonts w:ascii="Google Sans Text" w:eastAsia="Google Sans Text" w:hAnsi="Google Sans Text" w:cs="Google Sans Text"/>
-          <w:color w:val="1F1F1F"/>
-        </w:rPr>
-      </w:pPr>
-      <w:r>
-        <w:rPr>
-          <w:rFonts w:ascii="Google Sans Text" w:eastAsia="Google Sans Text" w:hAnsi="Google Sans Text" w:cs="Google Sans Text"/>
-          <w:color w:val="1F1F1F"/>
-        </w:rPr>
-        <w:t xml:space="preserve">Diferente de simples filmagens aéreas, este serviço trata-se de </w:t>
-      </w:r>
-      <w:r>
-        <w:rPr>
-          <w:rFonts w:ascii="Google Sans Text" w:eastAsia="Google Sans Text" w:hAnsi="Google Sans Text" w:cs="Google Sans Text"/>
+          <w:i/>
+          <w:iCs/>
+          <w:color w:val="1F1F1F"/>
+        </w:rPr>
+      </w:pPr>
+      <w:r>
+        <w:rPr>
+          <w:rFonts w:ascii="Google Sans Text" w:eastAsia="Google Sans Text" w:hAnsi="Google Sans Text" w:cs="Google Sans Text"/>
+          <w:i/>
+          <w:iCs/>
+          <w:color w:val="1F1F1F"/>
+        </w:rPr>
+        <w:t>${finalidade}</w:t>
+      </w:r>
+      <w:r>
+        <w:rPr>
+          <w:rFonts w:ascii="Google Sans Text" w:eastAsia="Google Sans Text" w:hAnsi="Google Sans Text" w:cs="Google Sans Text"/>
+          <w:i/>
+          <w:iCs/>
+          <w:color w:val="1F1F1F"/>
+        </w:rPr>
+        <w:br/>
+      </w:r>
+    </w:p>
+    <w:p>
+      <w:pPr>
+        <w:pStyle w:val="Ttulo2"/>
+        <w:spacing w:before="0" w:after="120" w:line="275" w:lineRule="auto"/>
+        <w:rPr>
+          <w:rFonts w:ascii="Google Sans" w:eastAsia="Google Sans" w:hAnsi="Google Sans" w:cs="Google Sans"/>
+          <w:color w:val="1F1F1F"/>
+        </w:rPr>
+      </w:pPr>
+      <w:r>
+        <w:rPr>
+          <w:rFonts w:ascii="Google Sans" w:eastAsia="Google Sans" w:hAnsi="Google Sans" w:cs="Google Sans"/>
+          <w:color w:val="1F1F1F"/>
+        </w:rPr>
+        <w:t>3. Escopo do Serviço</w:t>
+      </w:r>
+    </w:p>
+    <w:p>
+      <w:pPr>
+        <w:widowControl/>
+        <w:spacing w:before="100" w:beforeAutospacing="1" w:after="100" w:afterAutospacing="1"/>
+        <w:rPr>
+          <w:rFonts w:ascii="Times New Roman" w:eastAsia="Times New Roman" w:hAnsi="Times New Roman" w:cs="Times New Roman"/>
+          <w:sz w:val="24"/>
+          <w:szCs w:val="24"/>
+        </w:rPr>
+      </w:pPr>
+      <w:r>
+        <w:rPr>
+          <w:rFonts w:ascii="Times New Roman" w:eastAsia="Times New Roman" w:hAnsi="Times New Roman" w:cs="Times New Roman"/>
+          <w:sz w:val="24"/>
+          <w:szCs w:val="24"/>
+        </w:rPr>
+        <w:t>Levantamento Fotogramétrico com Drone</w:t>
+      </w:r>
+    </w:p>
+    <w:p>
+      <w:pPr>
+        <w:widowControl/>
+        <w:spacing w:before="100" w:beforeAutospacing="1" w:after="100" w:afterAutospacing="1"/>
+        <w:rPr>
+          <w:rFonts w:ascii="Times New Roman" w:eastAsia="Times New Roman" w:hAnsi="Times New Roman" w:cs="Times New Roman"/>
           <w:b/>
           <w:bCs/>
-          <w:color w:val="1F1F1F"/>
-        </w:rPr>
-        <w:t>Engenharia de Precisão</w:t>
-      </w:r>
-      <w:r>
-        <w:rPr>
-          <w:rFonts w:ascii="Google Sans Text" w:eastAsia="Google Sans Text" w:hAnsi="Google Sans Text" w:cs="Google Sans Text"/>
-          <w:color w:val="1F1F1F"/>
-        </w:rPr>
-        <w:t>. O objetivo é gerar uma representação digital fiel do terreno, com coordenadas exatas (Latitude, Longitude e Altitude), servindo de base legal e técnica para projetos de arquitetura, loteamentos, regularização fundiária e cálculos de volume, se necessário.</w:t>
+          <w:sz w:val="24"/>
+          <w:szCs w:val="24"/>
+        </w:rPr>
+      </w:pPr>
+      <w:r>
+        <w:rPr>
+          <w:rFonts w:ascii="Times New Roman" w:eastAsia="Times New Roman" w:hAnsi="Times New Roman" w:cs="Times New Roman"/>
+          <w:sz w:val="24"/>
+          <w:szCs w:val="24"/>
+        </w:rPr>
+        <w:lastRenderedPageBreak/>
+        <w:t xml:space="preserve">Execução de levantamento na área de </w:t>
+      </w:r>
+      <w:r>
+        <w:rPr>
+          <w:rFonts w:ascii="Times New Roman" w:eastAsia="Times New Roman" w:hAnsi="Times New Roman" w:cs="Times New Roman"/>
+          <w:b/>
+          <w:bCs/>
+          <w:sz w:val="24"/>
+          <w:szCs w:val="24"/>
+        </w:rPr>
+        <w:t>${</w:t>
+      </w:r>
+      <w:proofErr w:type="spellStart"/>
+      <w:r>
+        <w:rPr>
+          <w:rFonts w:ascii="Times New Roman" w:eastAsia="Times New Roman" w:hAnsi="Times New Roman" w:cs="Times New Roman"/>
+          <w:b/>
+          <w:bCs/>
+          <w:sz w:val="24"/>
+          <w:szCs w:val="24"/>
+        </w:rPr>
+        <w:t>AreaEstimada</w:t>
+      </w:r>
+      <w:proofErr w:type="spellEnd"/>
+      <w:r>
+        <w:rPr>
+          <w:rFonts w:ascii="Times New Roman" w:eastAsia="Times New Roman" w:hAnsi="Times New Roman" w:cs="Times New Roman"/>
+          <w:b/>
+          <w:bCs/>
+          <w:sz w:val="24"/>
+          <w:szCs w:val="24"/>
+        </w:rPr>
+        <w:t>} ${</w:t>
+      </w:r>
+      <w:proofErr w:type="spellStart"/>
+      <w:r>
+        <w:rPr>
+          <w:rFonts w:ascii="Times New Roman" w:eastAsia="Times New Roman" w:hAnsi="Times New Roman" w:cs="Times New Roman"/>
+          <w:b/>
+          <w:bCs/>
+          <w:sz w:val="24"/>
+          <w:szCs w:val="24"/>
+        </w:rPr>
+        <w:t>unidade_area</w:t>
+      </w:r>
+      <w:proofErr w:type="spellEnd"/>
+      <w:r>
+        <w:rPr>
+          <w:rFonts w:ascii="Times New Roman" w:eastAsia="Times New Roman" w:hAnsi="Times New Roman" w:cs="Times New Roman"/>
+          <w:b/>
+          <w:bCs/>
+          <w:sz w:val="24"/>
+          <w:szCs w:val="24"/>
+        </w:rPr>
+        <w:t>}</w:t>
+      </w:r>
+      <w:r>
+        <w:rPr>
+          <w:rFonts w:ascii="Times New Roman" w:eastAsia="Times New Roman" w:hAnsi="Times New Roman" w:cs="Times New Roman"/>
+          <w:sz w:val="24"/>
+          <w:szCs w:val="24"/>
+        </w:rPr>
+        <w:t xml:space="preserve">, localizada em </w:t>
+      </w:r>
+      <w:r>
+        <w:rPr>
+          <w:rFonts w:ascii="Times New Roman" w:eastAsia="Times New Roman" w:hAnsi="Times New Roman" w:cs="Times New Roman"/>
+          <w:b/>
+          <w:bCs/>
+          <w:sz w:val="24"/>
+          <w:szCs w:val="24"/>
+        </w:rPr>
+        <w:t>${</w:t>
+      </w:r>
+      <w:proofErr w:type="spellStart"/>
+      <w:r>
+        <w:rPr>
+          <w:rFonts w:ascii="Times New Roman" w:eastAsia="Times New Roman" w:hAnsi="Times New Roman" w:cs="Times New Roman"/>
+          <w:b/>
+          <w:bCs/>
+          <w:sz w:val="24"/>
+          <w:szCs w:val="24"/>
+        </w:rPr>
+        <w:t>cidade_obra</w:t>
+      </w:r>
+      <w:proofErr w:type="spellEnd"/>
+      <w:r>
+        <w:rPr>
+          <w:rFonts w:ascii="Times New Roman" w:eastAsia="Times New Roman" w:hAnsi="Times New Roman" w:cs="Times New Roman"/>
+          <w:b/>
+          <w:bCs/>
+          <w:sz w:val="24"/>
+          <w:szCs w:val="24"/>
+        </w:rPr>
+        <w:t>} -${</w:t>
+      </w:r>
+      <w:proofErr w:type="spellStart"/>
+      <w:r>
+        <w:rPr>
+          <w:rFonts w:ascii="Times New Roman" w:eastAsia="Times New Roman" w:hAnsi="Times New Roman" w:cs="Times New Roman"/>
+          <w:b/>
+          <w:bCs/>
+          <w:sz w:val="24"/>
+          <w:szCs w:val="24"/>
+        </w:rPr>
+        <w:t>estado_obra</w:t>
+      </w:r>
+      <w:proofErr w:type="spellEnd"/>
+      <w:proofErr w:type="gramStart"/>
+      <w:r>
+        <w:rPr>
+          <w:rFonts w:ascii="Times New Roman" w:eastAsia="Times New Roman" w:hAnsi="Times New Roman" w:cs="Times New Roman"/>
+          <w:b/>
+          <w:bCs/>
+          <w:sz w:val="24"/>
+          <w:szCs w:val="24"/>
+        </w:rPr>
+        <w:t xml:space="preserve">} </w:t>
+      </w:r>
+      <w:r>
+        <w:rPr>
+          <w:rFonts w:ascii="Times New Roman" w:eastAsia="Times New Roman" w:hAnsi="Times New Roman" w:cs="Times New Roman"/>
+          <w:sz w:val="24"/>
+          <w:szCs w:val="24"/>
+        </w:rPr>
+        <w:t>,</w:t>
+      </w:r>
+      <w:proofErr w:type="gramEnd"/>
+      <w:r>
+        <w:rPr>
+          <w:rFonts w:ascii="Times New Roman" w:eastAsia="Times New Roman" w:hAnsi="Times New Roman" w:cs="Times New Roman"/>
+          <w:sz w:val="24"/>
+          <w:szCs w:val="24"/>
+        </w:rPr>
+        <w:t xml:space="preserve"> com as seguintes características:</w:t>
+      </w:r>
+    </w:p>
+    <w:p>
+      <w:pPr>
+        <w:widowControl/>
+        <w:numPr>
+          <w:ilvl w:val="0"/>
+          <w:numId w:val="14"/>
+        </w:numPr>
+        <w:spacing w:before="100" w:beforeAutospacing="1" w:after="100" w:afterAutospacing="1"/>
+        <w:rPr>
+          <w:rFonts w:ascii="Times New Roman" w:eastAsia="Times New Roman" w:hAnsi="Times New Roman" w:cs="Times New Roman"/>
+          <w:sz w:val="24"/>
+          <w:szCs w:val="24"/>
+        </w:rPr>
+      </w:pPr>
+      <w:r>
+        <w:rPr>
+          <w:rFonts w:ascii="Times New Roman" w:eastAsia="Times New Roman" w:hAnsi="Times New Roman" w:cs="Times New Roman"/>
+          <w:sz w:val="24"/>
+          <w:szCs w:val="24"/>
+        </w:rPr>
+        <w:t xml:space="preserve">Tipo de Terreno: </w:t>
+      </w:r>
+      <w:r>
+        <w:rPr>
+          <w:rFonts w:ascii="Times New Roman" w:eastAsia="Times New Roman" w:hAnsi="Times New Roman" w:cs="Times New Roman"/>
+          <w:sz w:val="24"/>
+          <w:szCs w:val="24"/>
+        </w:rPr>
+        <w:t>${</w:t>
+      </w:r>
+      <w:proofErr w:type="spellStart"/>
+      <w:r>
+        <w:rPr>
+          <w:rFonts w:ascii="Times New Roman" w:eastAsia="Times New Roman" w:hAnsi="Times New Roman" w:cs="Times New Roman"/>
+          <w:sz w:val="24"/>
+          <w:szCs w:val="24"/>
+        </w:rPr>
+        <w:t>TipoTerreno</w:t>
+      </w:r>
+      <w:proofErr w:type="spellEnd"/>
+      <w:r>
+        <w:rPr>
+          <w:rFonts w:ascii="Times New Roman" w:eastAsia="Times New Roman" w:hAnsi="Times New Roman" w:cs="Times New Roman"/>
+          <w:sz w:val="24"/>
+          <w:szCs w:val="24"/>
+        </w:rPr>
+        <w:t>}</w:t>
+      </w:r>
+      <w:r>
+        <w:rPr>
+          <w:rFonts w:ascii="Times New Roman" w:eastAsia="Times New Roman" w:hAnsi="Times New Roman" w:cs="Times New Roman"/>
+          <w:sz w:val="24"/>
+          <w:szCs w:val="24"/>
+        </w:rPr>
+        <w:t>;</w:t>
+      </w:r>
+    </w:p>
+    <w:p>
+      <w:pPr>
+        <w:widowControl/>
+        <w:numPr>
+          <w:ilvl w:val="0"/>
+          <w:numId w:val="14"/>
+        </w:numPr>
+        <w:spacing w:before="100" w:beforeAutospacing="1" w:after="100" w:afterAutospacing="1"/>
+        <w:rPr>
+          <w:rFonts w:ascii="Times New Roman" w:eastAsia="Times New Roman" w:hAnsi="Times New Roman" w:cs="Times New Roman"/>
+          <w:sz w:val="24"/>
+          <w:szCs w:val="24"/>
+        </w:rPr>
+      </w:pPr>
+      <w:r>
+        <w:rPr>
+          <w:rFonts w:ascii="Times New Roman" w:eastAsia="Times New Roman" w:hAnsi="Times New Roman" w:cs="Times New Roman"/>
+          <w:sz w:val="24"/>
+          <w:szCs w:val="24"/>
+        </w:rPr>
+        <w:t xml:space="preserve">Cobertura Vegetal: </w:t>
+      </w:r>
+      <w:r>
+        <w:rPr>
+          <w:rFonts w:ascii="Times New Roman" w:eastAsia="Times New Roman" w:hAnsi="Times New Roman" w:cs="Times New Roman"/>
+          <w:sz w:val="24"/>
+          <w:szCs w:val="24"/>
+        </w:rPr>
+        <w:t>${</w:t>
+      </w:r>
+      <w:proofErr w:type="spellStart"/>
+      <w:r>
+        <w:rPr>
+          <w:rFonts w:ascii="Times New Roman" w:eastAsia="Times New Roman" w:hAnsi="Times New Roman" w:cs="Times New Roman"/>
+          <w:sz w:val="24"/>
+          <w:szCs w:val="24"/>
+        </w:rPr>
+        <w:t>CoberturaVegetal</w:t>
+      </w:r>
+      <w:proofErr w:type="spellEnd"/>
+      <w:r>
+        <w:rPr>
+          <w:rFonts w:ascii="Times New Roman" w:eastAsia="Times New Roman" w:hAnsi="Times New Roman" w:cs="Times New Roman"/>
+          <w:sz w:val="24"/>
+          <w:szCs w:val="24"/>
+        </w:rPr>
+        <w:t>}</w:t>
+      </w:r>
+      <w:r>
+        <w:rPr>
+          <w:rFonts w:ascii="Times New Roman" w:eastAsia="Times New Roman" w:hAnsi="Times New Roman" w:cs="Times New Roman"/>
+          <w:sz w:val="24"/>
+          <w:szCs w:val="24"/>
+        </w:rPr>
+        <w:t>;</w:t>
+      </w:r>
+    </w:p>
+    <w:p>
+      <w:pPr>
+        <w:widowControl/>
+        <w:numPr>
+          <w:ilvl w:val="0"/>
+          <w:numId w:val="14"/>
+        </w:numPr>
+        <w:spacing w:before="100" w:beforeAutospacing="1" w:after="100" w:afterAutospacing="1"/>
+        <w:rPr>
+          <w:rFonts w:ascii="Times New Roman" w:eastAsia="Times New Roman" w:hAnsi="Times New Roman" w:cs="Times New Roman"/>
+          <w:sz w:val="24"/>
+          <w:szCs w:val="24"/>
+        </w:rPr>
+      </w:pPr>
+      <w:r>
+        <w:rPr>
+          <w:rFonts w:ascii="Times New Roman" w:eastAsia="Times New Roman" w:hAnsi="Times New Roman" w:cs="Times New Roman"/>
+          <w:sz w:val="24"/>
+          <w:szCs w:val="24"/>
+        </w:rPr>
+        <w:t xml:space="preserve">Acesso: </w:t>
+      </w:r>
+      <w:r>
+        <w:rPr>
+          <w:rFonts w:ascii="Times New Roman" w:eastAsia="Times New Roman" w:hAnsi="Times New Roman" w:cs="Times New Roman"/>
+          <w:sz w:val="24"/>
+          <w:szCs w:val="24"/>
+        </w:rPr>
+        <w:t>${</w:t>
+      </w:r>
+      <w:proofErr w:type="spellStart"/>
+      <w:r>
+        <w:rPr>
+          <w:rFonts w:ascii="Times New Roman" w:eastAsia="Times New Roman" w:hAnsi="Times New Roman" w:cs="Times New Roman"/>
+          <w:sz w:val="24"/>
+          <w:szCs w:val="24"/>
+        </w:rPr>
+        <w:t>AcessoLocal</w:t>
+      </w:r>
+      <w:proofErr w:type="spellEnd"/>
+      <w:r>
+        <w:rPr>
+          <w:rFonts w:ascii="Times New Roman" w:eastAsia="Times New Roman" w:hAnsi="Times New Roman" w:cs="Times New Roman"/>
+          <w:sz w:val="24"/>
+          <w:szCs w:val="24"/>
+        </w:rPr>
+        <w:t>}</w:t>
+      </w:r>
+      <w:r>
+        <w:rPr>
+          <w:rFonts w:ascii="Times New Roman" w:eastAsia="Times New Roman" w:hAnsi="Times New Roman" w:cs="Times New Roman"/>
+          <w:sz w:val="24"/>
+          <w:szCs w:val="24"/>
+        </w:rPr>
+        <w:t>;</w:t>
+      </w:r>
+    </w:p>
+    <w:p>
+      <w:pPr>
+        <w:widowControl/>
+        <w:numPr>
+          <w:ilvl w:val="0"/>
+          <w:numId w:val="14"/>
+        </w:numPr>
+        <w:spacing w:before="100" w:beforeAutospacing="1" w:after="100" w:afterAutospacing="1"/>
+        <w:rPr>
+          <w:rFonts w:ascii="Times New Roman" w:eastAsia="Times New Roman" w:hAnsi="Times New Roman" w:cs="Times New Roman"/>
+          <w:sz w:val="24"/>
+          <w:szCs w:val="24"/>
+        </w:rPr>
+      </w:pPr>
+      <w:r>
+        <w:rPr>
+          <w:rFonts w:ascii="Times New Roman" w:eastAsia="Times New Roman" w:hAnsi="Times New Roman" w:cs="Times New Roman"/>
+          <w:sz w:val="24"/>
+          <w:szCs w:val="24"/>
+        </w:rPr>
+        <w:t xml:space="preserve">Restrições: </w:t>
+      </w:r>
+      <w:r>
+        <w:rPr>
+          <w:rFonts w:ascii="Times New Roman" w:eastAsia="Times New Roman" w:hAnsi="Times New Roman" w:cs="Times New Roman"/>
+          <w:sz w:val="24"/>
+          <w:szCs w:val="24"/>
+        </w:rPr>
+        <w:t>${</w:t>
+      </w:r>
+      <w:proofErr w:type="spellStart"/>
+      <w:r>
+        <w:rPr>
+          <w:rFonts w:ascii="Times New Roman" w:eastAsia="Times New Roman" w:hAnsi="Times New Roman" w:cs="Times New Roman"/>
+          <w:sz w:val="24"/>
+          <w:szCs w:val="24"/>
+        </w:rPr>
+        <w:t>RestricoesAereas</w:t>
+      </w:r>
+      <w:proofErr w:type="spellEnd"/>
+      <w:r>
+        <w:rPr>
+          <w:rFonts w:ascii="Times New Roman" w:eastAsia="Times New Roman" w:hAnsi="Times New Roman" w:cs="Times New Roman"/>
+          <w:sz w:val="24"/>
+          <w:szCs w:val="24"/>
+        </w:rPr>
+        <w:t>}</w:t>
+      </w:r>
+      <w:r>
+        <w:rPr>
+          <w:rFonts w:ascii="Times New Roman" w:eastAsia="Times New Roman" w:hAnsi="Times New Roman" w:cs="Times New Roman"/>
+          <w:sz w:val="24"/>
+          <w:szCs w:val="24"/>
+        </w:rPr>
+        <w:t>.</w:t>
+      </w:r>
+    </w:p>
+    <w:p>
+      <w:pPr>
+        <w:widowControl/>
+        <w:spacing w:before="100" w:beforeAutospacing="1" w:after="100" w:afterAutospacing="1"/>
+        <w:rPr>
+          <w:rFonts w:ascii="Times New Roman" w:eastAsia="Times New Roman" w:hAnsi="Times New Roman" w:cs="Times New Roman"/>
+          <w:b/>
+          <w:bCs/>
+          <w:sz w:val="24"/>
+          <w:szCs w:val="24"/>
+        </w:rPr>
+      </w:pPr>
+      <w:r>
+        <w:rPr>
+          <w:rFonts w:ascii="Times New Roman" w:eastAsia="Times New Roman" w:hAnsi="Times New Roman" w:cs="Times New Roman"/>
+          <w:b/>
+          <w:bCs/>
+          <w:sz w:val="24"/>
+          <w:szCs w:val="24"/>
+        </w:rPr>
+        <w:t>O serviço compreende:</w:t>
+      </w:r>
+    </w:p>
+    <w:p>
+      <w:pPr>
+        <w:widowControl/>
+        <w:numPr>
+          <w:ilvl w:val="0"/>
+          <w:numId w:val="15"/>
+        </w:numPr>
+        <w:spacing w:before="100" w:beforeAutospacing="1" w:after="100" w:afterAutospacing="1"/>
+        <w:rPr>
+          <w:rFonts w:ascii="Times New Roman" w:eastAsia="Times New Roman" w:hAnsi="Times New Roman" w:cs="Times New Roman"/>
+          <w:sz w:val="24"/>
+          <w:szCs w:val="24"/>
+        </w:rPr>
+      </w:pPr>
+      <w:r>
+        <w:rPr>
+          <w:rFonts w:ascii="Times New Roman" w:eastAsia="Times New Roman" w:hAnsi="Times New Roman" w:cs="Times New Roman"/>
+          <w:sz w:val="24"/>
+          <w:szCs w:val="24"/>
+        </w:rPr>
+        <w:t xml:space="preserve">Planejamento de voo e estudo de viabilidade aérea (consulta DECEA para </w:t>
+      </w:r>
+      <w:r>
+        <w:rPr>
+          <w:rFonts w:ascii="Times New Roman" w:eastAsia="Times New Roman" w:hAnsi="Times New Roman" w:cs="Times New Roman"/>
+          <w:sz w:val="24"/>
+          <w:szCs w:val="24"/>
+        </w:rPr>
+        <w:t>${</w:t>
+      </w:r>
+      <w:proofErr w:type="spellStart"/>
+      <w:r>
+        <w:rPr>
+          <w:rFonts w:ascii="Times New Roman" w:eastAsia="Times New Roman" w:hAnsi="Times New Roman" w:cs="Times New Roman"/>
+          <w:sz w:val="24"/>
+          <w:szCs w:val="24"/>
+        </w:rPr>
+        <w:t>cidade_obra</w:t>
+      </w:r>
+      <w:proofErr w:type="spellEnd"/>
+      <w:r>
+        <w:rPr>
+          <w:rFonts w:ascii="Times New Roman" w:eastAsia="Times New Roman" w:hAnsi="Times New Roman" w:cs="Times New Roman"/>
+          <w:sz w:val="24"/>
+          <w:szCs w:val="24"/>
+        </w:rPr>
+        <w:t xml:space="preserve">} </w:t>
+      </w:r>
+      <w:r>
+        <w:rPr>
+          <w:rFonts w:ascii="Times New Roman" w:eastAsia="Times New Roman" w:hAnsi="Times New Roman" w:cs="Times New Roman"/>
+          <w:sz w:val="24"/>
+          <w:szCs w:val="24"/>
+        </w:rPr>
+        <w:t>-</w:t>
+      </w:r>
+      <w:r>
+        <w:rPr>
+          <w:rFonts w:ascii="Times New Roman" w:eastAsia="Times New Roman" w:hAnsi="Times New Roman" w:cs="Times New Roman"/>
+          <w:sz w:val="24"/>
+          <w:szCs w:val="24"/>
+        </w:rPr>
+        <w:t>${</w:t>
+      </w:r>
+      <w:proofErr w:type="spellStart"/>
+      <w:r>
+        <w:rPr>
+          <w:rFonts w:ascii="Times New Roman" w:eastAsia="Times New Roman" w:hAnsi="Times New Roman" w:cs="Times New Roman"/>
+          <w:sz w:val="24"/>
+          <w:szCs w:val="24"/>
+        </w:rPr>
+        <w:t>estado_obra</w:t>
+      </w:r>
+      <w:proofErr w:type="spellEnd"/>
+      <w:r>
+        <w:rPr>
+          <w:rFonts w:ascii="Times New Roman" w:eastAsia="Times New Roman" w:hAnsi="Times New Roman" w:cs="Times New Roman"/>
+          <w:sz w:val="24"/>
+          <w:szCs w:val="24"/>
+        </w:rPr>
+        <w:t>}</w:t>
+      </w:r>
+    </w:p>
+    <w:p>
+      <w:pPr>
+        <w:widowControl/>
+        <w:numPr>
+          <w:ilvl w:val="0"/>
+          <w:numId w:val="15"/>
+        </w:numPr>
+        <w:spacing w:before="100" w:beforeAutospacing="1" w:after="100" w:afterAutospacing="1"/>
+        <w:rPr>
+          <w:rFonts w:ascii="Times New Roman" w:eastAsia="Times New Roman" w:hAnsi="Times New Roman" w:cs="Times New Roman"/>
+          <w:sz w:val="24"/>
+          <w:szCs w:val="24"/>
+        </w:rPr>
+      </w:pPr>
+      <w:r>
+        <w:rPr>
+          <w:rFonts w:ascii="Times New Roman" w:eastAsia="Times New Roman" w:hAnsi="Times New Roman" w:cs="Times New Roman"/>
+          <w:sz w:val="24"/>
+          <w:szCs w:val="24"/>
+        </w:rPr>
+        <w:t>Implantação de Pontos de Controle Terrestre (</w:t>
+      </w:r>
+      <w:proofErr w:type="spellStart"/>
+      <w:r>
+        <w:rPr>
+          <w:rFonts w:ascii="Times New Roman" w:eastAsia="Times New Roman" w:hAnsi="Times New Roman" w:cs="Times New Roman"/>
+          <w:sz w:val="24"/>
+          <w:szCs w:val="24"/>
+        </w:rPr>
+        <w:t>GCPs</w:t>
+      </w:r>
+      <w:proofErr w:type="spellEnd"/>
+      <w:r>
+        <w:rPr>
+          <w:rFonts w:ascii="Times New Roman" w:eastAsia="Times New Roman" w:hAnsi="Times New Roman" w:cs="Times New Roman"/>
+          <w:sz w:val="24"/>
+          <w:szCs w:val="24"/>
+        </w:rPr>
+        <w:t>) com GPS RTK;</w:t>
+      </w:r>
+    </w:p>
+    <w:p>
+      <w:pPr>
+        <w:widowControl/>
+        <w:numPr>
+          <w:ilvl w:val="0"/>
+          <w:numId w:val="15"/>
+        </w:numPr>
+        <w:spacing w:before="100" w:beforeAutospacing="1" w:after="100" w:afterAutospacing="1"/>
+        <w:rPr>
+          <w:rFonts w:ascii="Times New Roman" w:eastAsia="Times New Roman" w:hAnsi="Times New Roman" w:cs="Times New Roman"/>
+          <w:sz w:val="24"/>
+          <w:szCs w:val="24"/>
+        </w:rPr>
+      </w:pPr>
+      <w:r>
+        <w:rPr>
+          <w:rFonts w:ascii="Times New Roman" w:eastAsia="Times New Roman" w:hAnsi="Times New Roman" w:cs="Times New Roman"/>
+          <w:sz w:val="24"/>
+          <w:szCs w:val="24"/>
+        </w:rPr>
+        <w:t>Captura de imagens aéreas com sobreposição adequada (80% longitudinal, 70% lateral);</w:t>
+      </w:r>
+    </w:p>
+    <w:p>
+      <w:pPr>
+        <w:widowControl/>
+        <w:numPr>
+          <w:ilvl w:val="0"/>
+          <w:numId w:val="15"/>
+        </w:numPr>
+        <w:spacing w:before="100" w:beforeAutospacing="1" w:after="100" w:afterAutospacing="1"/>
+        <w:rPr>
+          <w:rFonts w:ascii="Times New Roman" w:eastAsia="Times New Roman" w:hAnsi="Times New Roman" w:cs="Times New Roman"/>
+          <w:sz w:val="24"/>
+          <w:szCs w:val="24"/>
+        </w:rPr>
+      </w:pPr>
+      <w:r>
+        <w:rPr>
+          <w:rFonts w:ascii="Times New Roman" w:eastAsia="Times New Roman" w:hAnsi="Times New Roman" w:cs="Times New Roman"/>
+          <w:sz w:val="24"/>
+          <w:szCs w:val="24"/>
+        </w:rPr>
+        <w:t xml:space="preserve">Processamento fotogramétrico e geração de </w:t>
+      </w:r>
+      <w:r>
+        <w:rPr>
+          <w:rFonts w:ascii="Times New Roman" w:eastAsia="Times New Roman" w:hAnsi="Times New Roman" w:cs="Times New Roman"/>
+          <w:sz w:val="24"/>
+          <w:szCs w:val="24"/>
+        </w:rPr>
+        <w:t>Ortomosaico</w:t>
+      </w:r>
+      <w:r>
+        <w:rPr>
+          <w:rFonts w:ascii="Times New Roman" w:eastAsia="Times New Roman" w:hAnsi="Times New Roman" w:cs="Times New Roman"/>
+          <w:sz w:val="24"/>
+          <w:szCs w:val="24"/>
+        </w:rPr>
+        <w:t xml:space="preserve"> georreferenciado;</w:t>
+      </w:r>
+    </w:p>
+    <w:p>
+      <w:pPr>
+        <w:widowControl/>
+        <w:numPr>
+          <w:ilvl w:val="0"/>
+          <w:numId w:val="15"/>
+        </w:numPr>
+        <w:spacing w:before="100" w:beforeAutospacing="1" w:after="100" w:afterAutospacing="1"/>
+        <w:rPr>
+          <w:rFonts w:ascii="Times New Roman" w:eastAsia="Times New Roman" w:hAnsi="Times New Roman" w:cs="Times New Roman"/>
+          <w:sz w:val="24"/>
+          <w:szCs w:val="24"/>
+        </w:rPr>
+      </w:pPr>
+      <w:r>
+        <w:rPr>
+          <w:rFonts w:ascii="Times New Roman" w:eastAsia="Times New Roman" w:hAnsi="Times New Roman" w:cs="Times New Roman"/>
+          <w:sz w:val="24"/>
+          <w:szCs w:val="24"/>
+        </w:rPr>
+        <w:t>Geração de MDT (Modelo Digital do Terreno) e MDS (Modelo Digital de Superfície);</w:t>
+      </w:r>
+    </w:p>
+    <w:p>
+      <w:pPr>
+        <w:widowControl/>
+        <w:numPr>
+          <w:ilvl w:val="0"/>
+          <w:numId w:val="15"/>
+        </w:numPr>
+        <w:spacing w:before="100" w:beforeAutospacing="1" w:after="100" w:afterAutospacing="1"/>
+        <w:rPr>
+          <w:rFonts w:ascii="Times New Roman" w:eastAsia="Times New Roman" w:hAnsi="Times New Roman" w:cs="Times New Roman"/>
+          <w:sz w:val="24"/>
+          <w:szCs w:val="24"/>
+        </w:rPr>
+      </w:pPr>
+      <w:r>
+        <w:rPr>
+          <w:rFonts w:ascii="Times New Roman" w:eastAsia="Times New Roman" w:hAnsi="Times New Roman" w:cs="Times New Roman"/>
+          <w:sz w:val="24"/>
+          <w:szCs w:val="24"/>
+        </w:rPr>
+        <w:t>Extração de curvas de nível e elementos vetoriais;</w:t>
+      </w:r>
+    </w:p>
+    <w:p>
+      <w:pPr>
+        <w:widowControl/>
+        <w:numPr>
+          <w:ilvl w:val="0"/>
+          <w:numId w:val="15"/>
+        </w:numPr>
+        <w:spacing w:before="100" w:beforeAutospacing="1" w:after="100" w:afterAutospacing="1"/>
+        <w:rPr>
+          <w:rFonts w:ascii="Times New Roman" w:eastAsia="Times New Roman" w:hAnsi="Times New Roman" w:cs="Times New Roman"/>
+          <w:sz w:val="24"/>
+          <w:szCs w:val="24"/>
+        </w:rPr>
+      </w:pPr>
+      <w:r>
+        <w:rPr>
+          <w:rFonts w:ascii="Times New Roman" w:eastAsia="Times New Roman" w:hAnsi="Times New Roman" w:cs="Times New Roman"/>
+          <w:sz w:val="24"/>
+          <w:szCs w:val="24"/>
+        </w:rPr>
+        <w:t>Cálculo de volumes (quando solicitado).</w:t>
       </w:r>
     </w:p>
     <w:p>
@@ -696,7 +1427,7 @@
           <w:rFonts w:ascii="Google Sans" w:eastAsia="Google Sans" w:hAnsi="Google Sans" w:cs="Google Sans"/>
           <w:color w:val="1F1F1F"/>
         </w:rPr>
-        <w:t>2. Metodologia: O Passo a Passo do Mapeamento</w:t>
+        <w:t>4. Metodologia: O Passo a Passo do Mapeamento</w:t>
       </w:r>
     </w:p>
     <w:p>
@@ -801,7 +1532,6 @@
           <w:bCs/>
           <w:color w:val="1F1F1F"/>
         </w:rPr>
-        <w:lastRenderedPageBreak/>
         <w:t>O que é:</w:t>
       </w:r>
       <w:r>
@@ -1011,6 +1741,7 @@
           <w:bCs/>
           <w:color w:val="1F1F1F"/>
         </w:rPr>
+        <w:lastRenderedPageBreak/>
         <w:t>Checklist:</w:t>
       </w:r>
       <w:r>
@@ -1316,15 +2047,266 @@
           <w:rFonts w:ascii="Google Sans Text" w:eastAsia="Google Sans Text" w:hAnsi="Google Sans Text" w:cs="Google Sans Text"/>
           <w:color w:val="1F1F1F"/>
         </w:rPr>
-        <w:t xml:space="preserve"> Um desenhista técnico utiliza o modelo 3D gerado para "desenhar" o mapa final em </w:t>
-      </w:r>
-      <w:r>
-        <w:rPr>
-          <w:rFonts w:ascii="Google Sans Text" w:eastAsia="Google Sans Text" w:hAnsi="Google Sans Text" w:cs="Google Sans Text"/>
-          <w:color w:val="1F1F1F"/>
-        </w:rPr>
-        <w:lastRenderedPageBreak/>
-        <w:t>software CAD (AutoCAD/Civil 3D).</w:t>
+        <w:t xml:space="preserve"> Um desenhista técnico utiliza o modelo 3D gerado para "desenhar" o mapa final em software CAD (AutoCAD/Civil 3D</w:t>
+      </w:r>
+    </w:p>
+    <w:p>
+      <w:pPr>
+        <w:numPr>
+          <w:ilvl w:val="0"/>
+          <w:numId w:val="8"/>
+        </w:numPr>
+        <w:pBdr>
+          <w:top w:val="nil"/>
+          <w:left w:val="nil"/>
+          <w:bottom w:val="nil"/>
+          <w:right w:val="nil"/>
+          <w:between w:val="nil"/>
+        </w:pBdr>
+        <w:spacing w:line="275" w:lineRule="auto"/>
+      </w:pPr>
+      <w:r>
+        <w:rPr>
+          <w:rFonts w:ascii="Google Sans Text" w:eastAsia="Google Sans Text" w:hAnsi="Google Sans Text" w:cs="Google Sans Text"/>
+          <w:b/>
+          <w:bCs/>
+          <w:color w:val="1F1F1F"/>
+        </w:rPr>
+        <w:t>O Trabalho:</w:t>
+      </w:r>
+      <w:r>
+        <w:t xml:space="preserve">  Vetorização de guias, cercas, edificações, postes, árvores e, principalmente, a geração das Curvas de Nível (linhas que representam a altura do terreno).</w:t>
+      </w:r>
+    </w:p>
+    <w:p>
+      <w:pPr>
+        <w:pBdr>
+          <w:top w:val="nil"/>
+          <w:left w:val="nil"/>
+          <w:bottom w:val="nil"/>
+          <w:right w:val="nil"/>
+          <w:between w:val="nil"/>
+        </w:pBdr>
+        <w:spacing w:line="275" w:lineRule="auto"/>
+        <w:ind w:left="465"/>
+      </w:pPr>
+    </w:p>
+    <w:p>
+      <w:pPr>
+        <w:pBdr>
+          <w:top w:val="nil"/>
+          <w:left w:val="nil"/>
+          <w:bottom w:val="nil"/>
+          <w:right w:val="nil"/>
+          <w:between w:val="nil"/>
+        </w:pBdr>
+        <w:spacing w:line="275" w:lineRule="auto"/>
+        <w:ind w:left="105"/>
+      </w:pPr>
+      <w:r>
+        <w:rPr>
+          <w:rFonts w:ascii="Google Sans" w:eastAsia="Google Sans" w:hAnsi="Google Sans" w:cs="Google Sans"/>
+          <w:b/>
+          <w:bCs/>
+          <w:color w:val="1F1F1F"/>
+          <w:sz w:val="36"/>
+          <w:szCs w:val="36"/>
+        </w:rPr>
+        <w:t>5</w:t>
+      </w:r>
+      <w:r>
+        <w:rPr>
+          <w:rFonts w:ascii="Google Sans" w:eastAsia="Google Sans" w:hAnsi="Google Sans" w:cs="Google Sans"/>
+          <w:b/>
+          <w:bCs/>
+          <w:color w:val="1F1F1F"/>
+          <w:sz w:val="36"/>
+          <w:szCs w:val="36"/>
+        </w:rPr>
+        <w:t>. Equipamentos Previstos</w:t>
+      </w:r>
+    </w:p>
+    <w:p>
+      <w:pPr>
+        <w:pBdr>
+          <w:top w:val="nil"/>
+          <w:left w:val="nil"/>
+          <w:bottom w:val="nil"/>
+          <w:right w:val="nil"/>
+          <w:between w:val="nil"/>
+        </w:pBdr>
+        <w:spacing w:after="120" w:line="275" w:lineRule="auto"/>
+        <w:rPr>
+          <w:rFonts w:ascii="Google Sans Text" w:eastAsia="Google Sans Text" w:hAnsi="Google Sans Text" w:cs="Google Sans Text"/>
+          <w:color w:val="1F1F1F"/>
+        </w:rPr>
+      </w:pPr>
+      <w:r>
+        <w:rPr>
+          <w:rFonts w:ascii="Google Sans Text" w:eastAsia="Google Sans Text" w:hAnsi="Google Sans Text" w:cs="Google Sans Text"/>
+          <w:color w:val="1F1F1F"/>
+        </w:rPr>
+        <w:t>Para garantir a acurácia descrita nesta proposta, utilizaremos:</w:t>
+      </w:r>
+    </w:p>
+    <w:p>
+      <w:pPr>
+        <w:numPr>
+          <w:ilvl w:val="0"/>
+          <w:numId w:val="12"/>
+        </w:numPr>
+        <w:pBdr>
+          <w:top w:val="nil"/>
+          <w:left w:val="nil"/>
+          <w:bottom w:val="nil"/>
+          <w:right w:val="nil"/>
+          <w:between w:val="nil"/>
+        </w:pBdr>
+        <w:spacing w:line="275" w:lineRule="auto"/>
+      </w:pPr>
+      <w:r>
+        <w:rPr>
+          <w:rFonts w:ascii="Google Sans Text" w:eastAsia="Google Sans Text" w:hAnsi="Google Sans Text" w:cs="Google Sans Text"/>
+          <w:b/>
+          <w:bCs/>
+          <w:color w:val="1F1F1F"/>
+        </w:rPr>
+        <w:t>Aeronave:</w:t>
+      </w:r>
+      <w:r>
+        <w:rPr>
+          <w:rFonts w:ascii="Google Sans Text" w:eastAsia="Google Sans Text" w:hAnsi="Google Sans Text" w:cs="Google Sans Text"/>
+          <w:color w:val="1F1F1F"/>
+        </w:rPr>
+        <w:t xml:space="preserve"> ${Drone} (Câmera de Alta Resolução).</w:t>
+      </w:r>
+    </w:p>
+    <w:p>
+      <w:pPr>
+        <w:numPr>
+          <w:ilvl w:val="0"/>
+          <w:numId w:val="12"/>
+        </w:numPr>
+        <w:pBdr>
+          <w:top w:val="nil"/>
+          <w:left w:val="nil"/>
+          <w:bottom w:val="nil"/>
+          <w:right w:val="nil"/>
+          <w:between w:val="nil"/>
+        </w:pBdr>
+        <w:spacing w:line="275" w:lineRule="auto"/>
+      </w:pPr>
+      <w:r>
+        <w:rPr>
+          <w:rFonts w:ascii="Google Sans Text" w:eastAsia="Google Sans Text" w:hAnsi="Google Sans Text" w:cs="Google Sans Text"/>
+          <w:b/>
+          <w:bCs/>
+          <w:color w:val="1F1F1F"/>
+        </w:rPr>
+        <w:t>GPS - Geodésia:</w:t>
+      </w:r>
+      <w:r>
+        <w:rPr>
+          <w:rFonts w:ascii="Google Sans Text" w:eastAsia="Google Sans Text" w:hAnsi="Google Sans Text" w:cs="Google Sans Text"/>
+          <w:color w:val="1F1F1F"/>
+        </w:rPr>
+        <w:t xml:space="preserve"> ${GPS} (Receptor GNSS RTK/PPK para Pontos de Controle).</w:t>
+      </w:r>
+    </w:p>
+    <w:p>
+      <w:pPr>
+        <w:numPr>
+          <w:ilvl w:val="0"/>
+          <w:numId w:val="12"/>
+        </w:numPr>
+        <w:pBdr>
+          <w:top w:val="nil"/>
+          <w:left w:val="nil"/>
+          <w:bottom w:val="nil"/>
+          <w:right w:val="nil"/>
+          <w:between w:val="nil"/>
+        </w:pBdr>
+        <w:spacing w:line="275" w:lineRule="auto"/>
+      </w:pPr>
+      <w:r>
+        <w:rPr>
+          <w:rFonts w:ascii="Google Sans Text" w:eastAsia="Google Sans Text" w:hAnsi="Google Sans Text" w:cs="Google Sans Text"/>
+          <w:b/>
+          <w:bCs/>
+          <w:color w:val="1F1F1F"/>
+        </w:rPr>
+        <w:t>Estação Total para Apoio:</w:t>
+      </w:r>
+      <w:r>
+        <w:rPr>
+          <w:rFonts w:ascii="Google Sans Text" w:eastAsia="Google Sans Text" w:hAnsi="Google Sans Text" w:cs="Google Sans Text"/>
+          <w:color w:val="1F1F1F"/>
+        </w:rPr>
+        <w:t xml:space="preserve"> ${</w:t>
+      </w:r>
+      <w:proofErr w:type="spellStart"/>
+      <w:r>
+        <w:rPr>
+          <w:rFonts w:ascii="Google Sans Text" w:eastAsia="Google Sans Text" w:hAnsi="Google Sans Text" w:cs="Google Sans Text"/>
+          <w:color w:val="1F1F1F"/>
+        </w:rPr>
+        <w:t>Estacao</w:t>
+      </w:r>
+      <w:proofErr w:type="gramStart"/>
+      <w:r>
+        <w:rPr>
+          <w:rFonts w:ascii="Google Sans Text" w:eastAsia="Google Sans Text" w:hAnsi="Google Sans Text" w:cs="Google Sans Text"/>
+          <w:color w:val="1F1F1F"/>
+        </w:rPr>
+        <w:t>_</w:t>
+      </w:r>
+      <w:r>
+        <w:rPr>
+          <w:rFonts w:ascii="Google Sans Text" w:eastAsia="Google Sans Text" w:hAnsi="Google Sans Text" w:cs="Google Sans Text"/>
+          <w:color w:val="1F1F1F"/>
+        </w:rPr>
+        <w:t>Total</w:t>
+      </w:r>
+      <w:proofErr w:type="spellEnd"/>
+      <w:proofErr w:type="gramEnd"/>
+      <w:r>
+        <w:rPr>
+          <w:rFonts w:ascii="Google Sans Text" w:eastAsia="Google Sans Text" w:hAnsi="Google Sans Text" w:cs="Google Sans Text"/>
+          <w:color w:val="1F1F1F"/>
+        </w:rPr>
+        <w:t>} (Se necessário para áreas de sombra de GPS).</w:t>
+      </w:r>
+    </w:p>
+    <w:p>
+      <w:pPr>
+        <w:numPr>
+          <w:ilvl w:val="0"/>
+          <w:numId w:val="12"/>
+        </w:numPr>
+        <w:pBdr>
+          <w:top w:val="nil"/>
+          <w:left w:val="nil"/>
+          <w:bottom w:val="nil"/>
+          <w:right w:val="nil"/>
+          <w:between w:val="nil"/>
+        </w:pBdr>
+        <w:spacing w:after="120" w:line="275" w:lineRule="auto"/>
+      </w:pPr>
+      <w:r>
+        <w:rPr>
+          <w:rFonts w:ascii="Google Sans Text" w:eastAsia="Google Sans Text" w:hAnsi="Google Sans Text" w:cs="Google Sans Text"/>
+          <w:b/>
+          <w:bCs/>
+          <w:color w:val="1F1F1F"/>
+        </w:rPr>
+        <w:t>Processamento:</w:t>
+      </w:r>
+      <w:r>
+        <w:rPr>
+          <w:rFonts w:ascii="Google Sans Text" w:eastAsia="Google Sans Text" w:hAnsi="Google Sans Text" w:cs="Google Sans Text"/>
+          <w:color w:val="1F1F1F"/>
+        </w:rPr>
+        <w:t xml:space="preserve"> Workstations com placas gráficas de alto desempenho.</w:t>
       </w:r>
     </w:p>
     <w:p>
@@ -1349,31 +2331,56 @@
           <w:bCs/>
           <w:color w:val="1F1F1F"/>
         </w:rPr>
-        <w:t>O Trabalho:</w:t>
-      </w:r>
-      <w:r>
-        <w:rPr>
-          <w:rFonts w:ascii="Google Sans Text" w:eastAsia="Google Sans Text" w:hAnsi="Google Sans Text" w:cs="Google Sans Text"/>
-          <w:color w:val="1F1F1F"/>
-        </w:rPr>
-        <w:t xml:space="preserve"> Vetorização de guias, cercas, edificações, postes, árvores e, principalmente, a geração das </w:t>
-      </w:r>
-      <w:r>
-        <w:rPr>
-          <w:rFonts w:ascii="Google Sans Text" w:eastAsia="Google Sans Text" w:hAnsi="Google Sans Text" w:cs="Google Sans Text"/>
-          <w:b/>
-          <w:bCs/>
-          <w:color w:val="1F1F1F"/>
-        </w:rPr>
-        <w:t>Curvas de Nível</w:t>
-      </w:r>
-      <w:r>
-        <w:rPr>
-          <w:rFonts w:ascii="Google Sans Text" w:eastAsia="Google Sans Text" w:hAnsi="Google Sans Text" w:cs="Google Sans Text"/>
-          <w:color w:val="1F1F1F"/>
-        </w:rPr>
-        <w:t xml:space="preserve"> (linhas que representam a altura do terreno).</w:t>
-      </w:r>
+        <w:t>Veiculo:</w:t>
+      </w:r>
+      <w:r>
+        <w:rPr>
+          <w:rFonts w:ascii="Google Sans Text" w:eastAsia="Google Sans Text" w:hAnsi="Google Sans Text" w:cs="Google Sans Text"/>
+          <w:color w:val="1F1F1F"/>
+        </w:rPr>
+        <w:t xml:space="preserve"> </w:t>
+      </w:r>
+      <w:r>
+        <w:rPr>
+          <w:rFonts w:ascii="Google Sans Text" w:eastAsia="Google Sans Text" w:hAnsi="Google Sans Text" w:cs="Google Sans Text"/>
+          <w:color w:val="1F1F1F"/>
+        </w:rPr>
+        <w:t>${Veiculo</w:t>
+      </w:r>
+      <w:r>
+        <w:rPr>
+          <w:rFonts w:ascii="Google Sans Text" w:eastAsia="Google Sans Text" w:hAnsi="Google Sans Text" w:cs="Google Sans Text"/>
+          <w:color w:val="1F1F1F"/>
+        </w:rPr>
+        <w:t>}</w:t>
+      </w:r>
+      <w:r>
+        <w:rPr>
+          <w:rFonts w:ascii="Google Sans Text" w:eastAsia="Google Sans Text" w:hAnsi="Google Sans Text" w:cs="Google Sans Text"/>
+          <w:color w:val="1F1F1F"/>
+        </w:rPr>
+        <w:t xml:space="preserve"> para</w:t>
+      </w:r>
+      <w:r>
+        <w:rPr>
+          <w:rFonts w:ascii="Google Sans Text" w:eastAsia="Google Sans Text" w:hAnsi="Google Sans Text" w:cs="Google Sans Text"/>
+          <w:color w:val="1F1F1F"/>
+        </w:rPr>
+        <w:t xml:space="preserve"> apoio a locomoção.</w:t>
+      </w:r>
+    </w:p>
+    <w:p>
+      <w:pPr>
+        <w:pBdr>
+          <w:top w:val="nil"/>
+          <w:left w:val="nil"/>
+          <w:bottom w:val="nil"/>
+          <w:right w:val="nil"/>
+          <w:between w:val="nil"/>
+        </w:pBdr>
+        <w:spacing w:after="120" w:line="275" w:lineRule="auto"/>
+        <w:ind w:left="465"/>
+      </w:pPr>
     </w:p>
     <w:p>
       <w:pPr>
@@ -1389,7 +2396,8 @@
           <w:rFonts w:ascii="Google Sans" w:eastAsia="Google Sans" w:hAnsi="Google Sans" w:cs="Google Sans"/>
           <w:color w:val="1F1F1F"/>
         </w:rPr>
-        <w:t>3. Produtos Entregues (O que você recebe)</w:t>
+        <w:lastRenderedPageBreak/>
+        <w:t>6. Produtos Entregues (O que você recebe)</w:t>
       </w:r>
     </w:p>
     <w:p>
@@ -1604,14 +2612,22 @@
           <w:right w:val="nil"/>
           <w:between w:val="nil"/>
         </w:pBdr>
-        <w:spacing w:after="120" w:line="275" w:lineRule="auto"/>
-      </w:pPr>
-      <w:r>
-        <w:rPr>
-          <w:rFonts w:ascii="Google Sans Text" w:eastAsia="Google Sans Text" w:hAnsi="Google Sans Text" w:cs="Google Sans Text"/>
+        <w:spacing w:line="275" w:lineRule="auto"/>
+        <w:rPr>
+          <w:rFonts w:ascii="Google Sans" w:eastAsia="Google Sans" w:hAnsi="Google Sans" w:cs="Google Sans"/>
           <w:b/>
           <w:bCs/>
           <w:color w:val="1F1F1F"/>
+          <w:sz w:val="36"/>
+          <w:szCs w:val="36"/>
+        </w:rPr>
+      </w:pPr>
+      <w:r>
+        <w:rPr>
+          <w:rFonts w:ascii="Google Sans Text" w:eastAsia="Google Sans Text" w:hAnsi="Google Sans Text" w:cs="Google Sans Text"/>
+          <w:b/>
+          <w:bCs/>
+          <w:color w:val="1F1F1F"/>
         </w:rPr>
         <w:t>ART (Anotação de Responsabilidade Técnica):</w:t>
       </w:r>
@@ -1620,8 +2636,27 @@
           <w:rFonts w:ascii="Google Sans Text" w:eastAsia="Google Sans Text" w:hAnsi="Google Sans Text" w:cs="Google Sans Text"/>
           <w:color w:val="1F1F1F"/>
         </w:rPr>
-        <w:t xml:space="preserve"> Documento registrado no CREA garantindo a responsabilidade técnica do engenheiro sobre o levantamento.</w:t>
-      </w:r>
+        <w:t xml:space="preserve"> </w:t>
+      </w:r>
+      <w:r>
+        <w:rPr>
+          <w:rFonts w:ascii="Google Sans Text" w:eastAsia="Google Sans Text" w:hAnsi="Google Sans Text" w:cs="Google Sans Text"/>
+          <w:color w:val="1F1F1F"/>
+        </w:rPr>
+        <w:t>Documento registrado no CREA garantindo a responsabilidade técnica do engenheiro sobre o levantamento.</w:t>
+      </w:r>
+    </w:p>
+    <w:p>
+      <w:pPr>
+        <w:pBdr>
+          <w:top w:val="nil"/>
+          <w:left w:val="nil"/>
+          <w:bottom w:val="nil"/>
+          <w:right w:val="nil"/>
+          <w:between w:val="nil"/>
+        </w:pBdr>
+        <w:spacing w:after="120" w:line="275" w:lineRule="auto"/>
+      </w:pPr>
     </w:p>
     <w:p>
       <w:pPr>
@@ -1637,7 +2672,7 @@
           <w:rFonts w:ascii="Google Sans" w:eastAsia="Google Sans" w:hAnsi="Google Sans" w:cs="Google Sans"/>
           <w:color w:val="1F1F1F"/>
         </w:rPr>
-        <w:t>4. Prazos Estimados</w:t>
+        <w:t>8. Prazos Estimados</w:t>
       </w:r>
     </w:p>
     <w:p>
@@ -2485,8 +3520,7 @@
           <w:rFonts w:ascii="Google Sans" w:eastAsia="Google Sans" w:hAnsi="Google Sans" w:cs="Google Sans"/>
           <w:color w:val="1F1F1F"/>
         </w:rPr>
-        <w:lastRenderedPageBreak/>
-        <w:t>5. Investimento</w:t>
+        <w:t>9. Investimento</w:t>
       </w:r>
     </w:p>
     <w:p>
@@ -2509,6 +3543,7 @@
           <w:rFonts w:ascii="Google Sans Text" w:eastAsia="Google Sans Text" w:hAnsi="Google Sans Text" w:cs="Google Sans Text"/>
           <w:color w:val="1F1F1F"/>
         </w:rPr>
+        <w:lastRenderedPageBreak/>
         <w:t>O valor total para execução dos serviços descritos, incluindo equipe técnica, equipamentos (Drone, GPS RTK, Estação de Trabalho), deslocamento e impostos, é de:</w:t>
       </w:r>
     </w:p>
@@ -2597,6 +3632,24 @@
     </w:p>
     <w:p>
       <w:pPr>
+        <w:pBdr>
+          <w:top w:val="nil"/>
+          <w:left w:val="nil"/>
+          <w:bottom w:val="nil"/>
+          <w:right w:val="nil"/>
+          <w:between w:val="nil"/>
+        </w:pBdr>
+        <w:spacing w:after="240" w:line="275" w:lineRule="auto"/>
+        <w:rPr>
+          <w:rFonts w:ascii="Google Sans Text" w:eastAsia="Google Sans Text" w:hAnsi="Google Sans Text" w:cs="Google Sans Text"/>
+          <w:i/>
+          <w:iCs/>
+          <w:color w:val="1F1F1F"/>
+        </w:rPr>
+      </w:pPr>
+    </w:p>
+    <w:p>
+      <w:pPr>
         <w:pStyle w:val="Ttulo2"/>
         <w:spacing w:before="0" w:after="120" w:line="275" w:lineRule="auto"/>
         <w:rPr>
@@ -2609,7 +3662,7 @@
           <w:rFonts w:ascii="Google Sans" w:eastAsia="Google Sans" w:hAnsi="Google Sans" w:cs="Google Sans"/>
           <w:color w:val="1F1F1F"/>
         </w:rPr>
-        <w:t>6. Condições de Pagamento</w:t>
+        <w:t>10. Condições de Pagamento</w:t>
       </w:r>
     </w:p>
     <w:p>
@@ -2961,23 +4014,6 @@
     </w:p>
     <w:p>
       <w:pPr>
-        <w:pStyle w:val="Ttulo2"/>
-        <w:spacing w:before="120" w:after="120" w:line="275" w:lineRule="auto"/>
-        <w:rPr>
-          <w:rFonts w:ascii="Google Sans" w:eastAsia="Google Sans" w:hAnsi="Google Sans" w:cs="Google Sans"/>
-          <w:color w:val="1F1F1F"/>
-        </w:rPr>
-      </w:pPr>
-      <w:r>
-        <w:rPr>
-          <w:rFonts w:ascii="Google Sans" w:eastAsia="Google Sans" w:hAnsi="Google Sans" w:cs="Google Sans"/>
-          <w:color w:val="1F1F1F"/>
-        </w:rPr>
-        <w:t>7. Equipamentos Previstos</w:t>
-      </w:r>
-    </w:p>
-    <w:p>
-      <w:pPr>
         <w:pBdr>
           <w:top w:val="nil"/>
           <w:left w:val="nil"/>
@@ -2986,25 +4022,119 @@
           <w:between w:val="nil"/>
         </w:pBdr>
         <w:spacing w:after="120" w:line="275" w:lineRule="auto"/>
-        <w:rPr>
-          <w:rFonts w:ascii="Google Sans Text" w:eastAsia="Google Sans Text" w:hAnsi="Google Sans Text" w:cs="Google Sans Text"/>
-          <w:color w:val="1F1F1F"/>
-        </w:rPr>
-      </w:pPr>
-      <w:r>
-        <w:rPr>
-          <w:rFonts w:ascii="Google Sans Text" w:eastAsia="Google Sans Text" w:hAnsi="Google Sans Text" w:cs="Google Sans Text"/>
-          <w:color w:val="1F1F1F"/>
-        </w:rPr>
-        <w:t>Para garantir a acurácia descrita nesta proposta, utilizaremos:</w:t>
-      </w:r>
-    </w:p>
-    <w:p>
-      <w:pPr>
-        <w:numPr>
-          <w:ilvl w:val="0"/>
-          <w:numId w:val="12"/>
-        </w:numPr>
+      </w:pPr>
+    </w:p>
+    <w:p>
+      <w:pPr>
+        <w:pBdr>
+          <w:top w:val="nil"/>
+          <w:left w:val="nil"/>
+          <w:bottom w:val="nil"/>
+          <w:right w:val="nil"/>
+          <w:between w:val="nil"/>
+        </w:pBdr>
+        <w:spacing w:after="120" w:line="275" w:lineRule="auto"/>
+      </w:pPr>
+    </w:p>
+    <w:p>
+      <w:pPr>
+        <w:pStyle w:val="Ttulo2"/>
+        <w:spacing w:before="120" w:after="120" w:line="275" w:lineRule="auto"/>
+        <w:rPr>
+          <w:rFonts w:ascii="Google Sans" w:eastAsia="Google Sans" w:hAnsi="Google Sans" w:cs="Google Sans"/>
+          <w:color w:val="1F1F1F"/>
+        </w:rPr>
+      </w:pPr>
+      <w:r>
+        <w:rPr>
+          <w:rFonts w:ascii="Google Sans" w:eastAsia="Google Sans" w:hAnsi="Google Sans" w:cs="Google Sans"/>
+          <w:color w:val="1F1F1F"/>
+        </w:rPr>
+        <w:t>11. Considerações Finais</w:t>
+      </w:r>
+    </w:p>
+    <w:p>
+      <w:pPr>
+        <w:pBdr>
+          <w:top w:val="nil"/>
+          <w:left w:val="nil"/>
+          <w:bottom w:val="nil"/>
+          <w:right w:val="nil"/>
+          <w:between w:val="nil"/>
+        </w:pBdr>
+        <w:spacing w:after="240" w:line="275" w:lineRule="auto"/>
+        <w:rPr>
+          <w:rFonts w:ascii="Google Sans Text" w:eastAsia="Google Sans Text" w:hAnsi="Google Sans Text" w:cs="Google Sans Text"/>
+          <w:color w:val="1F1F1F"/>
+        </w:rPr>
+      </w:pPr>
+      <w:r>
+        <w:rPr>
+          <w:rFonts w:ascii="Google Sans Text" w:eastAsia="Google Sans Text" w:hAnsi="Google Sans Text" w:cs="Google Sans Text"/>
+          <w:color w:val="1F1F1F"/>
+        </w:rPr>
+        <w:t xml:space="preserve">Esta proposta tem validade de 15 dias. A </w:t>
+      </w:r>
+      <w:r>
+        <w:rPr>
+          <w:rFonts w:ascii="Google Sans Text" w:eastAsia="Google Sans Text" w:hAnsi="Google Sans Text" w:cs="Google Sans Text"/>
+          <w:b/>
+          <w:bCs/>
+          <w:color w:val="1F1F1F"/>
+        </w:rPr>
+        <w:t>${Empresa}</w:t>
+      </w:r>
+      <w:r>
+        <w:rPr>
+          <w:rFonts w:ascii="Google Sans Text" w:eastAsia="Google Sans Text" w:hAnsi="Google Sans Text" w:cs="Google Sans Text"/>
+          <w:color w:val="1F1F1F"/>
+        </w:rPr>
+        <w:t xml:space="preserve"> coloca-se à disposição para sanar quaisquer dúvidas técnicas. Garantimos que o produto final entregue será uma ferramenta robusta para o desenvolvimento do seu projeto.</w:t>
+      </w:r>
+    </w:p>
+    <w:p>
+      <w:pPr>
+        <w:pBdr>
+          <w:top w:val="nil"/>
+          <w:left w:val="nil"/>
+          <w:bottom w:val="nil"/>
+          <w:right w:val="nil"/>
+          <w:between w:val="nil"/>
+        </w:pBdr>
+        <w:spacing w:after="240" w:line="275" w:lineRule="auto"/>
+        <w:jc w:val="center"/>
+        <w:rPr>
+          <w:rFonts w:ascii="Google Sans Text" w:eastAsia="Google Sans Text" w:hAnsi="Google Sans Text" w:cs="Google Sans Text"/>
+          <w:color w:val="1F1F1F"/>
+        </w:rPr>
+      </w:pPr>
+    </w:p>
+    <w:p>
+      <w:pPr>
+        <w:pBdr>
+          <w:top w:val="nil"/>
+          <w:left w:val="nil"/>
+          <w:bottom w:val="nil"/>
+          <w:right w:val="nil"/>
+          <w:between w:val="nil"/>
+        </w:pBdr>
+        <w:spacing w:after="240" w:line="275" w:lineRule="auto"/>
+        <w:jc w:val="center"/>
+        <w:rPr>
+          <w:rFonts w:ascii="Google Sans Text" w:eastAsia="Google Sans Text" w:hAnsi="Google Sans Text" w:cs="Google Sans Text"/>
+          <w:color w:val="1F1F1F"/>
+        </w:rPr>
+      </w:pPr>
+      <w:r>
+        <w:rPr>
+          <w:rFonts w:ascii="Google Sans Text" w:eastAsia="Google Sans Text" w:hAnsi="Google Sans Text" w:cs="Google Sans Text"/>
+          <w:color w:val="1F1F1F"/>
+        </w:rPr>
+        <w:t>Atenciosamente,</w:t>
+      </w:r>
+    </w:p>
+    <w:p>
+      <w:pPr>
         <w:pBdr>
           <w:top w:val="nil"/>
           <w:left w:val="nil"/>
@@ -3013,30 +4143,14 @@
           <w:between w:val="nil"/>
         </w:pBdr>
         <w:spacing w:line="275" w:lineRule="auto"/>
-      </w:pPr>
-      <w:r>
-        <w:rPr>
-          <w:rFonts w:ascii="Google Sans Text" w:eastAsia="Google Sans Text" w:hAnsi="Google Sans Text" w:cs="Google Sans Text"/>
-          <w:b/>
-          <w:bCs/>
-          <w:color w:val="1F1F1F"/>
-        </w:rPr>
-        <w:t>Aeronave:</w:t>
-      </w:r>
-      <w:r>
-        <w:rPr>
-          <w:rFonts w:ascii="Google Sans Text" w:eastAsia="Google Sans Text" w:hAnsi="Google Sans Text" w:cs="Google Sans Text"/>
-          <w:color w:val="1F1F1F"/>
-        </w:rPr>
-        <w:t xml:space="preserve"> ${Drone} (Câmera de Alta Resolução).</w:t>
-      </w:r>
-    </w:p>
-    <w:p>
-      <w:pPr>
-        <w:numPr>
-          <w:ilvl w:val="0"/>
-          <w:numId w:val="12"/>
-        </w:numPr>
+        <w:jc w:val="center"/>
+        <w:rPr>
+          <w:rFonts w:ascii="Google Sans Text" w:eastAsia="Google Sans Text" w:hAnsi="Google Sans Text" w:cs="Google Sans Text"/>
+        </w:rPr>
+      </w:pPr>
+    </w:p>
+    <w:p>
+      <w:pPr>
         <w:pBdr>
           <w:top w:val="nil"/>
           <w:left w:val="nil"/>
@@ -3045,30 +4159,14 @@
           <w:between w:val="nil"/>
         </w:pBdr>
         <w:spacing w:line="275" w:lineRule="auto"/>
-      </w:pPr>
-      <w:r>
-        <w:rPr>
-          <w:rFonts w:ascii="Google Sans Text" w:eastAsia="Google Sans Text" w:hAnsi="Google Sans Text" w:cs="Google Sans Text"/>
-          <w:b/>
-          <w:bCs/>
-          <w:color w:val="1F1F1F"/>
-        </w:rPr>
-        <w:t>GPS - Geodésia:</w:t>
-      </w:r>
-      <w:r>
-        <w:rPr>
-          <w:rFonts w:ascii="Google Sans Text" w:eastAsia="Google Sans Text" w:hAnsi="Google Sans Text" w:cs="Google Sans Text"/>
-          <w:color w:val="1F1F1F"/>
-        </w:rPr>
-        <w:t xml:space="preserve"> ${GPS} (Receptor GNSS RTK/PPK para Pontos de Controle).</w:t>
-      </w:r>
-    </w:p>
-    <w:p>
-      <w:pPr>
-        <w:numPr>
-          <w:ilvl w:val="0"/>
-          <w:numId w:val="12"/>
-        </w:numPr>
+        <w:jc w:val="center"/>
+        <w:rPr>
+          <w:rFonts w:ascii="Google Sans Text" w:eastAsia="Google Sans Text" w:hAnsi="Google Sans Text" w:cs="Google Sans Text"/>
+        </w:rPr>
+      </w:pPr>
+    </w:p>
+    <w:p>
+      <w:pPr>
         <w:pBdr>
           <w:top w:val="nil"/>
           <w:left w:val="nil"/>
@@ -3077,159 +4175,11 @@
           <w:between w:val="nil"/>
         </w:pBdr>
         <w:spacing w:line="275" w:lineRule="auto"/>
-      </w:pPr>
-      <w:r>
-        <w:rPr>
-          <w:rFonts w:ascii="Google Sans Text" w:eastAsia="Google Sans Text" w:hAnsi="Google Sans Text" w:cs="Google Sans Text"/>
-          <w:b/>
-          <w:bCs/>
-          <w:color w:val="1F1F1F"/>
-        </w:rPr>
-        <w:t>Estação Total para Apoio:</w:t>
-      </w:r>
-      <w:r>
-        <w:rPr>
-          <w:rFonts w:ascii="Google Sans Text" w:eastAsia="Google Sans Text" w:hAnsi="Google Sans Text" w:cs="Google Sans Text"/>
-          <w:color w:val="1F1F1F"/>
-        </w:rPr>
-        <w:t xml:space="preserve"> ${</w:t>
-      </w:r>
-      <w:proofErr w:type="spellStart"/>
-      <w:r>
-        <w:rPr>
-          <w:rFonts w:ascii="Google Sans Text" w:eastAsia="Google Sans Text" w:hAnsi="Google Sans Text" w:cs="Google Sans Text"/>
-          <w:color w:val="1F1F1F"/>
-        </w:rPr>
-        <w:t>Estacao</w:t>
-      </w:r>
-      <w:proofErr w:type="gramStart"/>
-      <w:r>
-        <w:rPr>
-          <w:rFonts w:ascii="Google Sans Text" w:eastAsia="Google Sans Text" w:hAnsi="Google Sans Text" w:cs="Google Sans Text"/>
-          <w:color w:val="1F1F1F"/>
-        </w:rPr>
-        <w:t>_Total</w:t>
-      </w:r>
-      <w:proofErr w:type="spellEnd"/>
-      <w:proofErr w:type="gramEnd"/>
-      <w:r>
-        <w:rPr>
-          <w:rFonts w:ascii="Google Sans Text" w:eastAsia="Google Sans Text" w:hAnsi="Google Sans Text" w:cs="Google Sans Text"/>
-          <w:color w:val="1F1F1F"/>
-        </w:rPr>
-        <w:t>} (Se necessário para áreas de sombra de GPS).</w:t>
-      </w:r>
-    </w:p>
-    <w:p>
-      <w:pPr>
-        <w:numPr>
-          <w:ilvl w:val="0"/>
-          <w:numId w:val="12"/>
-        </w:numPr>
-        <w:pBdr>
-          <w:top w:val="nil"/>
-          <w:left w:val="nil"/>
-          <w:bottom w:val="nil"/>
-          <w:right w:val="nil"/>
-          <w:between w:val="nil"/>
-        </w:pBdr>
-        <w:spacing w:after="120" w:line="275" w:lineRule="auto"/>
-      </w:pPr>
-      <w:r>
-        <w:rPr>
-          <w:rFonts w:ascii="Google Sans Text" w:eastAsia="Google Sans Text" w:hAnsi="Google Sans Text" w:cs="Google Sans Text"/>
-          <w:b/>
-          <w:bCs/>
-          <w:color w:val="1F1F1F"/>
-        </w:rPr>
-        <w:t>Processamento:</w:t>
-      </w:r>
-      <w:r>
-        <w:rPr>
-          <w:rFonts w:ascii="Google Sans Text" w:eastAsia="Google Sans Text" w:hAnsi="Google Sans Text" w:cs="Google Sans Text"/>
-          <w:color w:val="1F1F1F"/>
-        </w:rPr>
-        <w:t xml:space="preserve"> Workstations com placas gráficas de alto desempenho.</w:t>
-      </w:r>
-    </w:p>
-    <w:p>
-      <w:pPr>
-        <w:pStyle w:val="Ttulo2"/>
-        <w:spacing w:before="120" w:after="120" w:line="275" w:lineRule="auto"/>
-        <w:rPr>
-          <w:rFonts w:ascii="Google Sans" w:eastAsia="Google Sans" w:hAnsi="Google Sans" w:cs="Google Sans"/>
-          <w:color w:val="1F1F1F"/>
-        </w:rPr>
-      </w:pPr>
-      <w:r>
-        <w:rPr>
-          <w:rFonts w:ascii="Google Sans" w:eastAsia="Google Sans" w:hAnsi="Google Sans" w:cs="Google Sans"/>
-          <w:color w:val="1F1F1F"/>
-        </w:rPr>
-        <w:t>8. Considerações Finais</w:t>
-      </w:r>
-    </w:p>
-    <w:p>
-      <w:pPr>
-        <w:pBdr>
-          <w:top w:val="nil"/>
-          <w:left w:val="nil"/>
-          <w:bottom w:val="nil"/>
-          <w:right w:val="nil"/>
-          <w:between w:val="nil"/>
-        </w:pBdr>
-        <w:spacing w:after="240" w:line="275" w:lineRule="auto"/>
-        <w:rPr>
-          <w:rFonts w:ascii="Google Sans Text" w:eastAsia="Google Sans Text" w:hAnsi="Google Sans Text" w:cs="Google Sans Text"/>
-          <w:color w:val="1F1F1F"/>
-        </w:rPr>
-      </w:pPr>
-      <w:r>
-        <w:rPr>
-          <w:rFonts w:ascii="Google Sans Text" w:eastAsia="Google Sans Text" w:hAnsi="Google Sans Text" w:cs="Google Sans Text"/>
-          <w:color w:val="1F1F1F"/>
-        </w:rPr>
-        <w:t xml:space="preserve">Esta proposta tem validade de 15 dias. A </w:t>
-      </w:r>
-      <w:r>
-        <w:rPr>
-          <w:rFonts w:ascii="Google Sans Text" w:eastAsia="Google Sans Text" w:hAnsi="Google Sans Text" w:cs="Google Sans Text"/>
-          <w:b/>
-          <w:bCs/>
-          <w:color w:val="1F1F1F"/>
-        </w:rPr>
-        <w:t>${Empresa}</w:t>
-      </w:r>
-      <w:r>
-        <w:rPr>
-          <w:rFonts w:ascii="Google Sans Text" w:eastAsia="Google Sans Text" w:hAnsi="Google Sans Text" w:cs="Google Sans Text"/>
-          <w:color w:val="1F1F1F"/>
-        </w:rPr>
-        <w:t xml:space="preserve"> coloca-se à disposição para sanar quaisquer dúvidas técnicas. Garantimos que o produto final entregue será uma ferramenta robusta para o desenvolvimento do seu projeto.</w:t>
-      </w:r>
-    </w:p>
-    <w:p>
-      <w:pPr>
-        <w:pBdr>
-          <w:top w:val="nil"/>
-          <w:left w:val="nil"/>
-          <w:bottom w:val="nil"/>
-          <w:right w:val="nil"/>
-          <w:between w:val="nil"/>
-        </w:pBdr>
-        <w:spacing w:after="240" w:line="275" w:lineRule="auto"/>
-        <w:rPr>
-          <w:rFonts w:ascii="Google Sans Text" w:eastAsia="Google Sans Text" w:hAnsi="Google Sans Text" w:cs="Google Sans Text"/>
-          <w:color w:val="1F1F1F"/>
-        </w:rPr>
-      </w:pPr>
-      <w:r>
-        <w:rPr>
-          <w:rFonts w:ascii="Google Sans Text" w:eastAsia="Google Sans Text" w:hAnsi="Google Sans Text" w:cs="Google Sans Text"/>
-          <w:color w:val="1F1F1F"/>
-        </w:rPr>
-        <w:t>Atenciosamente,</w:t>
-      </w:r>
+        <w:jc w:val="center"/>
+        <w:rPr>
+          <w:rFonts w:ascii="Google Sans Text" w:eastAsia="Google Sans Text" w:hAnsi="Google Sans Text" w:cs="Google Sans Text"/>
+        </w:rPr>
+      </w:pPr>
     </w:p>
     <w:p>
       <w:pPr>
@@ -3241,15 +4191,16 @@
           <w:between w:val="nil"/>
         </w:pBdr>
         <w:spacing w:line="275" w:lineRule="auto"/>
-        <w:rPr>
-          <w:rFonts w:ascii="Google Sans Text" w:eastAsia="Google Sans Text" w:hAnsi="Google Sans Text" w:cs="Google Sans Text"/>
-        </w:rPr>
-      </w:pPr>
-      <w:r>
-        <w:rPr>
-          <w:rFonts w:ascii="Google Sans Text" w:eastAsia="Google Sans Text" w:hAnsi="Google Sans Text" w:cs="Google Sans Text"/>
-        </w:rPr>
-        <w:t>${Empresa}</w:t>
+        <w:jc w:val="center"/>
+        <w:rPr>
+          <w:rFonts w:ascii="Google Sans Text" w:eastAsia="Google Sans Text" w:hAnsi="Google Sans Text" w:cs="Google Sans Text"/>
+        </w:rPr>
+      </w:pPr>
+      <w:r>
+        <w:rPr>
+          <w:rFonts w:ascii="Google Sans Text" w:eastAsia="Google Sans Text" w:hAnsi="Google Sans Text" w:cs="Google Sans Text"/>
+        </w:rPr>
+        <w:t>_________________________________________________</w:t>
       </w:r>
     </w:p>
     <w:p>
@@ -3262,36 +4213,28 @@
           <w:between w:val="nil"/>
         </w:pBdr>
         <w:spacing w:line="275" w:lineRule="auto"/>
-        <w:rPr>
-          <w:rFonts w:ascii="Google Sans Text" w:eastAsia="Google Sans Text" w:hAnsi="Google Sans Text" w:cs="Google Sans Text"/>
-        </w:rPr>
-      </w:pPr>
-      <w:r>
-        <w:rPr>
-          <w:rFonts w:ascii="Google Sans Text" w:eastAsia="Google Sans Text" w:hAnsi="Google Sans Text" w:cs="Google Sans Text"/>
-        </w:rPr>
-        <w:t>Engenheiro Responsável</w:t>
-      </w:r>
-    </w:p>
-    <w:p>
-      <w:pPr>
-        <w:pBdr>
-          <w:top w:val="nil"/>
-          <w:left w:val="nil"/>
-          <w:bottom w:val="nil"/>
-          <w:right w:val="nil"/>
-          <w:between w:val="nil"/>
-        </w:pBdr>
-        <w:spacing w:line="275" w:lineRule="auto"/>
-        <w:rPr>
-          <w:rFonts w:ascii="Google Sans Text" w:eastAsia="Google Sans Text" w:hAnsi="Google Sans Text" w:cs="Google Sans Text"/>
-        </w:rPr>
-      </w:pPr>
-      <w:r>
-        <w:rPr>
-          <w:rFonts w:ascii="Google Sans Text" w:eastAsia="Google Sans Text" w:hAnsi="Google Sans Text" w:cs="Google Sans Text"/>
-        </w:rPr>
-        <w:t>📞 ${</w:t>
+        <w:jc w:val="center"/>
+        <w:rPr>
+          <w:rFonts w:ascii="Google Sans Text" w:eastAsia="Google Sans Text" w:hAnsi="Google Sans Text" w:cs="Google Sans Text"/>
+        </w:rPr>
+      </w:pPr>
+      <w:r>
+        <w:rPr>
+          <w:rFonts w:ascii="Google Sans Text" w:eastAsia="Google Sans Text" w:hAnsi="Google Sans Text" w:cs="Google Sans Text"/>
+        </w:rPr>
+        <w:t>${Empresa}</w:t>
+      </w:r>
+      <w:r>
+        <w:rPr>
+          <w:rFonts w:ascii="Google Sans Text" w:eastAsia="Google Sans Text" w:hAnsi="Google Sans Text" w:cs="Google Sans Text"/>
+        </w:rPr>
+        <w:t xml:space="preserve"> - </w:t>
+      </w:r>
+      <w:r>
+        <w:rPr>
+          <w:rFonts w:ascii="Google Sans Text" w:eastAsia="Google Sans Text" w:hAnsi="Google Sans Text" w:cs="Google Sans Text"/>
+        </w:rPr>
+        <w:t>${</w:t>
       </w:r>
       <w:proofErr w:type="spellStart"/>
       <w:r>
@@ -4886,6 +5829,155 @@
     </w:lvl>
   </w:abstractNum>
   <w:abstractNum w:abstractNumId="6" w15:restartNumberingAfterBreak="0">
+    <w:nsid w:val="34C17F69"/>
+    <w:multiLevelType w:val="multilevel"/>
+    <w:tmpl w:val="58866B2C"/>
+    <w:lvl w:ilvl="0">
+      <w:start w:val="1"/>
+      <w:numFmt w:val="bullet"/>
+      <w:lvlText w:val=""/>
+      <w:lvlJc w:val="left"/>
+      <w:pPr>
+        <w:tabs>
+          <w:tab w:val="num" w:pos="720"/>
+        </w:tabs>
+        <w:ind w:left="720" w:hanging="360"/>
+      </w:pPr>
+      <w:rPr>
+        <w:rFonts w:ascii="Symbol" w:hAnsi="Symbol" w:hint="default"/>
+        <w:sz w:val="20"/>
+      </w:rPr>
+    </w:lvl>
+    <w:lvl w:ilvl="1" w:tentative="1">
+      <w:start w:val="1"/>
+      <w:numFmt w:val="bullet"/>
+      <w:lvlText w:val="o"/>
+      <w:lvlJc w:val="left"/>
+      <w:pPr>
+        <w:tabs>
+          <w:tab w:val="num" w:pos="1440"/>
+        </w:tabs>
+        <w:ind w:left="1440" w:hanging="360"/>
+      </w:pPr>
+      <w:rPr>
+        <w:rFonts w:ascii="Courier New" w:hAnsi="Courier New" w:hint="default"/>
+        <w:sz w:val="20"/>
+      </w:rPr>
+    </w:lvl>
+    <w:lvl w:ilvl="2" w:tentative="1">
+      <w:start w:val="1"/>
+      <w:numFmt w:val="bullet"/>
+      <w:lvlText w:val=""/>
+      <w:lvlJc w:val="left"/>
+      <w:pPr>
+        <w:tabs>
+          <w:tab w:val="num" w:pos="2160"/>
+        </w:tabs>
+        <w:ind w:left="2160" w:hanging="360"/>
+      </w:pPr>
+      <w:rPr>
+        <w:rFonts w:ascii="Wingdings" w:hAnsi="Wingdings" w:hint="default"/>
+        <w:sz w:val="20"/>
+      </w:rPr>
+    </w:lvl>
+    <w:lvl w:ilvl="3" w:tentative="1">
+      <w:start w:val="1"/>
+      <w:numFmt w:val="bullet"/>
+      <w:lvlText w:val=""/>
+      <w:lvlJc w:val="left"/>
+      <w:pPr>
+        <w:tabs>
+          <w:tab w:val="num" w:pos="2880"/>
+        </w:tabs>
+        <w:ind w:left="2880" w:hanging="360"/>
+      </w:pPr>
+      <w:rPr>
+        <w:rFonts w:ascii="Wingdings" w:hAnsi="Wingdings" w:hint="default"/>
+        <w:sz w:val="20"/>
+      </w:rPr>
+    </w:lvl>
+    <w:lvl w:ilvl="4" w:tentative="1">
+      <w:start w:val="1"/>
+      <w:numFmt w:val="bullet"/>
+      <w:lvlText w:val=""/>
+      <w:lvlJc w:val="left"/>
+      <w:pPr>
+        <w:tabs>
+          <w:tab w:val="num" w:pos="3600"/>
+        </w:tabs>
+        <w:ind w:left="3600" w:hanging="360"/>
+      </w:pPr>
+      <w:rPr>
+        <w:rFonts w:ascii="Wingdings" w:hAnsi="Wingdings" w:hint="default"/>
+        <w:sz w:val="20"/>
+      </w:rPr>
+    </w:lvl>
+    <w:lvl w:ilvl="5" w:tentative="1">
+      <w:start w:val="1"/>
+      <w:numFmt w:val="bullet"/>
+      <w:lvlText w:val=""/>
+      <w:lvlJc w:val="left"/>
+      <w:pPr>
+        <w:tabs>
+          <w:tab w:val="num" w:pos="4320"/>
+        </w:tabs>
+        <w:ind w:left="4320" w:hanging="360"/>
+      </w:pPr>
+      <w:rPr>
+        <w:rFonts w:ascii="Wingdings" w:hAnsi="Wingdings" w:hint="default"/>
+        <w:sz w:val="20"/>
+      </w:rPr>
+    </w:lvl>
+    <w:lvl w:ilvl="6" w:tentative="1">
+      <w:start w:val="1"/>
+      <w:numFmt w:val="bullet"/>
+      <w:lvlText w:val=""/>
+      <w:lvlJc w:val="left"/>
+      <w:pPr>
+        <w:tabs>
+          <w:tab w:val="num" w:pos="5040"/>
+        </w:tabs>
+        <w:ind w:left="5040" w:hanging="360"/>
+      </w:pPr>
+      <w:rPr>
+        <w:rFonts w:ascii="Wingdings" w:hAnsi="Wingdings" w:hint="default"/>
+        <w:sz w:val="20"/>
+      </w:rPr>
+    </w:lvl>
+    <w:lvl w:ilvl="7" w:tentative="1">
+      <w:start w:val="1"/>
+      <w:numFmt w:val="bullet"/>
+      <w:lvlText w:val=""/>
+      <w:lvlJc w:val="left"/>
+      <w:pPr>
+        <w:tabs>
+          <w:tab w:val="num" w:pos="5760"/>
+        </w:tabs>
+        <w:ind w:left="5760" w:hanging="360"/>
+      </w:pPr>
+      <w:rPr>
+        <w:rFonts w:ascii="Wingdings" w:hAnsi="Wingdings" w:hint="default"/>
+        <w:sz w:val="20"/>
+      </w:rPr>
+    </w:lvl>
+    <w:lvl w:ilvl="8" w:tentative="1">
+      <w:start w:val="1"/>
+      <w:numFmt w:val="bullet"/>
+      <w:lvlText w:val=""/>
+      <w:lvlJc w:val="left"/>
+      <w:pPr>
+        <w:tabs>
+          <w:tab w:val="num" w:pos="6480"/>
+        </w:tabs>
+        <w:ind w:left="6480" w:hanging="360"/>
+      </w:pPr>
+      <w:rPr>
+        <w:rFonts w:ascii="Wingdings" w:hAnsi="Wingdings" w:hint="default"/>
+        <w:sz w:val="20"/>
+      </w:rPr>
+    </w:lvl>
+  </w:abstractNum>
+  <w:abstractNum w:abstractNumId="7" w15:restartNumberingAfterBreak="0">
     <w:nsid w:val="3F7A7169"/>
     <w:multiLevelType w:val="multilevel"/>
     <w:tmpl w:val="52D050AE"/>
@@ -5106,7 +6198,7 @@
       </w:rPr>
     </w:lvl>
   </w:abstractNum>
-  <w:abstractNum w:abstractNumId="7" w15:restartNumberingAfterBreak="0">
+  <w:abstractNum w:abstractNumId="8" w15:restartNumberingAfterBreak="0">
     <w:nsid w:val="41E66623"/>
     <w:multiLevelType w:val="multilevel"/>
     <w:tmpl w:val="58C843F6"/>
@@ -5327,7 +6419,7 @@
       </w:rPr>
     </w:lvl>
   </w:abstractNum>
-  <w:abstractNum w:abstractNumId="8" w15:restartNumberingAfterBreak="0">
+  <w:abstractNum w:abstractNumId="9" w15:restartNumberingAfterBreak="0">
     <w:nsid w:val="480946A7"/>
     <w:multiLevelType w:val="multilevel"/>
     <w:tmpl w:val="7B40C42A"/>
@@ -5548,7 +6640,7 @@
       </w:rPr>
     </w:lvl>
   </w:abstractNum>
-  <w:abstractNum w:abstractNumId="9" w15:restartNumberingAfterBreak="0">
+  <w:abstractNum w:abstractNumId="10" w15:restartNumberingAfterBreak="0">
     <w:nsid w:val="544B1286"/>
     <w:multiLevelType w:val="multilevel"/>
     <w:tmpl w:val="A5A2DE80"/>
@@ -5769,7 +6861,156 @@
       </w:rPr>
     </w:lvl>
   </w:abstractNum>
-  <w:abstractNum w:abstractNumId="10" w15:restartNumberingAfterBreak="0">
+  <w:abstractNum w:abstractNumId="11" w15:restartNumberingAfterBreak="0">
+    <w:nsid w:val="5B5B004E"/>
+    <w:multiLevelType w:val="multilevel"/>
+    <w:tmpl w:val="AF36272E"/>
+    <w:lvl w:ilvl="0">
+      <w:start w:val="1"/>
+      <w:numFmt w:val="bullet"/>
+      <w:lvlText w:val=""/>
+      <w:lvlJc w:val="left"/>
+      <w:pPr>
+        <w:tabs>
+          <w:tab w:val="num" w:pos="720"/>
+        </w:tabs>
+        <w:ind w:left="720" w:hanging="360"/>
+      </w:pPr>
+      <w:rPr>
+        <w:rFonts w:ascii="Symbol" w:hAnsi="Symbol" w:hint="default"/>
+        <w:sz w:val="20"/>
+      </w:rPr>
+    </w:lvl>
+    <w:lvl w:ilvl="1" w:tentative="1">
+      <w:start w:val="1"/>
+      <w:numFmt w:val="bullet"/>
+      <w:lvlText w:val="o"/>
+      <w:lvlJc w:val="left"/>
+      <w:pPr>
+        <w:tabs>
+          <w:tab w:val="num" w:pos="1440"/>
+        </w:tabs>
+        <w:ind w:left="1440" w:hanging="360"/>
+      </w:pPr>
+      <w:rPr>
+        <w:rFonts w:ascii="Courier New" w:hAnsi="Courier New" w:hint="default"/>
+        <w:sz w:val="20"/>
+      </w:rPr>
+    </w:lvl>
+    <w:lvl w:ilvl="2" w:tentative="1">
+      <w:start w:val="1"/>
+      <w:numFmt w:val="bullet"/>
+      <w:lvlText w:val=""/>
+      <w:lvlJc w:val="left"/>
+      <w:pPr>
+        <w:tabs>
+          <w:tab w:val="num" w:pos="2160"/>
+        </w:tabs>
+        <w:ind w:left="2160" w:hanging="360"/>
+      </w:pPr>
+      <w:rPr>
+        <w:rFonts w:ascii="Wingdings" w:hAnsi="Wingdings" w:hint="default"/>
+        <w:sz w:val="20"/>
+      </w:rPr>
+    </w:lvl>
+    <w:lvl w:ilvl="3" w:tentative="1">
+      <w:start w:val="1"/>
+      <w:numFmt w:val="bullet"/>
+      <w:lvlText w:val=""/>
+      <w:lvlJc w:val="left"/>
+      <w:pPr>
+        <w:tabs>
+          <w:tab w:val="num" w:pos="2880"/>
+        </w:tabs>
+        <w:ind w:left="2880" w:hanging="360"/>
+      </w:pPr>
+      <w:rPr>
+        <w:rFonts w:ascii="Wingdings" w:hAnsi="Wingdings" w:hint="default"/>
+        <w:sz w:val="20"/>
+      </w:rPr>
+    </w:lvl>
+    <w:lvl w:ilvl="4" w:tentative="1">
+      <w:start w:val="1"/>
+      <w:numFmt w:val="bullet"/>
+      <w:lvlText w:val=""/>
+      <w:lvlJc w:val="left"/>
+      <w:pPr>
+        <w:tabs>
+          <w:tab w:val="num" w:pos="3600"/>
+        </w:tabs>
+        <w:ind w:left="3600" w:hanging="360"/>
+      </w:pPr>
+      <w:rPr>
+        <w:rFonts w:ascii="Wingdings" w:hAnsi="Wingdings" w:hint="default"/>
+        <w:sz w:val="20"/>
+      </w:rPr>
+    </w:lvl>
+    <w:lvl w:ilvl="5" w:tentative="1">
+      <w:start w:val="1"/>
+      <w:numFmt w:val="bullet"/>
+      <w:lvlText w:val=""/>
+      <w:lvlJc w:val="left"/>
+      <w:pPr>
+        <w:tabs>
+          <w:tab w:val="num" w:pos="4320"/>
+        </w:tabs>
+        <w:ind w:left="4320" w:hanging="360"/>
+      </w:pPr>
+      <w:rPr>
+        <w:rFonts w:ascii="Wingdings" w:hAnsi="Wingdings" w:hint="default"/>
+        <w:sz w:val="20"/>
+      </w:rPr>
+    </w:lvl>
+    <w:lvl w:ilvl="6" w:tentative="1">
+      <w:start w:val="1"/>
+      <w:numFmt w:val="bullet"/>
+      <w:lvlText w:val=""/>
+      <w:lvlJc w:val="left"/>
+      <w:pPr>
+        <w:tabs>
+          <w:tab w:val="num" w:pos="5040"/>
+        </w:tabs>
+        <w:ind w:left="5040" w:hanging="360"/>
+      </w:pPr>
+      <w:rPr>
+        <w:rFonts w:ascii="Wingdings" w:hAnsi="Wingdings" w:hint="default"/>
+        <w:sz w:val="20"/>
+      </w:rPr>
+    </w:lvl>
+    <w:lvl w:ilvl="7" w:tentative="1">
+      <w:start w:val="1"/>
+      <w:numFmt w:val="bullet"/>
+      <w:lvlText w:val=""/>
+      <w:lvlJc w:val="left"/>
+      <w:pPr>
+        <w:tabs>
+          <w:tab w:val="num" w:pos="5760"/>
+        </w:tabs>
+        <w:ind w:left="5760" w:hanging="360"/>
+      </w:pPr>
+      <w:rPr>
+        <w:rFonts w:ascii="Wingdings" w:hAnsi="Wingdings" w:hint="default"/>
+        <w:sz w:val="20"/>
+      </w:rPr>
+    </w:lvl>
+    <w:lvl w:ilvl="8" w:tentative="1">
+      <w:start w:val="1"/>
+      <w:numFmt w:val="bullet"/>
+      <w:lvlText w:val=""/>
+      <w:lvlJc w:val="left"/>
+      <w:pPr>
+        <w:tabs>
+          <w:tab w:val="num" w:pos="6480"/>
+        </w:tabs>
+        <w:ind w:left="6480" w:hanging="360"/>
+      </w:pPr>
+      <w:rPr>
+        <w:rFonts w:ascii="Wingdings" w:hAnsi="Wingdings" w:hint="default"/>
+        <w:sz w:val="20"/>
+      </w:rPr>
+    </w:lvl>
+  </w:abstractNum>
+  <w:abstractNum w:abstractNumId="12" w15:restartNumberingAfterBreak="0">
     <w:nsid w:val="632B46FC"/>
     <w:multiLevelType w:val="multilevel"/>
     <w:tmpl w:val="EDE85EA2"/>
@@ -5990,7 +7231,228 @@
       </w:rPr>
     </w:lvl>
   </w:abstractNum>
-  <w:abstractNum w:abstractNumId="11" w15:restartNumberingAfterBreak="0">
+  <w:abstractNum w:abstractNumId="13" w15:restartNumberingAfterBreak="0">
+    <w:nsid w:val="720F08D9"/>
+    <w:multiLevelType w:val="multilevel"/>
+    <w:tmpl w:val="52D050AE"/>
+    <w:lvl w:ilvl="0">
+      <w:start w:val="1"/>
+      <w:numFmt w:val="decimal"/>
+      <w:lvlText w:val="%1."/>
+      <w:lvlJc w:val="left"/>
+      <w:pPr>
+        <w:ind w:left="480" w:hanging="360"/>
+      </w:pPr>
+      <w:rPr>
+        <w:rFonts w:ascii="Arial" w:eastAsia="Arial" w:hAnsi="Arial" w:cs="Arial"/>
+        <w:b w:val="0"/>
+        <w:bCs w:val="0"/>
+        <w:i w:val="0"/>
+        <w:iCs w:val="0"/>
+        <w:smallCaps w:val="0"/>
+        <w:strike w:val="0"/>
+        <w:color w:val="000000"/>
+        <w:sz w:val="22"/>
+        <w:szCs w:val="22"/>
+        <w:u w:val="none"/>
+        <w:shd w:val="clear" w:color="auto" w:fill="auto"/>
+        <w:vertAlign w:val="baseline"/>
+      </w:rPr>
+    </w:lvl>
+    <w:lvl w:ilvl="1">
+      <w:start w:val="1"/>
+      <w:numFmt w:val="bullet"/>
+      <w:lvlText w:val="○"/>
+      <w:lvlJc w:val="left"/>
+      <w:pPr>
+        <w:ind w:left="1440" w:hanging="360"/>
+      </w:pPr>
+      <w:rPr>
+        <w:rFonts w:ascii="Arial" w:eastAsia="Arial" w:hAnsi="Arial" w:cs="Arial"/>
+        <w:b w:val="0"/>
+        <w:bCs w:val="0"/>
+        <w:i w:val="0"/>
+        <w:iCs w:val="0"/>
+        <w:smallCaps w:val="0"/>
+        <w:strike w:val="0"/>
+        <w:color w:val="000000"/>
+        <w:sz w:val="22"/>
+        <w:szCs w:val="22"/>
+        <w:u w:val="none"/>
+        <w:shd w:val="clear" w:color="auto" w:fill="auto"/>
+        <w:vertAlign w:val="baseline"/>
+      </w:rPr>
+    </w:lvl>
+    <w:lvl w:ilvl="2">
+      <w:start w:val="1"/>
+      <w:numFmt w:val="bullet"/>
+      <w:lvlText w:val="■"/>
+      <w:lvlJc w:val="left"/>
+      <w:pPr>
+        <w:ind w:left="2160" w:hanging="360"/>
+      </w:pPr>
+      <w:rPr>
+        <w:rFonts w:ascii="Arial" w:eastAsia="Arial" w:hAnsi="Arial" w:cs="Arial"/>
+        <w:b w:val="0"/>
+        <w:bCs w:val="0"/>
+        <w:i w:val="0"/>
+        <w:iCs w:val="0"/>
+        <w:smallCaps w:val="0"/>
+        <w:strike w:val="0"/>
+        <w:color w:val="000000"/>
+        <w:sz w:val="22"/>
+        <w:szCs w:val="22"/>
+        <w:u w:val="none"/>
+        <w:shd w:val="clear" w:color="auto" w:fill="auto"/>
+        <w:vertAlign w:val="baseline"/>
+      </w:rPr>
+    </w:lvl>
+    <w:lvl w:ilvl="3">
+      <w:start w:val="1"/>
+      <w:numFmt w:val="bullet"/>
+      <w:lvlText w:val="■"/>
+      <w:lvlJc w:val="left"/>
+      <w:pPr>
+        <w:ind w:left="2880" w:hanging="360"/>
+      </w:pPr>
+      <w:rPr>
+        <w:rFonts w:ascii="Arial" w:eastAsia="Arial" w:hAnsi="Arial" w:cs="Arial"/>
+        <w:b w:val="0"/>
+        <w:bCs w:val="0"/>
+        <w:i w:val="0"/>
+        <w:iCs w:val="0"/>
+        <w:smallCaps w:val="0"/>
+        <w:strike w:val="0"/>
+        <w:color w:val="000000"/>
+        <w:sz w:val="22"/>
+        <w:szCs w:val="22"/>
+        <w:u w:val="none"/>
+        <w:shd w:val="clear" w:color="auto" w:fill="auto"/>
+        <w:vertAlign w:val="baseline"/>
+      </w:rPr>
+    </w:lvl>
+    <w:lvl w:ilvl="4">
+      <w:start w:val="1"/>
+      <w:numFmt w:val="bullet"/>
+      <w:lvlText w:val="■"/>
+      <w:lvlJc w:val="left"/>
+      <w:pPr>
+        <w:ind w:left="3600" w:hanging="360"/>
+      </w:pPr>
+      <w:rPr>
+        <w:rFonts w:ascii="Arial" w:eastAsia="Arial" w:hAnsi="Arial" w:cs="Arial"/>
+        <w:b w:val="0"/>
+        <w:bCs w:val="0"/>
+        <w:i w:val="0"/>
+        <w:iCs w:val="0"/>
+        <w:smallCaps w:val="0"/>
+        <w:strike w:val="0"/>
+        <w:color w:val="000000"/>
+        <w:sz w:val="22"/>
+        <w:szCs w:val="22"/>
+        <w:u w:val="none"/>
+        <w:shd w:val="clear" w:color="auto" w:fill="auto"/>
+        <w:vertAlign w:val="baseline"/>
+      </w:rPr>
+    </w:lvl>
+    <w:lvl w:ilvl="5">
+      <w:start w:val="1"/>
+      <w:numFmt w:val="bullet"/>
+      <w:lvlText w:val="■"/>
+      <w:lvlJc w:val="left"/>
+      <w:pPr>
+        <w:ind w:left="4320" w:hanging="360"/>
+      </w:pPr>
+      <w:rPr>
+        <w:rFonts w:ascii="Arial" w:eastAsia="Arial" w:hAnsi="Arial" w:cs="Arial"/>
+        <w:b w:val="0"/>
+        <w:bCs w:val="0"/>
+        <w:i w:val="0"/>
+        <w:iCs w:val="0"/>
+        <w:smallCaps w:val="0"/>
+        <w:strike w:val="0"/>
+        <w:color w:val="000000"/>
+        <w:sz w:val="22"/>
+        <w:szCs w:val="22"/>
+        <w:u w:val="none"/>
+        <w:shd w:val="clear" w:color="auto" w:fill="auto"/>
+        <w:vertAlign w:val="baseline"/>
+      </w:rPr>
+    </w:lvl>
+    <w:lvl w:ilvl="6">
+      <w:start w:val="1"/>
+      <w:numFmt w:val="bullet"/>
+      <w:lvlText w:val="■"/>
+      <w:lvlJc w:val="left"/>
+      <w:pPr>
+        <w:ind w:left="5040" w:hanging="360"/>
+      </w:pPr>
+      <w:rPr>
+        <w:rFonts w:ascii="Arial" w:eastAsia="Arial" w:hAnsi="Arial" w:cs="Arial"/>
+        <w:b w:val="0"/>
+        <w:bCs w:val="0"/>
+        <w:i w:val="0"/>
+        <w:iCs w:val="0"/>
+        <w:smallCaps w:val="0"/>
+        <w:strike w:val="0"/>
+        <w:color w:val="000000"/>
+        <w:sz w:val="22"/>
+        <w:szCs w:val="22"/>
+        <w:u w:val="none"/>
+        <w:shd w:val="clear" w:color="auto" w:fill="auto"/>
+        <w:vertAlign w:val="baseline"/>
+      </w:rPr>
+    </w:lvl>
+    <w:lvl w:ilvl="7">
+      <w:start w:val="1"/>
+      <w:numFmt w:val="bullet"/>
+      <w:lvlText w:val="■"/>
+      <w:lvlJc w:val="left"/>
+      <w:pPr>
+        <w:ind w:left="5760" w:hanging="360"/>
+      </w:pPr>
+      <w:rPr>
+        <w:rFonts w:ascii="Arial" w:eastAsia="Arial" w:hAnsi="Arial" w:cs="Arial"/>
+        <w:b w:val="0"/>
+        <w:bCs w:val="0"/>
+        <w:i w:val="0"/>
+        <w:iCs w:val="0"/>
+        <w:smallCaps w:val="0"/>
+        <w:strike w:val="0"/>
+        <w:color w:val="000000"/>
+        <w:sz w:val="22"/>
+        <w:szCs w:val="22"/>
+        <w:u w:val="none"/>
+        <w:shd w:val="clear" w:color="auto" w:fill="auto"/>
+        <w:vertAlign w:val="baseline"/>
+      </w:rPr>
+    </w:lvl>
+    <w:lvl w:ilvl="8">
+      <w:start w:val="1"/>
+      <w:numFmt w:val="bullet"/>
+      <w:lvlText w:val="■"/>
+      <w:lvlJc w:val="left"/>
+      <w:pPr>
+        <w:ind w:left="6480" w:hanging="360"/>
+      </w:pPr>
+      <w:rPr>
+        <w:rFonts w:ascii="Arial" w:eastAsia="Arial" w:hAnsi="Arial" w:cs="Arial"/>
+        <w:b w:val="0"/>
+        <w:bCs w:val="0"/>
+        <w:i w:val="0"/>
+        <w:iCs w:val="0"/>
+        <w:smallCaps w:val="0"/>
+        <w:strike w:val="0"/>
+        <w:color w:val="000000"/>
+        <w:sz w:val="22"/>
+        <w:szCs w:val="22"/>
+        <w:u w:val="none"/>
+        <w:shd w:val="clear" w:color="auto" w:fill="auto"/>
+        <w:vertAlign w:val="baseline"/>
+      </w:rPr>
+    </w:lvl>
+  </w:abstractNum>
+  <w:abstractNum w:abstractNumId="14" w15:restartNumberingAfterBreak="0">
     <w:nsid w:val="7BCF01AA"/>
     <w:multiLevelType w:val="multilevel"/>
     <w:tmpl w:val="0FDE0E22"/>
@@ -6218,34 +7680,43 @@
     <w:abstractNumId w:val="1"/>
   </w:num>
   <w:num w:numId="3" w16cid:durableId="13193556">
-    <w:abstractNumId w:val="7"/>
+    <w:abstractNumId w:val="8"/>
   </w:num>
   <w:num w:numId="4" w16cid:durableId="1955940915">
     <w:abstractNumId w:val="4"/>
   </w:num>
   <w:num w:numId="5" w16cid:durableId="1348747236">
-    <w:abstractNumId w:val="10"/>
+    <w:abstractNumId w:val="12"/>
   </w:num>
   <w:num w:numId="6" w16cid:durableId="975334870">
     <w:abstractNumId w:val="0"/>
   </w:num>
   <w:num w:numId="7" w16cid:durableId="368997728">
-    <w:abstractNumId w:val="11"/>
+    <w:abstractNumId w:val="14"/>
   </w:num>
   <w:num w:numId="8" w16cid:durableId="242376396">
     <w:abstractNumId w:val="2"/>
   </w:num>
   <w:num w:numId="9" w16cid:durableId="1600871604">
-    <w:abstractNumId w:val="6"/>
+    <w:abstractNumId w:val="7"/>
   </w:num>
   <w:num w:numId="10" w16cid:durableId="315689957">
-    <w:abstractNumId w:val="8"/>
+    <w:abstractNumId w:val="9"/>
   </w:num>
   <w:num w:numId="11" w16cid:durableId="645284345">
     <w:abstractNumId w:val="3"/>
   </w:num>
   <w:num w:numId="12" w16cid:durableId="872501170">
-    <w:abstractNumId w:val="9"/>
+    <w:abstractNumId w:val="10"/>
+  </w:num>
+  <w:num w:numId="13" w16cid:durableId="710230807">
+    <w:abstractNumId w:val="13"/>
+  </w:num>
+  <w:num w:numId="14" w16cid:durableId="900597050">
+    <w:abstractNumId w:val="11"/>
+  </w:num>
+  <w:num w:numId="15" w16cid:durableId="107508851">
+    <w:abstractNumId w:val="6"/>
   </w:num>
 </w:numbering>
 </file>
@@ -6677,6 +8148,7 @@
     <w:name w:val="heading 2"/>
     <w:basedOn w:val="Normal"/>
     <w:next w:val="Normal"/>
+    <w:link w:val="Ttulo2Char"/>
     <w:uiPriority w:val="9"/>
     <w:unhideWhenUsed/>
     <w:qFormat/>
@@ -6925,6 +8397,19 @@
     <w:link w:val="Rodap"/>
     <w:uiPriority w:val="99"/>
     <w:rsid w:val="002B2434"/>
+  </w:style>
+  <w:style w:type="character" w:customStyle="1" w:styleId="Ttulo2Char">
+    <w:name w:val="Título 2 Char"/>
+    <w:basedOn w:val="Fontepargpadro"/>
+    <w:link w:val="Ttulo2"/>
+    <w:uiPriority w:val="9"/>
+    <w:rsid w:val="00062A58"/>
+    <w:rPr>
+      <w:b/>
+      <w:bCs/>
+      <w:sz w:val="36"/>
+      <w:szCs w:val="36"/>
+    </w:rPr>
   </w:style>
 </w:styles>
 </file>

</xml_diff>

<commit_message>
chore: sincroniza todos os arquivos pendentes (PropostaRepository, GEMINI.md, templates e utilitarios)
</commit_message>
<xml_diff>
--- a/modelos_prod/ModeloPropostaDrone.docx
+++ b/modelos_prod/ModeloPropostaDrone.docx
@@ -99,7 +99,14 @@
           <w:rFonts w:ascii="Google Sans Text" w:eastAsia="Google Sans Text" w:hAnsi="Google Sans Text" w:cs="Google Sans Text"/>
           <w:color w:val="1F1F1F"/>
         </w:rPr>
-        <w:t>${Cidade}, ${</w:t>
+        <w:t xml:space="preserve">${Cidade}, </w:t>
+      </w:r>
+      <w:r>
+        <w:rPr>
+          <w:rFonts w:ascii="Google Sans Text" w:eastAsia="Google Sans Text" w:hAnsi="Google Sans Text" w:cs="Google Sans Text"/>
+          <w:color w:val="1F1F1F"/>
+        </w:rPr>
+        <w:t>${</w:t>
       </w:r>
       <w:proofErr w:type="spellStart"/>
       <w:r>
@@ -107,7 +114,7 @@
           <w:rFonts w:ascii="Google Sans Text" w:eastAsia="Google Sans Text" w:hAnsi="Google Sans Text" w:cs="Google Sans Text"/>
           <w:color w:val="1F1F1F"/>
         </w:rPr>
-        <w:t>DExrenso</w:t>
+        <w:t>DataExtenso</w:t>
       </w:r>
       <w:proofErr w:type="spellEnd"/>
       <w:r>
@@ -120,19 +127,62 @@
     </w:p>
     <w:p>
       <w:pPr>
-        <w:pStyle w:val="Ttulo2"/>
-        <w:spacing w:before="0" w:after="120" w:line="275" w:lineRule="auto"/>
-        <w:rPr>
-          <w:rFonts w:ascii="Google Sans" w:eastAsia="Google Sans" w:hAnsi="Google Sans" w:cs="Google Sans"/>
-          <w:color w:val="1F1F1F"/>
-        </w:rPr>
-      </w:pPr>
-      <w:r>
-        <w:rPr>
-          <w:rFonts w:ascii="Google Sans" w:eastAsia="Google Sans" w:hAnsi="Google Sans" w:cs="Google Sans"/>
-          <w:color w:val="1F1F1F"/>
-        </w:rPr>
-        <w:t>Dados do Cliente</w:t>
+        <w:pBdr>
+          <w:top w:val="nil"/>
+          <w:left w:val="nil"/>
+          <w:bottom w:val="nil"/>
+          <w:right w:val="nil"/>
+          <w:between w:val="nil"/>
+        </w:pBdr>
+        <w:spacing w:after="240" w:line="275" w:lineRule="auto"/>
+        <w:rPr>
+          <w:rFonts w:ascii="Google Sans Text" w:eastAsia="Google Sans Text" w:hAnsi="Google Sans Text" w:cs="Google Sans Text"/>
+          <w:color w:val="1F1F1F"/>
+        </w:rPr>
+      </w:pPr>
+    </w:p>
+    <w:p>
+      <w:pPr>
+        <w:pBdr>
+          <w:top w:val="nil"/>
+          <w:left w:val="nil"/>
+          <w:bottom w:val="nil"/>
+          <w:right w:val="nil"/>
+          <w:between w:val="nil"/>
+        </w:pBdr>
+        <w:spacing w:after="240" w:line="275" w:lineRule="auto"/>
+      </w:pPr>
+      <w:r>
+        <w:rPr>
+          <w:rFonts w:ascii="Google Sans Text" w:eastAsia="Google Sans Text" w:hAnsi="Google Sans Text" w:cs="Google Sans Text"/>
+          <w:b/>
+          <w:bCs/>
+          <w:color w:val="1F1F1F"/>
+        </w:rPr>
+        <w:t>Nome:</w:t>
+      </w:r>
+      <w:r>
+        <w:rPr>
+          <w:rFonts w:ascii="Google Sans Text" w:eastAsia="Google Sans Text" w:hAnsi="Google Sans Text" w:cs="Google Sans Text"/>
+          <w:color w:val="1F1F1F"/>
+        </w:rPr>
+        <w:t xml:space="preserve"> ${</w:t>
+      </w:r>
+      <w:proofErr w:type="spellStart"/>
+      <w:r>
+        <w:rPr>
+          <w:rFonts w:ascii="Google Sans Text" w:eastAsia="Google Sans Text" w:hAnsi="Google Sans Text" w:cs="Google Sans Text"/>
+          <w:color w:val="1F1F1F"/>
+        </w:rPr>
+        <w:t>nome_cliente_salvo</w:t>
+      </w:r>
+      <w:proofErr w:type="spellEnd"/>
+      <w:r>
+        <w:rPr>
+          <w:rFonts w:ascii="Google Sans Text" w:eastAsia="Google Sans Text" w:hAnsi="Google Sans Text" w:cs="Google Sans Text"/>
+          <w:color w:val="1F1F1F"/>
+        </w:rPr>
+        <w:t>}</w:t>
       </w:r>
     </w:p>
     <w:p>
@@ -157,54 +207,6 @@
           <w:bCs/>
           <w:color w:val="1F1F1F"/>
         </w:rPr>
-        <w:t>Nome:</w:t>
-      </w:r>
-      <w:r>
-        <w:rPr>
-          <w:rFonts w:ascii="Google Sans Text" w:eastAsia="Google Sans Text" w:hAnsi="Google Sans Text" w:cs="Google Sans Text"/>
-          <w:color w:val="1F1F1F"/>
-        </w:rPr>
-        <w:t xml:space="preserve"> ${</w:t>
-      </w:r>
-      <w:proofErr w:type="spellStart"/>
-      <w:r>
-        <w:rPr>
-          <w:rFonts w:ascii="Google Sans Text" w:eastAsia="Google Sans Text" w:hAnsi="Google Sans Text" w:cs="Google Sans Text"/>
-          <w:color w:val="1F1F1F"/>
-        </w:rPr>
-        <w:t>nome_cliente_salvo</w:t>
-      </w:r>
-      <w:proofErr w:type="spellEnd"/>
-      <w:r>
-        <w:rPr>
-          <w:rFonts w:ascii="Google Sans Text" w:eastAsia="Google Sans Text" w:hAnsi="Google Sans Text" w:cs="Google Sans Text"/>
-          <w:color w:val="1F1F1F"/>
-        </w:rPr>
-        <w:t>}</w:t>
-      </w:r>
-    </w:p>
-    <w:p>
-      <w:pPr>
-        <w:numPr>
-          <w:ilvl w:val="0"/>
-          <w:numId w:val="1"/>
-        </w:numPr>
-        <w:pBdr>
-          <w:top w:val="nil"/>
-          <w:left w:val="nil"/>
-          <w:bottom w:val="nil"/>
-          <w:right w:val="nil"/>
-          <w:between w:val="nil"/>
-        </w:pBdr>
-        <w:spacing w:line="275" w:lineRule="auto"/>
-      </w:pPr>
-      <w:r>
-        <w:rPr>
-          <w:rFonts w:ascii="Google Sans Text" w:eastAsia="Google Sans Text" w:hAnsi="Google Sans Text" w:cs="Google Sans Text"/>
-          <w:b/>
-          <w:bCs/>
-          <w:color w:val="1F1F1F"/>
-        </w:rPr>
         <w:t>E-mail:</w:t>
       </w:r>
       <w:r>
@@ -253,7 +255,7 @@
           <w:bCs/>
           <w:color w:val="1F1F1F"/>
         </w:rPr>
-        <w:t>Telefone/Celular:</w:t>
+        <w:t>Telefone:</w:t>
       </w:r>
       <w:r>
         <w:rPr>
@@ -276,7 +278,39 @@
           <w:rFonts w:ascii="Google Sans Text" w:eastAsia="Google Sans Text" w:hAnsi="Google Sans Text" w:cs="Google Sans Text"/>
           <w:color w:val="1F1F1F"/>
         </w:rPr>
-        <w:t>} / ${</w:t>
+        <w:t xml:space="preserve">} </w:t>
+      </w:r>
+    </w:p>
+    <w:p>
+      <w:pPr>
+        <w:numPr>
+          <w:ilvl w:val="0"/>
+          <w:numId w:val="1"/>
+        </w:numPr>
+        <w:pBdr>
+          <w:top w:val="nil"/>
+          <w:left w:val="nil"/>
+          <w:bottom w:val="nil"/>
+          <w:right w:val="nil"/>
+          <w:between w:val="nil"/>
+        </w:pBdr>
+        <w:spacing w:after="120" w:line="275" w:lineRule="auto"/>
+      </w:pPr>
+      <w:r>
+        <w:rPr>
+          <w:rFonts w:ascii="Google Sans Text" w:eastAsia="Google Sans Text" w:hAnsi="Google Sans Text" w:cs="Google Sans Text"/>
+          <w:b/>
+          <w:bCs/>
+          <w:color w:val="1F1F1F"/>
+        </w:rPr>
+        <w:t xml:space="preserve">Celular: </w:t>
+      </w:r>
+      <w:r>
+        <w:rPr>
+          <w:rFonts w:ascii="Google Sans Text" w:eastAsia="Google Sans Text" w:hAnsi="Google Sans Text" w:cs="Google Sans Text"/>
+          <w:color w:val="1F1F1F"/>
+        </w:rPr>
+        <w:t>${</w:t>
       </w:r>
       <w:proofErr w:type="spellStart"/>
       <w:r>
@@ -292,7 +326,39 @@
           <w:rFonts w:ascii="Google Sans Text" w:eastAsia="Google Sans Text" w:hAnsi="Google Sans Text" w:cs="Google Sans Text"/>
           <w:color w:val="1F1F1F"/>
         </w:rPr>
-        <w:t>} / ${</w:t>
+        <w:t>}</w:t>
+      </w:r>
+    </w:p>
+    <w:p>
+      <w:pPr>
+        <w:numPr>
+          <w:ilvl w:val="0"/>
+          <w:numId w:val="1"/>
+        </w:numPr>
+        <w:pBdr>
+          <w:top w:val="nil"/>
+          <w:left w:val="nil"/>
+          <w:bottom w:val="nil"/>
+          <w:right w:val="nil"/>
+          <w:between w:val="nil"/>
+        </w:pBdr>
+        <w:spacing w:after="120" w:line="275" w:lineRule="auto"/>
+      </w:pPr>
+      <w:r>
+        <w:rPr>
+          <w:rFonts w:ascii="Google Sans Text" w:eastAsia="Google Sans Text" w:hAnsi="Google Sans Text" w:cs="Google Sans Text"/>
+          <w:b/>
+          <w:bCs/>
+          <w:color w:val="1F1F1F"/>
+        </w:rPr>
+        <w:t xml:space="preserve">WhatsApp: </w:t>
+      </w:r>
+      <w:r>
+        <w:rPr>
+          <w:rFonts w:ascii="Google Sans Text" w:eastAsia="Google Sans Text" w:hAnsi="Google Sans Text" w:cs="Google Sans Text"/>
+          <w:color w:val="1F1F1F"/>
+        </w:rPr>
+        <w:t>${</w:t>
       </w:r>
       <w:proofErr w:type="spellStart"/>
       <w:r>
@@ -310,6 +376,43 @@
         </w:rPr>
         <w:t>}</w:t>
       </w:r>
+    </w:p>
+    <w:p>
+      <w:pPr>
+        <w:pBdr>
+          <w:top w:val="nil"/>
+          <w:left w:val="nil"/>
+          <w:bottom w:val="nil"/>
+          <w:right w:val="nil"/>
+          <w:between w:val="nil"/>
+        </w:pBdr>
+        <w:spacing w:after="120" w:line="275" w:lineRule="auto"/>
+        <w:ind w:left="465"/>
+      </w:pPr>
+    </w:p>
+    <w:p>
+      <w:pPr>
+        <w:pBdr>
+          <w:top w:val="nil"/>
+          <w:left w:val="nil"/>
+          <w:bottom w:val="nil"/>
+          <w:right w:val="nil"/>
+          <w:between w:val="nil"/>
+        </w:pBdr>
+        <w:spacing w:after="120" w:line="275" w:lineRule="auto"/>
+      </w:pPr>
+    </w:p>
+    <w:p>
+      <w:pPr>
+        <w:pBdr>
+          <w:top w:val="nil"/>
+          <w:left w:val="nil"/>
+          <w:bottom w:val="nil"/>
+          <w:right w:val="nil"/>
+          <w:between w:val="nil"/>
+        </w:pBdr>
+        <w:spacing w:after="120" w:line="275" w:lineRule="auto"/>
+      </w:pPr>
     </w:p>
     <w:p>
       <w:pPr>
@@ -517,7 +620,14 @@
           <w:rFonts w:ascii="Google Sans Text" w:eastAsia="Google Sans Text" w:hAnsi="Google Sans Text" w:cs="Google Sans Text"/>
           <w:color w:val="1F1F1F"/>
         </w:rPr>
-        <w:t xml:space="preserve"> ${</w:t>
+        <w:t xml:space="preserve"> </w:t>
+      </w:r>
+      <w:r>
+        <w:rPr>
+          <w:rFonts w:ascii="Google Sans Text" w:eastAsia="Google Sans Text" w:hAnsi="Google Sans Text" w:cs="Google Sans Text"/>
+          <w:color w:val="1F1F1F"/>
+        </w:rPr>
+        <w:t>${</w:t>
       </w:r>
       <w:proofErr w:type="spellStart"/>
       <w:r>
@@ -525,7 +635,7 @@
           <w:rFonts w:ascii="Google Sans Text" w:eastAsia="Google Sans Text" w:hAnsi="Google Sans Text" w:cs="Google Sans Text"/>
           <w:color w:val="1F1F1F"/>
         </w:rPr>
-        <w:t>area_obra</w:t>
+        <w:t>AreaEstimada</w:t>
       </w:r>
       <w:proofErr w:type="spellEnd"/>
       <w:r>
@@ -546,7 +656,6 @@
           <w:between w:val="nil"/>
         </w:pBdr>
         <w:spacing w:after="120" w:line="275" w:lineRule="auto"/>
-        <w:ind w:left="465"/>
       </w:pPr>
     </w:p>
     <w:p>
@@ -675,6 +784,7 @@
           <w:rFonts w:ascii="Google Sans" w:eastAsia="Google Sans" w:hAnsi="Google Sans" w:cs="Google Sans"/>
           <w:color w:val="1F1F1F"/>
         </w:rPr>
+        <w:lastRenderedPageBreak/>
         <w:t>2. Finalidade</w:t>
       </w:r>
     </w:p>
@@ -717,721 +827,6 @@
     </w:p>
     <w:p>
       <w:pPr>
-        <w:pStyle w:val="Ttulo2"/>
-        <w:spacing w:before="0" w:after="120" w:line="275" w:lineRule="auto"/>
-        <w:rPr>
-          <w:rFonts w:ascii="Google Sans" w:eastAsia="Google Sans" w:hAnsi="Google Sans" w:cs="Google Sans"/>
-          <w:color w:val="1F1F1F"/>
-        </w:rPr>
-      </w:pPr>
-      <w:r>
-        <w:rPr>
-          <w:rFonts w:ascii="Google Sans" w:eastAsia="Google Sans" w:hAnsi="Google Sans" w:cs="Google Sans"/>
-          <w:color w:val="1F1F1F"/>
-        </w:rPr>
-        <w:t>3. Escopo do Serviço</w:t>
-      </w:r>
-    </w:p>
-    <w:p>
-      <w:pPr>
-        <w:widowControl/>
-        <w:spacing w:before="100" w:beforeAutospacing="1" w:after="100" w:afterAutospacing="1"/>
-        <w:rPr>
-          <w:rFonts w:ascii="Times New Roman" w:eastAsia="Times New Roman" w:hAnsi="Times New Roman" w:cs="Times New Roman"/>
-          <w:sz w:val="24"/>
-          <w:szCs w:val="24"/>
-        </w:rPr>
-      </w:pPr>
-      <w:r>
-        <w:rPr>
-          <w:rFonts w:ascii="Times New Roman" w:eastAsia="Times New Roman" w:hAnsi="Times New Roman" w:cs="Times New Roman"/>
-          <w:sz w:val="24"/>
-          <w:szCs w:val="24"/>
-        </w:rPr>
-        <w:t>Levantamento Fotogramétrico com Drone</w:t>
-      </w:r>
-    </w:p>
-    <w:p>
-      <w:pPr>
-        <w:widowControl/>
-        <w:spacing w:before="100" w:beforeAutospacing="1" w:after="100" w:afterAutospacing="1"/>
-        <w:rPr>
-          <w:rFonts w:ascii="Times New Roman" w:eastAsia="Times New Roman" w:hAnsi="Times New Roman" w:cs="Times New Roman"/>
-          <w:b/>
-          <w:bCs/>
-          <w:sz w:val="24"/>
-          <w:szCs w:val="24"/>
-        </w:rPr>
-      </w:pPr>
-      <w:r>
-        <w:rPr>
-          <w:rFonts w:ascii="Times New Roman" w:eastAsia="Times New Roman" w:hAnsi="Times New Roman" w:cs="Times New Roman"/>
-          <w:sz w:val="24"/>
-          <w:szCs w:val="24"/>
-        </w:rPr>
-        <w:lastRenderedPageBreak/>
-        <w:t xml:space="preserve">Execução de levantamento na área de </w:t>
-      </w:r>
-      <w:r>
-        <w:rPr>
-          <w:rFonts w:ascii="Times New Roman" w:eastAsia="Times New Roman" w:hAnsi="Times New Roman" w:cs="Times New Roman"/>
-          <w:b/>
-          <w:bCs/>
-          <w:sz w:val="24"/>
-          <w:szCs w:val="24"/>
-        </w:rPr>
-        <w:t>${</w:t>
-      </w:r>
-      <w:proofErr w:type="spellStart"/>
-      <w:r>
-        <w:rPr>
-          <w:rFonts w:ascii="Times New Roman" w:eastAsia="Times New Roman" w:hAnsi="Times New Roman" w:cs="Times New Roman"/>
-          <w:b/>
-          <w:bCs/>
-          <w:sz w:val="24"/>
-          <w:szCs w:val="24"/>
-        </w:rPr>
-        <w:t>AreaEstimada</w:t>
-      </w:r>
-      <w:proofErr w:type="spellEnd"/>
-      <w:r>
-        <w:rPr>
-          <w:rFonts w:ascii="Times New Roman" w:eastAsia="Times New Roman" w:hAnsi="Times New Roman" w:cs="Times New Roman"/>
-          <w:b/>
-          <w:bCs/>
-          <w:sz w:val="24"/>
-          <w:szCs w:val="24"/>
-        </w:rPr>
-        <w:t>} ${</w:t>
-      </w:r>
-      <w:proofErr w:type="spellStart"/>
-      <w:r>
-        <w:rPr>
-          <w:rFonts w:ascii="Times New Roman" w:eastAsia="Times New Roman" w:hAnsi="Times New Roman" w:cs="Times New Roman"/>
-          <w:b/>
-          <w:bCs/>
-          <w:sz w:val="24"/>
-          <w:szCs w:val="24"/>
-        </w:rPr>
-        <w:t>unidade_area</w:t>
-      </w:r>
-      <w:proofErr w:type="spellEnd"/>
-      <w:r>
-        <w:rPr>
-          <w:rFonts w:ascii="Times New Roman" w:eastAsia="Times New Roman" w:hAnsi="Times New Roman" w:cs="Times New Roman"/>
-          <w:b/>
-          <w:bCs/>
-          <w:sz w:val="24"/>
-          <w:szCs w:val="24"/>
-        </w:rPr>
-        <w:t>}</w:t>
-      </w:r>
-      <w:r>
-        <w:rPr>
-          <w:rFonts w:ascii="Times New Roman" w:eastAsia="Times New Roman" w:hAnsi="Times New Roman" w:cs="Times New Roman"/>
-          <w:sz w:val="24"/>
-          <w:szCs w:val="24"/>
-        </w:rPr>
-        <w:t xml:space="preserve">, localizada em </w:t>
-      </w:r>
-      <w:r>
-        <w:rPr>
-          <w:rFonts w:ascii="Times New Roman" w:eastAsia="Times New Roman" w:hAnsi="Times New Roman" w:cs="Times New Roman"/>
-          <w:b/>
-          <w:bCs/>
-          <w:sz w:val="24"/>
-          <w:szCs w:val="24"/>
-        </w:rPr>
-        <w:t>${</w:t>
-      </w:r>
-      <w:proofErr w:type="spellStart"/>
-      <w:r>
-        <w:rPr>
-          <w:rFonts w:ascii="Times New Roman" w:eastAsia="Times New Roman" w:hAnsi="Times New Roman" w:cs="Times New Roman"/>
-          <w:b/>
-          <w:bCs/>
-          <w:sz w:val="24"/>
-          <w:szCs w:val="24"/>
-        </w:rPr>
-        <w:t>cidade_obra</w:t>
-      </w:r>
-      <w:proofErr w:type="spellEnd"/>
-      <w:r>
-        <w:rPr>
-          <w:rFonts w:ascii="Times New Roman" w:eastAsia="Times New Roman" w:hAnsi="Times New Roman" w:cs="Times New Roman"/>
-          <w:b/>
-          <w:bCs/>
-          <w:sz w:val="24"/>
-          <w:szCs w:val="24"/>
-        </w:rPr>
-        <w:t>} -${</w:t>
-      </w:r>
-      <w:proofErr w:type="spellStart"/>
-      <w:r>
-        <w:rPr>
-          <w:rFonts w:ascii="Times New Roman" w:eastAsia="Times New Roman" w:hAnsi="Times New Roman" w:cs="Times New Roman"/>
-          <w:b/>
-          <w:bCs/>
-          <w:sz w:val="24"/>
-          <w:szCs w:val="24"/>
-        </w:rPr>
-        <w:t>estado_obra</w:t>
-      </w:r>
-      <w:proofErr w:type="spellEnd"/>
-      <w:proofErr w:type="gramStart"/>
-      <w:r>
-        <w:rPr>
-          <w:rFonts w:ascii="Times New Roman" w:eastAsia="Times New Roman" w:hAnsi="Times New Roman" w:cs="Times New Roman"/>
-          <w:b/>
-          <w:bCs/>
-          <w:sz w:val="24"/>
-          <w:szCs w:val="24"/>
-        </w:rPr>
-        <w:t xml:space="preserve">} </w:t>
-      </w:r>
-      <w:r>
-        <w:rPr>
-          <w:rFonts w:ascii="Times New Roman" w:eastAsia="Times New Roman" w:hAnsi="Times New Roman" w:cs="Times New Roman"/>
-          <w:sz w:val="24"/>
-          <w:szCs w:val="24"/>
-        </w:rPr>
-        <w:t>,</w:t>
-      </w:r>
-      <w:proofErr w:type="gramEnd"/>
-      <w:r>
-        <w:rPr>
-          <w:rFonts w:ascii="Times New Roman" w:eastAsia="Times New Roman" w:hAnsi="Times New Roman" w:cs="Times New Roman"/>
-          <w:sz w:val="24"/>
-          <w:szCs w:val="24"/>
-        </w:rPr>
-        <w:t xml:space="preserve"> com as seguintes características:</w:t>
-      </w:r>
-    </w:p>
-    <w:p>
-      <w:pPr>
-        <w:widowControl/>
-        <w:numPr>
-          <w:ilvl w:val="0"/>
-          <w:numId w:val="14"/>
-        </w:numPr>
-        <w:spacing w:before="100" w:beforeAutospacing="1" w:after="100" w:afterAutospacing="1"/>
-        <w:rPr>
-          <w:rFonts w:ascii="Times New Roman" w:eastAsia="Times New Roman" w:hAnsi="Times New Roman" w:cs="Times New Roman"/>
-          <w:sz w:val="24"/>
-          <w:szCs w:val="24"/>
-        </w:rPr>
-      </w:pPr>
-      <w:r>
-        <w:rPr>
-          <w:rFonts w:ascii="Times New Roman" w:eastAsia="Times New Roman" w:hAnsi="Times New Roman" w:cs="Times New Roman"/>
-          <w:sz w:val="24"/>
-          <w:szCs w:val="24"/>
-        </w:rPr>
-        <w:t xml:space="preserve">Tipo de Terreno: </w:t>
-      </w:r>
-      <w:r>
-        <w:rPr>
-          <w:rFonts w:ascii="Times New Roman" w:eastAsia="Times New Roman" w:hAnsi="Times New Roman" w:cs="Times New Roman"/>
-          <w:sz w:val="24"/>
-          <w:szCs w:val="24"/>
-        </w:rPr>
-        <w:t>${</w:t>
-      </w:r>
-      <w:proofErr w:type="spellStart"/>
-      <w:r>
-        <w:rPr>
-          <w:rFonts w:ascii="Times New Roman" w:eastAsia="Times New Roman" w:hAnsi="Times New Roman" w:cs="Times New Roman"/>
-          <w:sz w:val="24"/>
-          <w:szCs w:val="24"/>
-        </w:rPr>
-        <w:t>TipoTerreno</w:t>
-      </w:r>
-      <w:proofErr w:type="spellEnd"/>
-      <w:r>
-        <w:rPr>
-          <w:rFonts w:ascii="Times New Roman" w:eastAsia="Times New Roman" w:hAnsi="Times New Roman" w:cs="Times New Roman"/>
-          <w:sz w:val="24"/>
-          <w:szCs w:val="24"/>
-        </w:rPr>
-        <w:t>}</w:t>
-      </w:r>
-      <w:r>
-        <w:rPr>
-          <w:rFonts w:ascii="Times New Roman" w:eastAsia="Times New Roman" w:hAnsi="Times New Roman" w:cs="Times New Roman"/>
-          <w:sz w:val="24"/>
-          <w:szCs w:val="24"/>
-        </w:rPr>
-        <w:t>;</w:t>
-      </w:r>
-    </w:p>
-    <w:p>
-      <w:pPr>
-        <w:widowControl/>
-        <w:numPr>
-          <w:ilvl w:val="0"/>
-          <w:numId w:val="14"/>
-        </w:numPr>
-        <w:spacing w:before="100" w:beforeAutospacing="1" w:after="100" w:afterAutospacing="1"/>
-        <w:rPr>
-          <w:rFonts w:ascii="Times New Roman" w:eastAsia="Times New Roman" w:hAnsi="Times New Roman" w:cs="Times New Roman"/>
-          <w:sz w:val="24"/>
-          <w:szCs w:val="24"/>
-        </w:rPr>
-      </w:pPr>
-      <w:r>
-        <w:rPr>
-          <w:rFonts w:ascii="Times New Roman" w:eastAsia="Times New Roman" w:hAnsi="Times New Roman" w:cs="Times New Roman"/>
-          <w:sz w:val="24"/>
-          <w:szCs w:val="24"/>
-        </w:rPr>
-        <w:t xml:space="preserve">Cobertura Vegetal: </w:t>
-      </w:r>
-      <w:r>
-        <w:rPr>
-          <w:rFonts w:ascii="Times New Roman" w:eastAsia="Times New Roman" w:hAnsi="Times New Roman" w:cs="Times New Roman"/>
-          <w:sz w:val="24"/>
-          <w:szCs w:val="24"/>
-        </w:rPr>
-        <w:t>${</w:t>
-      </w:r>
-      <w:proofErr w:type="spellStart"/>
-      <w:r>
-        <w:rPr>
-          <w:rFonts w:ascii="Times New Roman" w:eastAsia="Times New Roman" w:hAnsi="Times New Roman" w:cs="Times New Roman"/>
-          <w:sz w:val="24"/>
-          <w:szCs w:val="24"/>
-        </w:rPr>
-        <w:t>CoberturaVegetal</w:t>
-      </w:r>
-      <w:proofErr w:type="spellEnd"/>
-      <w:r>
-        <w:rPr>
-          <w:rFonts w:ascii="Times New Roman" w:eastAsia="Times New Roman" w:hAnsi="Times New Roman" w:cs="Times New Roman"/>
-          <w:sz w:val="24"/>
-          <w:szCs w:val="24"/>
-        </w:rPr>
-        <w:t>}</w:t>
-      </w:r>
-      <w:r>
-        <w:rPr>
-          <w:rFonts w:ascii="Times New Roman" w:eastAsia="Times New Roman" w:hAnsi="Times New Roman" w:cs="Times New Roman"/>
-          <w:sz w:val="24"/>
-          <w:szCs w:val="24"/>
-        </w:rPr>
-        <w:t>;</w:t>
-      </w:r>
-    </w:p>
-    <w:p>
-      <w:pPr>
-        <w:widowControl/>
-        <w:numPr>
-          <w:ilvl w:val="0"/>
-          <w:numId w:val="14"/>
-        </w:numPr>
-        <w:spacing w:before="100" w:beforeAutospacing="1" w:after="100" w:afterAutospacing="1"/>
-        <w:rPr>
-          <w:rFonts w:ascii="Times New Roman" w:eastAsia="Times New Roman" w:hAnsi="Times New Roman" w:cs="Times New Roman"/>
-          <w:sz w:val="24"/>
-          <w:szCs w:val="24"/>
-        </w:rPr>
-      </w:pPr>
-      <w:r>
-        <w:rPr>
-          <w:rFonts w:ascii="Times New Roman" w:eastAsia="Times New Roman" w:hAnsi="Times New Roman" w:cs="Times New Roman"/>
-          <w:sz w:val="24"/>
-          <w:szCs w:val="24"/>
-        </w:rPr>
-        <w:t xml:space="preserve">Acesso: </w:t>
-      </w:r>
-      <w:r>
-        <w:rPr>
-          <w:rFonts w:ascii="Times New Roman" w:eastAsia="Times New Roman" w:hAnsi="Times New Roman" w:cs="Times New Roman"/>
-          <w:sz w:val="24"/>
-          <w:szCs w:val="24"/>
-        </w:rPr>
-        <w:t>${</w:t>
-      </w:r>
-      <w:proofErr w:type="spellStart"/>
-      <w:r>
-        <w:rPr>
-          <w:rFonts w:ascii="Times New Roman" w:eastAsia="Times New Roman" w:hAnsi="Times New Roman" w:cs="Times New Roman"/>
-          <w:sz w:val="24"/>
-          <w:szCs w:val="24"/>
-        </w:rPr>
-        <w:t>AcessoLocal</w:t>
-      </w:r>
-      <w:proofErr w:type="spellEnd"/>
-      <w:r>
-        <w:rPr>
-          <w:rFonts w:ascii="Times New Roman" w:eastAsia="Times New Roman" w:hAnsi="Times New Roman" w:cs="Times New Roman"/>
-          <w:sz w:val="24"/>
-          <w:szCs w:val="24"/>
-        </w:rPr>
-        <w:t>}</w:t>
-      </w:r>
-      <w:r>
-        <w:rPr>
-          <w:rFonts w:ascii="Times New Roman" w:eastAsia="Times New Roman" w:hAnsi="Times New Roman" w:cs="Times New Roman"/>
-          <w:sz w:val="24"/>
-          <w:szCs w:val="24"/>
-        </w:rPr>
-        <w:t>;</w:t>
-      </w:r>
-    </w:p>
-    <w:p>
-      <w:pPr>
-        <w:widowControl/>
-        <w:numPr>
-          <w:ilvl w:val="0"/>
-          <w:numId w:val="14"/>
-        </w:numPr>
-        <w:spacing w:before="100" w:beforeAutospacing="1" w:after="100" w:afterAutospacing="1"/>
-        <w:rPr>
-          <w:rFonts w:ascii="Times New Roman" w:eastAsia="Times New Roman" w:hAnsi="Times New Roman" w:cs="Times New Roman"/>
-          <w:sz w:val="24"/>
-          <w:szCs w:val="24"/>
-        </w:rPr>
-      </w:pPr>
-      <w:r>
-        <w:rPr>
-          <w:rFonts w:ascii="Times New Roman" w:eastAsia="Times New Roman" w:hAnsi="Times New Roman" w:cs="Times New Roman"/>
-          <w:sz w:val="24"/>
-          <w:szCs w:val="24"/>
-        </w:rPr>
-        <w:t xml:space="preserve">Restrições: </w:t>
-      </w:r>
-      <w:r>
-        <w:rPr>
-          <w:rFonts w:ascii="Times New Roman" w:eastAsia="Times New Roman" w:hAnsi="Times New Roman" w:cs="Times New Roman"/>
-          <w:sz w:val="24"/>
-          <w:szCs w:val="24"/>
-        </w:rPr>
-        <w:t>${</w:t>
-      </w:r>
-      <w:proofErr w:type="spellStart"/>
-      <w:r>
-        <w:rPr>
-          <w:rFonts w:ascii="Times New Roman" w:eastAsia="Times New Roman" w:hAnsi="Times New Roman" w:cs="Times New Roman"/>
-          <w:sz w:val="24"/>
-          <w:szCs w:val="24"/>
-        </w:rPr>
-        <w:t>RestricoesAereas</w:t>
-      </w:r>
-      <w:proofErr w:type="spellEnd"/>
-      <w:r>
-        <w:rPr>
-          <w:rFonts w:ascii="Times New Roman" w:eastAsia="Times New Roman" w:hAnsi="Times New Roman" w:cs="Times New Roman"/>
-          <w:sz w:val="24"/>
-          <w:szCs w:val="24"/>
-        </w:rPr>
-        <w:t>}</w:t>
-      </w:r>
-      <w:r>
-        <w:rPr>
-          <w:rFonts w:ascii="Times New Roman" w:eastAsia="Times New Roman" w:hAnsi="Times New Roman" w:cs="Times New Roman"/>
-          <w:sz w:val="24"/>
-          <w:szCs w:val="24"/>
-        </w:rPr>
-        <w:t>.</w:t>
-      </w:r>
-    </w:p>
-    <w:p>
-      <w:pPr>
-        <w:widowControl/>
-        <w:spacing w:before="100" w:beforeAutospacing="1" w:after="100" w:afterAutospacing="1"/>
-        <w:rPr>
-          <w:rFonts w:ascii="Times New Roman" w:eastAsia="Times New Roman" w:hAnsi="Times New Roman" w:cs="Times New Roman"/>
-          <w:b/>
-          <w:bCs/>
-          <w:sz w:val="24"/>
-          <w:szCs w:val="24"/>
-        </w:rPr>
-      </w:pPr>
-      <w:r>
-        <w:rPr>
-          <w:rFonts w:ascii="Times New Roman" w:eastAsia="Times New Roman" w:hAnsi="Times New Roman" w:cs="Times New Roman"/>
-          <w:b/>
-          <w:bCs/>
-          <w:sz w:val="24"/>
-          <w:szCs w:val="24"/>
-        </w:rPr>
-        <w:t>O serviço compreende:</w:t>
-      </w:r>
-    </w:p>
-    <w:p>
-      <w:pPr>
-        <w:widowControl/>
-        <w:numPr>
-          <w:ilvl w:val="0"/>
-          <w:numId w:val="15"/>
-        </w:numPr>
-        <w:spacing w:before="100" w:beforeAutospacing="1" w:after="100" w:afterAutospacing="1"/>
-        <w:rPr>
-          <w:rFonts w:ascii="Times New Roman" w:eastAsia="Times New Roman" w:hAnsi="Times New Roman" w:cs="Times New Roman"/>
-          <w:sz w:val="24"/>
-          <w:szCs w:val="24"/>
-        </w:rPr>
-      </w:pPr>
-      <w:r>
-        <w:rPr>
-          <w:rFonts w:ascii="Times New Roman" w:eastAsia="Times New Roman" w:hAnsi="Times New Roman" w:cs="Times New Roman"/>
-          <w:sz w:val="24"/>
-          <w:szCs w:val="24"/>
-        </w:rPr>
-        <w:t xml:space="preserve">Planejamento de voo e estudo de viabilidade aérea (consulta DECEA para </w:t>
-      </w:r>
-      <w:r>
-        <w:rPr>
-          <w:rFonts w:ascii="Times New Roman" w:eastAsia="Times New Roman" w:hAnsi="Times New Roman" w:cs="Times New Roman"/>
-          <w:sz w:val="24"/>
-          <w:szCs w:val="24"/>
-        </w:rPr>
-        <w:t>${</w:t>
-      </w:r>
-      <w:proofErr w:type="spellStart"/>
-      <w:r>
-        <w:rPr>
-          <w:rFonts w:ascii="Times New Roman" w:eastAsia="Times New Roman" w:hAnsi="Times New Roman" w:cs="Times New Roman"/>
-          <w:sz w:val="24"/>
-          <w:szCs w:val="24"/>
-        </w:rPr>
-        <w:t>cidade_obra</w:t>
-      </w:r>
-      <w:proofErr w:type="spellEnd"/>
-      <w:r>
-        <w:rPr>
-          <w:rFonts w:ascii="Times New Roman" w:eastAsia="Times New Roman" w:hAnsi="Times New Roman" w:cs="Times New Roman"/>
-          <w:sz w:val="24"/>
-          <w:szCs w:val="24"/>
-        </w:rPr>
-        <w:t xml:space="preserve">} </w:t>
-      </w:r>
-      <w:r>
-        <w:rPr>
-          <w:rFonts w:ascii="Times New Roman" w:eastAsia="Times New Roman" w:hAnsi="Times New Roman" w:cs="Times New Roman"/>
-          <w:sz w:val="24"/>
-          <w:szCs w:val="24"/>
-        </w:rPr>
-        <w:t>-</w:t>
-      </w:r>
-      <w:r>
-        <w:rPr>
-          <w:rFonts w:ascii="Times New Roman" w:eastAsia="Times New Roman" w:hAnsi="Times New Roman" w:cs="Times New Roman"/>
-          <w:sz w:val="24"/>
-          <w:szCs w:val="24"/>
-        </w:rPr>
-        <w:t>${</w:t>
-      </w:r>
-      <w:proofErr w:type="spellStart"/>
-      <w:r>
-        <w:rPr>
-          <w:rFonts w:ascii="Times New Roman" w:eastAsia="Times New Roman" w:hAnsi="Times New Roman" w:cs="Times New Roman"/>
-          <w:sz w:val="24"/>
-          <w:szCs w:val="24"/>
-        </w:rPr>
-        <w:t>estado_obra</w:t>
-      </w:r>
-      <w:proofErr w:type="spellEnd"/>
-      <w:r>
-        <w:rPr>
-          <w:rFonts w:ascii="Times New Roman" w:eastAsia="Times New Roman" w:hAnsi="Times New Roman" w:cs="Times New Roman"/>
-          <w:sz w:val="24"/>
-          <w:szCs w:val="24"/>
-        </w:rPr>
-        <w:t>}</w:t>
-      </w:r>
-    </w:p>
-    <w:p>
-      <w:pPr>
-        <w:widowControl/>
-        <w:numPr>
-          <w:ilvl w:val="0"/>
-          <w:numId w:val="15"/>
-        </w:numPr>
-        <w:spacing w:before="100" w:beforeAutospacing="1" w:after="100" w:afterAutospacing="1"/>
-        <w:rPr>
-          <w:rFonts w:ascii="Times New Roman" w:eastAsia="Times New Roman" w:hAnsi="Times New Roman" w:cs="Times New Roman"/>
-          <w:sz w:val="24"/>
-          <w:szCs w:val="24"/>
-        </w:rPr>
-      </w:pPr>
-      <w:r>
-        <w:rPr>
-          <w:rFonts w:ascii="Times New Roman" w:eastAsia="Times New Roman" w:hAnsi="Times New Roman" w:cs="Times New Roman"/>
-          <w:sz w:val="24"/>
-          <w:szCs w:val="24"/>
-        </w:rPr>
-        <w:t>Implantação de Pontos de Controle Terrestre (</w:t>
-      </w:r>
-      <w:proofErr w:type="spellStart"/>
-      <w:r>
-        <w:rPr>
-          <w:rFonts w:ascii="Times New Roman" w:eastAsia="Times New Roman" w:hAnsi="Times New Roman" w:cs="Times New Roman"/>
-          <w:sz w:val="24"/>
-          <w:szCs w:val="24"/>
-        </w:rPr>
-        <w:t>GCPs</w:t>
-      </w:r>
-      <w:proofErr w:type="spellEnd"/>
-      <w:r>
-        <w:rPr>
-          <w:rFonts w:ascii="Times New Roman" w:eastAsia="Times New Roman" w:hAnsi="Times New Roman" w:cs="Times New Roman"/>
-          <w:sz w:val="24"/>
-          <w:szCs w:val="24"/>
-        </w:rPr>
-        <w:t>) com GPS RTK;</w:t>
-      </w:r>
-    </w:p>
-    <w:p>
-      <w:pPr>
-        <w:widowControl/>
-        <w:numPr>
-          <w:ilvl w:val="0"/>
-          <w:numId w:val="15"/>
-        </w:numPr>
-        <w:spacing w:before="100" w:beforeAutospacing="1" w:after="100" w:afterAutospacing="1"/>
-        <w:rPr>
-          <w:rFonts w:ascii="Times New Roman" w:eastAsia="Times New Roman" w:hAnsi="Times New Roman" w:cs="Times New Roman"/>
-          <w:sz w:val="24"/>
-          <w:szCs w:val="24"/>
-        </w:rPr>
-      </w:pPr>
-      <w:r>
-        <w:rPr>
-          <w:rFonts w:ascii="Times New Roman" w:eastAsia="Times New Roman" w:hAnsi="Times New Roman" w:cs="Times New Roman"/>
-          <w:sz w:val="24"/>
-          <w:szCs w:val="24"/>
-        </w:rPr>
-        <w:t>Captura de imagens aéreas com sobreposição adequada (80% longitudinal, 70% lateral);</w:t>
-      </w:r>
-    </w:p>
-    <w:p>
-      <w:pPr>
-        <w:widowControl/>
-        <w:numPr>
-          <w:ilvl w:val="0"/>
-          <w:numId w:val="15"/>
-        </w:numPr>
-        <w:spacing w:before="100" w:beforeAutospacing="1" w:after="100" w:afterAutospacing="1"/>
-        <w:rPr>
-          <w:rFonts w:ascii="Times New Roman" w:eastAsia="Times New Roman" w:hAnsi="Times New Roman" w:cs="Times New Roman"/>
-          <w:sz w:val="24"/>
-          <w:szCs w:val="24"/>
-        </w:rPr>
-      </w:pPr>
-      <w:r>
-        <w:rPr>
-          <w:rFonts w:ascii="Times New Roman" w:eastAsia="Times New Roman" w:hAnsi="Times New Roman" w:cs="Times New Roman"/>
-          <w:sz w:val="24"/>
-          <w:szCs w:val="24"/>
-        </w:rPr>
-        <w:t xml:space="preserve">Processamento fotogramétrico e geração de </w:t>
-      </w:r>
-      <w:r>
-        <w:rPr>
-          <w:rFonts w:ascii="Times New Roman" w:eastAsia="Times New Roman" w:hAnsi="Times New Roman" w:cs="Times New Roman"/>
-          <w:sz w:val="24"/>
-          <w:szCs w:val="24"/>
-        </w:rPr>
-        <w:t>Ortomosaico</w:t>
-      </w:r>
-      <w:r>
-        <w:rPr>
-          <w:rFonts w:ascii="Times New Roman" w:eastAsia="Times New Roman" w:hAnsi="Times New Roman" w:cs="Times New Roman"/>
-          <w:sz w:val="24"/>
-          <w:szCs w:val="24"/>
-        </w:rPr>
-        <w:t xml:space="preserve"> georreferenciado;</w:t>
-      </w:r>
-    </w:p>
-    <w:p>
-      <w:pPr>
-        <w:widowControl/>
-        <w:numPr>
-          <w:ilvl w:val="0"/>
-          <w:numId w:val="15"/>
-        </w:numPr>
-        <w:spacing w:before="100" w:beforeAutospacing="1" w:after="100" w:afterAutospacing="1"/>
-        <w:rPr>
-          <w:rFonts w:ascii="Times New Roman" w:eastAsia="Times New Roman" w:hAnsi="Times New Roman" w:cs="Times New Roman"/>
-          <w:sz w:val="24"/>
-          <w:szCs w:val="24"/>
-        </w:rPr>
-      </w:pPr>
-      <w:r>
-        <w:rPr>
-          <w:rFonts w:ascii="Times New Roman" w:eastAsia="Times New Roman" w:hAnsi="Times New Roman" w:cs="Times New Roman"/>
-          <w:sz w:val="24"/>
-          <w:szCs w:val="24"/>
-        </w:rPr>
-        <w:t>Geração de MDT (Modelo Digital do Terreno) e MDS (Modelo Digital de Superfície);</w:t>
-      </w:r>
-    </w:p>
-    <w:p>
-      <w:pPr>
-        <w:widowControl/>
-        <w:numPr>
-          <w:ilvl w:val="0"/>
-          <w:numId w:val="15"/>
-        </w:numPr>
-        <w:spacing w:before="100" w:beforeAutospacing="1" w:after="100" w:afterAutospacing="1"/>
-        <w:rPr>
-          <w:rFonts w:ascii="Times New Roman" w:eastAsia="Times New Roman" w:hAnsi="Times New Roman" w:cs="Times New Roman"/>
-          <w:sz w:val="24"/>
-          <w:szCs w:val="24"/>
-        </w:rPr>
-      </w:pPr>
-      <w:r>
-        <w:rPr>
-          <w:rFonts w:ascii="Times New Roman" w:eastAsia="Times New Roman" w:hAnsi="Times New Roman" w:cs="Times New Roman"/>
-          <w:sz w:val="24"/>
-          <w:szCs w:val="24"/>
-        </w:rPr>
-        <w:t>Extração de curvas de nível e elementos vetoriais;</w:t>
-      </w:r>
-    </w:p>
-    <w:p>
-      <w:pPr>
-        <w:widowControl/>
-        <w:numPr>
-          <w:ilvl w:val="0"/>
-          <w:numId w:val="15"/>
-        </w:numPr>
-        <w:spacing w:before="100" w:beforeAutospacing="1" w:after="100" w:afterAutospacing="1"/>
-        <w:rPr>
-          <w:rFonts w:ascii="Times New Roman" w:eastAsia="Times New Roman" w:hAnsi="Times New Roman" w:cs="Times New Roman"/>
-          <w:sz w:val="24"/>
-          <w:szCs w:val="24"/>
-        </w:rPr>
-      </w:pPr>
-      <w:r>
-        <w:rPr>
-          <w:rFonts w:ascii="Times New Roman" w:eastAsia="Times New Roman" w:hAnsi="Times New Roman" w:cs="Times New Roman"/>
-          <w:sz w:val="24"/>
-          <w:szCs w:val="24"/>
-        </w:rPr>
-        <w:t>Cálculo de volumes (quando solicitado).</w:t>
-      </w:r>
-    </w:p>
-    <w:p>
-      <w:pPr>
-        <w:pStyle w:val="Ttulo2"/>
-        <w:spacing w:before="0" w:after="120" w:line="275" w:lineRule="auto"/>
-        <w:rPr>
-          <w:rFonts w:ascii="Google Sans" w:eastAsia="Google Sans" w:hAnsi="Google Sans" w:cs="Google Sans"/>
-          <w:color w:val="1F1F1F"/>
-        </w:rPr>
-      </w:pPr>
-      <w:r>
-        <w:rPr>
-          <w:rFonts w:ascii="Google Sans" w:eastAsia="Google Sans" w:hAnsi="Google Sans" w:cs="Google Sans"/>
-          <w:color w:val="1F1F1F"/>
-        </w:rPr>
-        <w:t>4. Metodologia: O Passo a Passo do Mapeamento</w:t>
-      </w:r>
-    </w:p>
-    <w:p>
-      <w:pPr>
         <w:pBdr>
           <w:top w:val="nil"/>
           <w:left w:val="nil"/>
@@ -1443,21 +838,769 @@
         <w:jc w:val="both"/>
         <w:rPr>
           <w:rFonts w:ascii="Google Sans Text" w:eastAsia="Google Sans Text" w:hAnsi="Google Sans Text" w:cs="Google Sans Text"/>
-          <w:color w:val="1F1F1F"/>
-        </w:rPr>
-      </w:pPr>
-      <w:r>
-        <w:rPr>
-          <w:rFonts w:ascii="Google Sans Text" w:eastAsia="Google Sans Text" w:hAnsi="Google Sans Text" w:cs="Google Sans Text"/>
-          <w:color w:val="1F1F1F"/>
-        </w:rPr>
-        <w:t xml:space="preserve">Para garantir que o produto final tenha </w:t>
-      </w:r>
-      <w:r>
-        <w:rPr>
-          <w:rFonts w:ascii="Google Sans Text" w:eastAsia="Google Sans Text" w:hAnsi="Google Sans Text" w:cs="Google Sans Text"/>
+          <w:i/>
+          <w:iCs/>
+          <w:color w:val="1F1F1F"/>
+        </w:rPr>
+      </w:pPr>
+    </w:p>
+    <w:p>
+      <w:pPr>
+        <w:pStyle w:val="Ttulo2"/>
+        <w:spacing w:before="0" w:after="120" w:line="275" w:lineRule="auto"/>
+        <w:rPr>
+          <w:rFonts w:ascii="Google Sans" w:eastAsia="Google Sans" w:hAnsi="Google Sans" w:cs="Google Sans"/>
+          <w:color w:val="1F1F1F"/>
+        </w:rPr>
+      </w:pPr>
+      <w:r>
+        <w:rPr>
+          <w:rFonts w:ascii="Google Sans" w:eastAsia="Google Sans" w:hAnsi="Google Sans" w:cs="Google Sans"/>
+          <w:color w:val="1F1F1F"/>
+        </w:rPr>
+        <w:t>3. Escopo do Serviço</w:t>
+      </w:r>
+    </w:p>
+    <w:p>
+      <w:pPr>
+        <w:widowControl/>
+        <w:spacing w:before="100" w:beforeAutospacing="1" w:after="100" w:afterAutospacing="1"/>
+        <w:rPr>
+          <w:rFonts w:ascii="Times New Roman" w:eastAsia="Times New Roman" w:hAnsi="Times New Roman" w:cs="Times New Roman"/>
+          <w:sz w:val="24"/>
+          <w:szCs w:val="24"/>
+        </w:rPr>
+      </w:pPr>
+      <w:r>
+        <w:rPr>
+          <w:rFonts w:ascii="Times New Roman" w:eastAsia="Times New Roman" w:hAnsi="Times New Roman" w:cs="Times New Roman"/>
+          <w:sz w:val="24"/>
+          <w:szCs w:val="24"/>
+        </w:rPr>
+        <w:t>Levantamento Fotogramétrico com Drone</w:t>
+      </w:r>
+    </w:p>
+    <w:p>
+      <w:pPr>
+        <w:widowControl/>
+        <w:spacing w:before="100" w:beforeAutospacing="1" w:after="100" w:afterAutospacing="1"/>
+        <w:rPr>
+          <w:rFonts w:ascii="Times New Roman" w:eastAsia="Times New Roman" w:hAnsi="Times New Roman" w:cs="Times New Roman"/>
           <w:b/>
           <w:bCs/>
+          <w:sz w:val="24"/>
+          <w:szCs w:val="24"/>
+        </w:rPr>
+      </w:pPr>
+      <w:r>
+        <w:rPr>
+          <w:rFonts w:ascii="Times New Roman" w:eastAsia="Times New Roman" w:hAnsi="Times New Roman" w:cs="Times New Roman"/>
+          <w:sz w:val="24"/>
+          <w:szCs w:val="24"/>
+        </w:rPr>
+        <w:t xml:space="preserve">Execução de levantamento na área de </w:t>
+      </w:r>
+      <w:r>
+        <w:rPr>
+          <w:rFonts w:ascii="Times New Roman" w:eastAsia="Times New Roman" w:hAnsi="Times New Roman" w:cs="Times New Roman"/>
+          <w:b/>
+          <w:bCs/>
+          <w:sz w:val="24"/>
+          <w:szCs w:val="24"/>
+        </w:rPr>
+        <w:t>${</w:t>
+      </w:r>
+      <w:proofErr w:type="spellStart"/>
+      <w:r>
+        <w:rPr>
+          <w:rFonts w:ascii="Times New Roman" w:eastAsia="Times New Roman" w:hAnsi="Times New Roman" w:cs="Times New Roman"/>
+          <w:b/>
+          <w:bCs/>
+          <w:sz w:val="24"/>
+          <w:szCs w:val="24"/>
+        </w:rPr>
+        <w:t>AreaEstimada</w:t>
+      </w:r>
+      <w:proofErr w:type="spellEnd"/>
+      <w:r>
+        <w:rPr>
+          <w:rFonts w:ascii="Times New Roman" w:eastAsia="Times New Roman" w:hAnsi="Times New Roman" w:cs="Times New Roman"/>
+          <w:b/>
+          <w:bCs/>
+          <w:sz w:val="24"/>
+          <w:szCs w:val="24"/>
+        </w:rPr>
+        <w:t>} ${</w:t>
+      </w:r>
+      <w:proofErr w:type="spellStart"/>
+      <w:r>
+        <w:rPr>
+          <w:rFonts w:ascii="Times New Roman" w:eastAsia="Times New Roman" w:hAnsi="Times New Roman" w:cs="Times New Roman"/>
+          <w:b/>
+          <w:bCs/>
+          <w:sz w:val="24"/>
+          <w:szCs w:val="24"/>
+        </w:rPr>
+        <w:t>unidade_area</w:t>
+      </w:r>
+      <w:proofErr w:type="spellEnd"/>
+      <w:r>
+        <w:rPr>
+          <w:rFonts w:ascii="Times New Roman" w:eastAsia="Times New Roman" w:hAnsi="Times New Roman" w:cs="Times New Roman"/>
+          <w:b/>
+          <w:bCs/>
+          <w:sz w:val="24"/>
+          <w:szCs w:val="24"/>
+        </w:rPr>
+        <w:t>}</w:t>
+      </w:r>
+      <w:r>
+        <w:rPr>
+          <w:rFonts w:ascii="Times New Roman" w:eastAsia="Times New Roman" w:hAnsi="Times New Roman" w:cs="Times New Roman"/>
+          <w:sz w:val="24"/>
+          <w:szCs w:val="24"/>
+        </w:rPr>
+        <w:t xml:space="preserve">, localizada em </w:t>
+      </w:r>
+      <w:r>
+        <w:rPr>
+          <w:rFonts w:ascii="Times New Roman" w:eastAsia="Times New Roman" w:hAnsi="Times New Roman" w:cs="Times New Roman"/>
+          <w:b/>
+          <w:bCs/>
+          <w:sz w:val="24"/>
+          <w:szCs w:val="24"/>
+        </w:rPr>
+        <w:t>${</w:t>
+      </w:r>
+      <w:proofErr w:type="spellStart"/>
+      <w:r>
+        <w:rPr>
+          <w:rFonts w:ascii="Times New Roman" w:eastAsia="Times New Roman" w:hAnsi="Times New Roman" w:cs="Times New Roman"/>
+          <w:b/>
+          <w:bCs/>
+          <w:sz w:val="24"/>
+          <w:szCs w:val="24"/>
+        </w:rPr>
+        <w:t>cidade_obra</w:t>
+      </w:r>
+      <w:proofErr w:type="spellEnd"/>
+      <w:r>
+        <w:rPr>
+          <w:rFonts w:ascii="Times New Roman" w:eastAsia="Times New Roman" w:hAnsi="Times New Roman" w:cs="Times New Roman"/>
+          <w:b/>
+          <w:bCs/>
+          <w:sz w:val="24"/>
+          <w:szCs w:val="24"/>
+        </w:rPr>
+        <w:t>} -${</w:t>
+      </w:r>
+      <w:proofErr w:type="spellStart"/>
+      <w:r>
+        <w:rPr>
+          <w:rFonts w:ascii="Times New Roman" w:eastAsia="Times New Roman" w:hAnsi="Times New Roman" w:cs="Times New Roman"/>
+          <w:b/>
+          <w:bCs/>
+          <w:sz w:val="24"/>
+          <w:szCs w:val="24"/>
+        </w:rPr>
+        <w:t>estado_obra</w:t>
+      </w:r>
+      <w:proofErr w:type="spellEnd"/>
+      <w:proofErr w:type="gramStart"/>
+      <w:r>
+        <w:rPr>
+          <w:rFonts w:ascii="Times New Roman" w:eastAsia="Times New Roman" w:hAnsi="Times New Roman" w:cs="Times New Roman"/>
+          <w:b/>
+          <w:bCs/>
+          <w:sz w:val="24"/>
+          <w:szCs w:val="24"/>
+        </w:rPr>
+        <w:t xml:space="preserve">} </w:t>
+      </w:r>
+      <w:r>
+        <w:rPr>
+          <w:rFonts w:ascii="Times New Roman" w:eastAsia="Times New Roman" w:hAnsi="Times New Roman" w:cs="Times New Roman"/>
+          <w:sz w:val="24"/>
+          <w:szCs w:val="24"/>
+        </w:rPr>
+        <w:t>,</w:t>
+      </w:r>
+      <w:proofErr w:type="gramEnd"/>
+      <w:r>
+        <w:rPr>
+          <w:rFonts w:ascii="Times New Roman" w:eastAsia="Times New Roman" w:hAnsi="Times New Roman" w:cs="Times New Roman"/>
+          <w:sz w:val="24"/>
+          <w:szCs w:val="24"/>
+        </w:rPr>
+        <w:t xml:space="preserve"> com as seguintes características:</w:t>
+      </w:r>
+    </w:p>
+    <w:p>
+      <w:pPr>
+        <w:widowControl/>
+        <w:numPr>
+          <w:ilvl w:val="0"/>
+          <w:numId w:val="14"/>
+        </w:numPr>
+        <w:spacing w:before="100" w:beforeAutospacing="1" w:after="100" w:afterAutospacing="1"/>
+        <w:rPr>
+          <w:rFonts w:ascii="Times New Roman" w:eastAsia="Times New Roman" w:hAnsi="Times New Roman" w:cs="Times New Roman"/>
+          <w:sz w:val="24"/>
+          <w:szCs w:val="24"/>
+        </w:rPr>
+      </w:pPr>
+      <w:r>
+        <w:rPr>
+          <w:rFonts w:ascii="Times New Roman" w:eastAsia="Times New Roman" w:hAnsi="Times New Roman" w:cs="Times New Roman"/>
+          <w:sz w:val="24"/>
+          <w:szCs w:val="24"/>
+        </w:rPr>
+        <w:t xml:space="preserve">Tipo de Terreno: </w:t>
+      </w:r>
+      <w:r>
+        <w:rPr>
+          <w:rFonts w:ascii="Times New Roman" w:eastAsia="Times New Roman" w:hAnsi="Times New Roman" w:cs="Times New Roman"/>
+          <w:sz w:val="24"/>
+          <w:szCs w:val="24"/>
+        </w:rPr>
+        <w:t>${</w:t>
+      </w:r>
+      <w:proofErr w:type="spellStart"/>
+      <w:r>
+        <w:rPr>
+          <w:rFonts w:ascii="Times New Roman" w:eastAsia="Times New Roman" w:hAnsi="Times New Roman" w:cs="Times New Roman"/>
+          <w:sz w:val="24"/>
+          <w:szCs w:val="24"/>
+        </w:rPr>
+        <w:t>TipoTerreno</w:t>
+      </w:r>
+      <w:proofErr w:type="spellEnd"/>
+      <w:r>
+        <w:rPr>
+          <w:rFonts w:ascii="Times New Roman" w:eastAsia="Times New Roman" w:hAnsi="Times New Roman" w:cs="Times New Roman"/>
+          <w:sz w:val="24"/>
+          <w:szCs w:val="24"/>
+        </w:rPr>
+        <w:t>}</w:t>
+      </w:r>
+      <w:r>
+        <w:rPr>
+          <w:rFonts w:ascii="Times New Roman" w:eastAsia="Times New Roman" w:hAnsi="Times New Roman" w:cs="Times New Roman"/>
+          <w:sz w:val="24"/>
+          <w:szCs w:val="24"/>
+        </w:rPr>
+        <w:t>;</w:t>
+      </w:r>
+    </w:p>
+    <w:p>
+      <w:pPr>
+        <w:widowControl/>
+        <w:numPr>
+          <w:ilvl w:val="0"/>
+          <w:numId w:val="14"/>
+        </w:numPr>
+        <w:spacing w:before="100" w:beforeAutospacing="1" w:after="100" w:afterAutospacing="1"/>
+        <w:rPr>
+          <w:rFonts w:ascii="Times New Roman" w:eastAsia="Times New Roman" w:hAnsi="Times New Roman" w:cs="Times New Roman"/>
+          <w:sz w:val="24"/>
+          <w:szCs w:val="24"/>
+        </w:rPr>
+      </w:pPr>
+      <w:r>
+        <w:rPr>
+          <w:rFonts w:ascii="Times New Roman" w:eastAsia="Times New Roman" w:hAnsi="Times New Roman" w:cs="Times New Roman"/>
+          <w:sz w:val="24"/>
+          <w:szCs w:val="24"/>
+        </w:rPr>
+        <w:t xml:space="preserve">Cobertura Vegetal: </w:t>
+      </w:r>
+      <w:r>
+        <w:rPr>
+          <w:rFonts w:ascii="Times New Roman" w:eastAsia="Times New Roman" w:hAnsi="Times New Roman" w:cs="Times New Roman"/>
+          <w:sz w:val="24"/>
+          <w:szCs w:val="24"/>
+        </w:rPr>
+        <w:t>${</w:t>
+      </w:r>
+      <w:proofErr w:type="spellStart"/>
+      <w:r>
+        <w:rPr>
+          <w:rFonts w:ascii="Times New Roman" w:eastAsia="Times New Roman" w:hAnsi="Times New Roman" w:cs="Times New Roman"/>
+          <w:sz w:val="24"/>
+          <w:szCs w:val="24"/>
+        </w:rPr>
+        <w:t>CoberturaVegetal</w:t>
+      </w:r>
+      <w:proofErr w:type="spellEnd"/>
+      <w:r>
+        <w:rPr>
+          <w:rFonts w:ascii="Times New Roman" w:eastAsia="Times New Roman" w:hAnsi="Times New Roman" w:cs="Times New Roman"/>
+          <w:sz w:val="24"/>
+          <w:szCs w:val="24"/>
+        </w:rPr>
+        <w:t>}</w:t>
+      </w:r>
+      <w:r>
+        <w:rPr>
+          <w:rFonts w:ascii="Times New Roman" w:eastAsia="Times New Roman" w:hAnsi="Times New Roman" w:cs="Times New Roman"/>
+          <w:sz w:val="24"/>
+          <w:szCs w:val="24"/>
+        </w:rPr>
+        <w:t>;</w:t>
+      </w:r>
+    </w:p>
+    <w:p>
+      <w:pPr>
+        <w:widowControl/>
+        <w:numPr>
+          <w:ilvl w:val="0"/>
+          <w:numId w:val="14"/>
+        </w:numPr>
+        <w:spacing w:before="100" w:beforeAutospacing="1" w:after="100" w:afterAutospacing="1"/>
+        <w:rPr>
+          <w:rFonts w:ascii="Times New Roman" w:eastAsia="Times New Roman" w:hAnsi="Times New Roman" w:cs="Times New Roman"/>
+          <w:sz w:val="24"/>
+          <w:szCs w:val="24"/>
+        </w:rPr>
+      </w:pPr>
+      <w:r>
+        <w:rPr>
+          <w:rFonts w:ascii="Times New Roman" w:eastAsia="Times New Roman" w:hAnsi="Times New Roman" w:cs="Times New Roman"/>
+          <w:sz w:val="24"/>
+          <w:szCs w:val="24"/>
+        </w:rPr>
+        <w:t xml:space="preserve">Acesso: </w:t>
+      </w:r>
+      <w:r>
+        <w:rPr>
+          <w:rFonts w:ascii="Times New Roman" w:eastAsia="Times New Roman" w:hAnsi="Times New Roman" w:cs="Times New Roman"/>
+          <w:sz w:val="24"/>
+          <w:szCs w:val="24"/>
+        </w:rPr>
+        <w:t>${</w:t>
+      </w:r>
+      <w:proofErr w:type="spellStart"/>
+      <w:r>
+        <w:rPr>
+          <w:rFonts w:ascii="Times New Roman" w:eastAsia="Times New Roman" w:hAnsi="Times New Roman" w:cs="Times New Roman"/>
+          <w:sz w:val="24"/>
+          <w:szCs w:val="24"/>
+        </w:rPr>
+        <w:t>AcessoLocal</w:t>
+      </w:r>
+      <w:proofErr w:type="spellEnd"/>
+      <w:r>
+        <w:rPr>
+          <w:rFonts w:ascii="Times New Roman" w:eastAsia="Times New Roman" w:hAnsi="Times New Roman" w:cs="Times New Roman"/>
+          <w:sz w:val="24"/>
+          <w:szCs w:val="24"/>
+        </w:rPr>
+        <w:t>}</w:t>
+      </w:r>
+      <w:r>
+        <w:rPr>
+          <w:rFonts w:ascii="Times New Roman" w:eastAsia="Times New Roman" w:hAnsi="Times New Roman" w:cs="Times New Roman"/>
+          <w:sz w:val="24"/>
+          <w:szCs w:val="24"/>
+        </w:rPr>
+        <w:t>;</w:t>
+      </w:r>
+    </w:p>
+    <w:p>
+      <w:pPr>
+        <w:widowControl/>
+        <w:numPr>
+          <w:ilvl w:val="0"/>
+          <w:numId w:val="14"/>
+        </w:numPr>
+        <w:spacing w:before="100" w:beforeAutospacing="1" w:after="100" w:afterAutospacing="1"/>
+        <w:rPr>
+          <w:rFonts w:ascii="Times New Roman" w:eastAsia="Times New Roman" w:hAnsi="Times New Roman" w:cs="Times New Roman"/>
+          <w:sz w:val="24"/>
+          <w:szCs w:val="24"/>
+        </w:rPr>
+      </w:pPr>
+      <w:r>
+        <w:rPr>
+          <w:rFonts w:ascii="Times New Roman" w:eastAsia="Times New Roman" w:hAnsi="Times New Roman" w:cs="Times New Roman"/>
+          <w:sz w:val="24"/>
+          <w:szCs w:val="24"/>
+        </w:rPr>
+        <w:t xml:space="preserve">Restrições: </w:t>
+      </w:r>
+      <w:r>
+        <w:rPr>
+          <w:rFonts w:ascii="Times New Roman" w:eastAsia="Times New Roman" w:hAnsi="Times New Roman" w:cs="Times New Roman"/>
+          <w:sz w:val="24"/>
+          <w:szCs w:val="24"/>
+        </w:rPr>
+        <w:t>${</w:t>
+      </w:r>
+      <w:proofErr w:type="spellStart"/>
+      <w:r>
+        <w:rPr>
+          <w:rFonts w:ascii="Times New Roman" w:eastAsia="Times New Roman" w:hAnsi="Times New Roman" w:cs="Times New Roman"/>
+          <w:sz w:val="24"/>
+          <w:szCs w:val="24"/>
+        </w:rPr>
+        <w:t>RestricoesAereas</w:t>
+      </w:r>
+      <w:proofErr w:type="spellEnd"/>
+      <w:r>
+        <w:rPr>
+          <w:rFonts w:ascii="Times New Roman" w:eastAsia="Times New Roman" w:hAnsi="Times New Roman" w:cs="Times New Roman"/>
+          <w:sz w:val="24"/>
+          <w:szCs w:val="24"/>
+        </w:rPr>
+        <w:t>}</w:t>
+      </w:r>
+      <w:r>
+        <w:rPr>
+          <w:rFonts w:ascii="Times New Roman" w:eastAsia="Times New Roman" w:hAnsi="Times New Roman" w:cs="Times New Roman"/>
+          <w:sz w:val="24"/>
+          <w:szCs w:val="24"/>
+        </w:rPr>
+        <w:t>.</w:t>
+      </w:r>
+    </w:p>
+    <w:p>
+      <w:pPr>
+        <w:widowControl/>
+        <w:spacing w:before="100" w:beforeAutospacing="1" w:after="100" w:afterAutospacing="1"/>
+        <w:rPr>
+          <w:rFonts w:ascii="Times New Roman" w:eastAsia="Times New Roman" w:hAnsi="Times New Roman" w:cs="Times New Roman"/>
+          <w:b/>
+          <w:bCs/>
+          <w:sz w:val="24"/>
+          <w:szCs w:val="24"/>
+        </w:rPr>
+      </w:pPr>
+      <w:r>
+        <w:rPr>
+          <w:rFonts w:ascii="Times New Roman" w:eastAsia="Times New Roman" w:hAnsi="Times New Roman" w:cs="Times New Roman"/>
+          <w:b/>
+          <w:bCs/>
+          <w:sz w:val="24"/>
+          <w:szCs w:val="24"/>
+        </w:rPr>
+        <w:t>O serviço compreende:</w:t>
+      </w:r>
+    </w:p>
+    <w:p>
+      <w:pPr>
+        <w:widowControl/>
+        <w:numPr>
+          <w:ilvl w:val="0"/>
+          <w:numId w:val="15"/>
+        </w:numPr>
+        <w:spacing w:before="100" w:beforeAutospacing="1" w:after="100" w:afterAutospacing="1"/>
+        <w:rPr>
+          <w:rFonts w:ascii="Times New Roman" w:eastAsia="Times New Roman" w:hAnsi="Times New Roman" w:cs="Times New Roman"/>
+          <w:sz w:val="24"/>
+          <w:szCs w:val="24"/>
+        </w:rPr>
+      </w:pPr>
+      <w:r>
+        <w:rPr>
+          <w:rFonts w:ascii="Times New Roman" w:eastAsia="Times New Roman" w:hAnsi="Times New Roman" w:cs="Times New Roman"/>
+          <w:sz w:val="24"/>
+          <w:szCs w:val="24"/>
+        </w:rPr>
+        <w:t xml:space="preserve">Planejamento de voo e estudo de viabilidade aérea (consulta DECEA para </w:t>
+      </w:r>
+      <w:r>
+        <w:rPr>
+          <w:rFonts w:ascii="Times New Roman" w:eastAsia="Times New Roman" w:hAnsi="Times New Roman" w:cs="Times New Roman"/>
+          <w:sz w:val="24"/>
+          <w:szCs w:val="24"/>
+        </w:rPr>
+        <w:t>${</w:t>
+      </w:r>
+      <w:proofErr w:type="spellStart"/>
+      <w:r>
+        <w:rPr>
+          <w:rFonts w:ascii="Times New Roman" w:eastAsia="Times New Roman" w:hAnsi="Times New Roman" w:cs="Times New Roman"/>
+          <w:sz w:val="24"/>
+          <w:szCs w:val="24"/>
+        </w:rPr>
+        <w:t>cidade_obra</w:t>
+      </w:r>
+      <w:proofErr w:type="spellEnd"/>
+      <w:r>
+        <w:rPr>
+          <w:rFonts w:ascii="Times New Roman" w:eastAsia="Times New Roman" w:hAnsi="Times New Roman" w:cs="Times New Roman"/>
+          <w:sz w:val="24"/>
+          <w:szCs w:val="24"/>
+        </w:rPr>
+        <w:t xml:space="preserve">} </w:t>
+      </w:r>
+      <w:r>
+        <w:rPr>
+          <w:rFonts w:ascii="Times New Roman" w:eastAsia="Times New Roman" w:hAnsi="Times New Roman" w:cs="Times New Roman"/>
+          <w:sz w:val="24"/>
+          <w:szCs w:val="24"/>
+        </w:rPr>
+        <w:t>-</w:t>
+      </w:r>
+      <w:r>
+        <w:rPr>
+          <w:rFonts w:ascii="Times New Roman" w:eastAsia="Times New Roman" w:hAnsi="Times New Roman" w:cs="Times New Roman"/>
+          <w:sz w:val="24"/>
+          <w:szCs w:val="24"/>
+        </w:rPr>
+        <w:t>${</w:t>
+      </w:r>
+      <w:proofErr w:type="spellStart"/>
+      <w:r>
+        <w:rPr>
+          <w:rFonts w:ascii="Times New Roman" w:eastAsia="Times New Roman" w:hAnsi="Times New Roman" w:cs="Times New Roman"/>
+          <w:sz w:val="24"/>
+          <w:szCs w:val="24"/>
+        </w:rPr>
+        <w:t>estado_obra</w:t>
+      </w:r>
+      <w:proofErr w:type="spellEnd"/>
+      <w:r>
+        <w:rPr>
+          <w:rFonts w:ascii="Times New Roman" w:eastAsia="Times New Roman" w:hAnsi="Times New Roman" w:cs="Times New Roman"/>
+          <w:sz w:val="24"/>
+          <w:szCs w:val="24"/>
+        </w:rPr>
+        <w:t>}</w:t>
+      </w:r>
+    </w:p>
+    <w:p>
+      <w:pPr>
+        <w:widowControl/>
+        <w:numPr>
+          <w:ilvl w:val="0"/>
+          <w:numId w:val="15"/>
+        </w:numPr>
+        <w:spacing w:before="100" w:beforeAutospacing="1" w:after="100" w:afterAutospacing="1"/>
+        <w:rPr>
+          <w:rFonts w:ascii="Times New Roman" w:eastAsia="Times New Roman" w:hAnsi="Times New Roman" w:cs="Times New Roman"/>
+          <w:sz w:val="24"/>
+          <w:szCs w:val="24"/>
+        </w:rPr>
+      </w:pPr>
+      <w:r>
+        <w:rPr>
+          <w:rFonts w:ascii="Times New Roman" w:eastAsia="Times New Roman" w:hAnsi="Times New Roman" w:cs="Times New Roman"/>
+          <w:sz w:val="24"/>
+          <w:szCs w:val="24"/>
+        </w:rPr>
+        <w:t>Implantação de Pontos de Controle Terrestre (</w:t>
+      </w:r>
+      <w:proofErr w:type="spellStart"/>
+      <w:r>
+        <w:rPr>
+          <w:rFonts w:ascii="Times New Roman" w:eastAsia="Times New Roman" w:hAnsi="Times New Roman" w:cs="Times New Roman"/>
+          <w:sz w:val="24"/>
+          <w:szCs w:val="24"/>
+        </w:rPr>
+        <w:t>GCPs</w:t>
+      </w:r>
+      <w:proofErr w:type="spellEnd"/>
+      <w:r>
+        <w:rPr>
+          <w:rFonts w:ascii="Times New Roman" w:eastAsia="Times New Roman" w:hAnsi="Times New Roman" w:cs="Times New Roman"/>
+          <w:sz w:val="24"/>
+          <w:szCs w:val="24"/>
+        </w:rPr>
+        <w:t>) com GPS RTK;</w:t>
+      </w:r>
+    </w:p>
+    <w:p>
+      <w:pPr>
+        <w:widowControl/>
+        <w:numPr>
+          <w:ilvl w:val="0"/>
+          <w:numId w:val="15"/>
+        </w:numPr>
+        <w:spacing w:before="100" w:beforeAutospacing="1" w:after="100" w:afterAutospacing="1"/>
+        <w:rPr>
+          <w:rFonts w:ascii="Times New Roman" w:eastAsia="Times New Roman" w:hAnsi="Times New Roman" w:cs="Times New Roman"/>
+          <w:sz w:val="24"/>
+          <w:szCs w:val="24"/>
+        </w:rPr>
+      </w:pPr>
+      <w:r>
+        <w:rPr>
+          <w:rFonts w:ascii="Times New Roman" w:eastAsia="Times New Roman" w:hAnsi="Times New Roman" w:cs="Times New Roman"/>
+          <w:sz w:val="24"/>
+          <w:szCs w:val="24"/>
+        </w:rPr>
+        <w:t>Captura de imagens aéreas com sobreposição adequada (80% longitudinal, 70% lateral);</w:t>
+      </w:r>
+    </w:p>
+    <w:p>
+      <w:pPr>
+        <w:widowControl/>
+        <w:numPr>
+          <w:ilvl w:val="0"/>
+          <w:numId w:val="15"/>
+        </w:numPr>
+        <w:spacing w:before="100" w:beforeAutospacing="1" w:after="100" w:afterAutospacing="1"/>
+        <w:rPr>
+          <w:rFonts w:ascii="Times New Roman" w:eastAsia="Times New Roman" w:hAnsi="Times New Roman" w:cs="Times New Roman"/>
+          <w:sz w:val="24"/>
+          <w:szCs w:val="24"/>
+        </w:rPr>
+      </w:pPr>
+      <w:r>
+        <w:rPr>
+          <w:rFonts w:ascii="Times New Roman" w:eastAsia="Times New Roman" w:hAnsi="Times New Roman" w:cs="Times New Roman"/>
+          <w:sz w:val="24"/>
+          <w:szCs w:val="24"/>
+        </w:rPr>
+        <w:t xml:space="preserve">Processamento fotogramétrico e geração de </w:t>
+      </w:r>
+      <w:r>
+        <w:rPr>
+          <w:rFonts w:ascii="Times New Roman" w:eastAsia="Times New Roman" w:hAnsi="Times New Roman" w:cs="Times New Roman"/>
+          <w:sz w:val="24"/>
+          <w:szCs w:val="24"/>
+        </w:rPr>
+        <w:t>Ortomosaico</w:t>
+      </w:r>
+      <w:r>
+        <w:rPr>
+          <w:rFonts w:ascii="Times New Roman" w:eastAsia="Times New Roman" w:hAnsi="Times New Roman" w:cs="Times New Roman"/>
+          <w:sz w:val="24"/>
+          <w:szCs w:val="24"/>
+        </w:rPr>
+        <w:t xml:space="preserve"> georreferenciado;</w:t>
+      </w:r>
+    </w:p>
+    <w:p>
+      <w:pPr>
+        <w:widowControl/>
+        <w:numPr>
+          <w:ilvl w:val="0"/>
+          <w:numId w:val="15"/>
+        </w:numPr>
+        <w:spacing w:before="100" w:beforeAutospacing="1" w:after="100" w:afterAutospacing="1"/>
+        <w:rPr>
+          <w:rFonts w:ascii="Times New Roman" w:eastAsia="Times New Roman" w:hAnsi="Times New Roman" w:cs="Times New Roman"/>
+          <w:sz w:val="24"/>
+          <w:szCs w:val="24"/>
+        </w:rPr>
+      </w:pPr>
+      <w:r>
+        <w:rPr>
+          <w:rFonts w:ascii="Times New Roman" w:eastAsia="Times New Roman" w:hAnsi="Times New Roman" w:cs="Times New Roman"/>
+          <w:sz w:val="24"/>
+          <w:szCs w:val="24"/>
+        </w:rPr>
+        <w:t>Geração de MDT (Modelo Digital do Terreno) e MDS (Modelo Digital de Superfície);</w:t>
+      </w:r>
+    </w:p>
+    <w:p>
+      <w:pPr>
+        <w:widowControl/>
+        <w:numPr>
+          <w:ilvl w:val="0"/>
+          <w:numId w:val="15"/>
+        </w:numPr>
+        <w:spacing w:before="100" w:beforeAutospacing="1" w:after="100" w:afterAutospacing="1"/>
+        <w:rPr>
+          <w:rFonts w:ascii="Times New Roman" w:eastAsia="Times New Roman" w:hAnsi="Times New Roman" w:cs="Times New Roman"/>
+          <w:sz w:val="24"/>
+          <w:szCs w:val="24"/>
+        </w:rPr>
+      </w:pPr>
+      <w:r>
+        <w:rPr>
+          <w:rFonts w:ascii="Times New Roman" w:eastAsia="Times New Roman" w:hAnsi="Times New Roman" w:cs="Times New Roman"/>
+          <w:sz w:val="24"/>
+          <w:szCs w:val="24"/>
+        </w:rPr>
+        <w:t>Extração de curvas de nível e elementos vetoriais;</w:t>
+      </w:r>
+    </w:p>
+    <w:p>
+      <w:pPr>
+        <w:widowControl/>
+        <w:numPr>
+          <w:ilvl w:val="0"/>
+          <w:numId w:val="15"/>
+        </w:numPr>
+        <w:spacing w:before="100" w:beforeAutospacing="1" w:after="100" w:afterAutospacing="1"/>
+        <w:rPr>
+          <w:rFonts w:ascii="Times New Roman" w:eastAsia="Times New Roman" w:hAnsi="Times New Roman" w:cs="Times New Roman"/>
+          <w:sz w:val="24"/>
+          <w:szCs w:val="24"/>
+        </w:rPr>
+      </w:pPr>
+      <w:r>
+        <w:rPr>
+          <w:rFonts w:ascii="Times New Roman" w:eastAsia="Times New Roman" w:hAnsi="Times New Roman" w:cs="Times New Roman"/>
+          <w:sz w:val="24"/>
+          <w:szCs w:val="24"/>
+        </w:rPr>
+        <w:t>Cálculo de volumes (quando solicitado).</w:t>
+      </w:r>
+    </w:p>
+    <w:p>
+      <w:pPr>
+        <w:widowControl/>
+        <w:numPr>
+          <w:ilvl w:val="0"/>
+          <w:numId w:val="15"/>
+        </w:numPr>
+        <w:spacing w:before="100" w:beforeAutospacing="1" w:after="100" w:afterAutospacing="1"/>
+        <w:rPr>
+          <w:rFonts w:ascii="Times New Roman" w:eastAsia="Times New Roman" w:hAnsi="Times New Roman" w:cs="Times New Roman"/>
+          <w:sz w:val="24"/>
+          <w:szCs w:val="24"/>
+        </w:rPr>
+      </w:pPr>
+    </w:p>
+    <w:p>
+      <w:pPr>
+        <w:pStyle w:val="Ttulo2"/>
+        <w:spacing w:before="0" w:after="120" w:line="275" w:lineRule="auto"/>
+        <w:rPr>
+          <w:rFonts w:ascii="Google Sans" w:eastAsia="Google Sans" w:hAnsi="Google Sans" w:cs="Google Sans"/>
+          <w:color w:val="1F1F1F"/>
+        </w:rPr>
+      </w:pPr>
+      <w:r>
+        <w:rPr>
+          <w:rFonts w:ascii="Google Sans" w:eastAsia="Google Sans" w:hAnsi="Google Sans" w:cs="Google Sans"/>
+          <w:color w:val="1F1F1F"/>
+        </w:rPr>
+        <w:t>4. Metodologia: O Passo a Passo do Mapeamento</w:t>
+      </w:r>
+    </w:p>
+    <w:p>
+      <w:pPr>
+        <w:pBdr>
+          <w:top w:val="nil"/>
+          <w:left w:val="nil"/>
+          <w:bottom w:val="nil"/>
+          <w:right w:val="nil"/>
+          <w:between w:val="nil"/>
+        </w:pBdr>
+        <w:spacing w:after="240" w:line="276" w:lineRule="auto"/>
+        <w:jc w:val="both"/>
+        <w:rPr>
+          <w:rFonts w:ascii="Google Sans Text" w:eastAsia="Google Sans Text" w:hAnsi="Google Sans Text" w:cs="Google Sans Text"/>
+          <w:color w:val="1F1F1F"/>
+        </w:rPr>
+      </w:pPr>
+      <w:r>
+        <w:rPr>
+          <w:rFonts w:ascii="Google Sans Text" w:eastAsia="Google Sans Text" w:hAnsi="Google Sans Text" w:cs="Google Sans Text"/>
+          <w:color w:val="1F1F1F"/>
+        </w:rPr>
+        <w:t xml:space="preserve">Para garantir que o produto final tenha </w:t>
+      </w:r>
+      <w:r>
+        <w:rPr>
+          <w:rFonts w:ascii="Google Sans Text" w:eastAsia="Google Sans Text" w:hAnsi="Google Sans Text" w:cs="Google Sans Text"/>
+          <w:b/>
+          <w:bCs/>
           <w:color w:val="1F1F1F"/>
         </w:rPr>
         <w:t>validade topográfica</w:t>
@@ -1469,6 +1612,23 @@
         </w:rPr>
         <w:t>, seguimos um rigoroso fluxo de trabalho dividido em etapas de campo e escritório. Abaixo, detalhamos cada fase para total compreensão do processo contratado:</w:t>
       </w:r>
+    </w:p>
+    <w:p>
+      <w:pPr>
+        <w:pBdr>
+          <w:top w:val="nil"/>
+          <w:left w:val="nil"/>
+          <w:bottom w:val="nil"/>
+          <w:right w:val="nil"/>
+          <w:between w:val="nil"/>
+        </w:pBdr>
+        <w:spacing w:after="240" w:line="276" w:lineRule="auto"/>
+        <w:jc w:val="both"/>
+        <w:rPr>
+          <w:rFonts w:ascii="Google Sans Text" w:eastAsia="Google Sans Text" w:hAnsi="Google Sans Text" w:cs="Google Sans Text"/>
+          <w:color w:val="1F1F1F"/>
+        </w:rPr>
+      </w:pPr>
     </w:p>
     <w:p>
       <w:pPr>
@@ -1539,7 +1699,15 @@
           <w:rFonts w:ascii="Google Sans Text" w:eastAsia="Google Sans Text" w:hAnsi="Google Sans Text" w:cs="Google Sans Text"/>
           <w:color w:val="1F1F1F"/>
         </w:rPr>
-        <w:t xml:space="preserve"> Definimos a altura de voo para garantir a resolução desejada (GSD) e a área de abrangência.</w:t>
+        <w:t xml:space="preserve"> Definimos a altura de voo para garantir a resolução desejada (GSD) e a área de </w:t>
+      </w:r>
+      <w:r>
+        <w:rPr>
+          <w:rFonts w:ascii="Google Sans Text" w:eastAsia="Google Sans Text" w:hAnsi="Google Sans Text" w:cs="Google Sans Text"/>
+          <w:color w:val="1F1F1F"/>
+        </w:rPr>
+        <w:lastRenderedPageBreak/>
+        <w:t>abrangência.</w:t>
       </w:r>
     </w:p>
     <w:p>
@@ -1624,6 +1792,18 @@
     </w:p>
     <w:p>
       <w:pPr>
+        <w:pBdr>
+          <w:top w:val="nil"/>
+          <w:left w:val="nil"/>
+          <w:bottom w:val="nil"/>
+          <w:right w:val="nil"/>
+          <w:between w:val="nil"/>
+        </w:pBdr>
+        <w:spacing w:after="120" w:line="275" w:lineRule="auto"/>
+      </w:pPr>
+    </w:p>
+    <w:p>
+      <w:pPr>
         <w:pStyle w:val="Ttulo3"/>
         <w:spacing w:before="120" w:after="120" w:line="275" w:lineRule="auto"/>
         <w:rPr>
@@ -1741,7 +1921,6 @@
           <w:bCs/>
           <w:color w:val="1F1F1F"/>
         </w:rPr>
-        <w:lastRenderedPageBreak/>
         <w:t>Checklist:</w:t>
       </w:r>
       <w:r>
@@ -1751,6 +1930,22 @@
         </w:rPr>
         <w:t xml:space="preserve"> Verificação da fixação dos pontos, nivelamento do bastão GPS e tempo de rastreio dos satélites.</w:t>
       </w:r>
+    </w:p>
+    <w:p>
+      <w:pPr>
+        <w:numPr>
+          <w:ilvl w:val="0"/>
+          <w:numId w:val="4"/>
+        </w:numPr>
+        <w:pBdr>
+          <w:top w:val="nil"/>
+          <w:left w:val="nil"/>
+          <w:bottom w:val="nil"/>
+          <w:right w:val="nil"/>
+          <w:between w:val="nil"/>
+        </w:pBdr>
+        <w:spacing w:after="120" w:line="275" w:lineRule="auto"/>
+      </w:pPr>
     </w:p>
     <w:p>
       <w:pPr>
@@ -1865,6 +2060,18 @@
     </w:p>
     <w:p>
       <w:pPr>
+        <w:pBdr>
+          <w:top w:val="nil"/>
+          <w:left w:val="nil"/>
+          <w:bottom w:val="nil"/>
+          <w:right w:val="nil"/>
+          <w:between w:val="nil"/>
+        </w:pBdr>
+        <w:spacing w:after="120" w:line="275" w:lineRule="auto"/>
+      </w:pPr>
+    </w:p>
+    <w:p>
+      <w:pPr>
         <w:pStyle w:val="Ttulo3"/>
         <w:spacing w:before="120" w:after="120" w:line="275" w:lineRule="auto"/>
         <w:rPr>
@@ -2003,6 +2210,18 @@
     </w:p>
     <w:p>
       <w:pPr>
+        <w:pBdr>
+          <w:top w:val="nil"/>
+          <w:left w:val="nil"/>
+          <w:bottom w:val="nil"/>
+          <w:right w:val="nil"/>
+          <w:between w:val="nil"/>
+        </w:pBdr>
+        <w:spacing w:after="120" w:line="275" w:lineRule="auto"/>
+      </w:pPr>
+    </w:p>
+    <w:p>
+      <w:pPr>
         <w:pStyle w:val="Ttulo3"/>
         <w:spacing w:before="120" w:after="120" w:line="275" w:lineRule="auto"/>
         <w:rPr>
@@ -2379,6 +2598,18 @@
           <w:between w:val="nil"/>
         </w:pBdr>
         <w:spacing w:after="120" w:line="275" w:lineRule="auto"/>
+      </w:pPr>
+    </w:p>
+    <w:p>
+      <w:pPr>
+        <w:pBdr>
+          <w:top w:val="nil"/>
+          <w:left w:val="nil"/>
+          <w:bottom w:val="nil"/>
+          <w:right w:val="nil"/>
+          <w:between w:val="nil"/>
+        </w:pBdr>
+        <w:spacing w:after="120" w:line="275" w:lineRule="auto"/>
         <w:ind w:left="465"/>
       </w:pPr>
     </w:p>
@@ -2396,10 +2627,11 @@
           <w:rFonts w:ascii="Google Sans" w:eastAsia="Google Sans" w:hAnsi="Google Sans" w:cs="Google Sans"/>
           <w:color w:val="1F1F1F"/>
         </w:rPr>
-        <w:lastRenderedPageBreak/>
         <w:t>6. Produtos Entregues (O que você recebe)</w:t>
       </w:r>
     </w:p>
+    <w:p/>
+    <w:p/>
     <w:p>
       <w:pPr>
         <w:pBdr>
@@ -2660,6 +2892,78 @@
     </w:p>
     <w:p>
       <w:pPr>
+        <w:pBdr>
+          <w:top w:val="nil"/>
+          <w:left w:val="nil"/>
+          <w:bottom w:val="nil"/>
+          <w:right w:val="nil"/>
+          <w:between w:val="nil"/>
+        </w:pBdr>
+        <w:spacing w:after="120" w:line="275" w:lineRule="auto"/>
+      </w:pPr>
+    </w:p>
+    <w:p>
+      <w:pPr>
+        <w:pBdr>
+          <w:top w:val="nil"/>
+          <w:left w:val="nil"/>
+          <w:bottom w:val="nil"/>
+          <w:right w:val="nil"/>
+          <w:between w:val="nil"/>
+        </w:pBdr>
+        <w:spacing w:after="120" w:line="275" w:lineRule="auto"/>
+      </w:pPr>
+    </w:p>
+    <w:p>
+      <w:pPr>
+        <w:pBdr>
+          <w:top w:val="nil"/>
+          <w:left w:val="nil"/>
+          <w:bottom w:val="nil"/>
+          <w:right w:val="nil"/>
+          <w:between w:val="nil"/>
+        </w:pBdr>
+        <w:spacing w:after="120" w:line="275" w:lineRule="auto"/>
+      </w:pPr>
+    </w:p>
+    <w:p>
+      <w:pPr>
+        <w:pBdr>
+          <w:top w:val="nil"/>
+          <w:left w:val="nil"/>
+          <w:bottom w:val="nil"/>
+          <w:right w:val="nil"/>
+          <w:between w:val="nil"/>
+        </w:pBdr>
+        <w:spacing w:after="120" w:line="275" w:lineRule="auto"/>
+      </w:pPr>
+    </w:p>
+    <w:p>
+      <w:pPr>
+        <w:pBdr>
+          <w:top w:val="nil"/>
+          <w:left w:val="nil"/>
+          <w:bottom w:val="nil"/>
+          <w:right w:val="nil"/>
+          <w:between w:val="nil"/>
+        </w:pBdr>
+        <w:spacing w:after="120" w:line="275" w:lineRule="auto"/>
+      </w:pPr>
+    </w:p>
+    <w:p>
+      <w:pPr>
+        <w:pBdr>
+          <w:top w:val="nil"/>
+          <w:left w:val="nil"/>
+          <w:bottom w:val="nil"/>
+          <w:right w:val="nil"/>
+          <w:between w:val="nil"/>
+        </w:pBdr>
+        <w:spacing w:after="120" w:line="275" w:lineRule="auto"/>
+      </w:pPr>
+    </w:p>
+    <w:p>
+      <w:pPr>
         <w:pStyle w:val="Ttulo2"/>
         <w:spacing w:before="120" w:after="120" w:line="275" w:lineRule="auto"/>
         <w:rPr>
@@ -2701,7 +3005,8 @@
     <w:tbl>
       <w:tblPr>
         <w:tblStyle w:val="a"/>
-        <w:tblW w:w="9360" w:type="dxa"/>
+        <w:tblW w:w="7363" w:type="dxa"/>
+        <w:jc w:val="center"/>
         <w:tblInd w:w="0" w:type="dxa"/>
         <w:tblBorders>
           <w:top w:val="single" w:sz="6" w:space="0" w:color="000000"/>
@@ -2715,14 +3020,17 @@
         <w:tblLook w:val="0600" w:firstRow="0" w:lastRow="0" w:firstColumn="0" w:lastColumn="0" w:noHBand="1" w:noVBand="1"/>
       </w:tblPr>
       <w:tblGrid>
-        <w:gridCol w:w="3120"/>
-        <w:gridCol w:w="3120"/>
-        <w:gridCol w:w="3120"/>
+        <w:gridCol w:w="2260"/>
+        <w:gridCol w:w="2552"/>
+        <w:gridCol w:w="2551"/>
       </w:tblGrid>
       <w:tr>
+        <w:trPr>
+          <w:jc w:val="center"/>
+        </w:trPr>
         <w:tc>
           <w:tcPr>
-            <w:tcW w:w="3120" w:type="dxa"/>
+            <w:tcW w:w="2260" w:type="dxa"/>
             <w:tcBorders>
               <w:top w:val="single" w:sz="6" w:space="0" w:color="000000"/>
               <w:left w:val="single" w:sz="6" w:space="0" w:color="000000"/>
@@ -2747,6 +3055,7 @@
                 <w:between w:val="nil"/>
               </w:pBdr>
               <w:spacing w:before="120" w:after="120" w:line="275" w:lineRule="auto"/>
+              <w:jc w:val="center"/>
               <w:rPr>
                 <w:rFonts w:ascii="Google Sans Text" w:eastAsia="Google Sans Text" w:hAnsi="Google Sans Text" w:cs="Google Sans Text"/>
                 <w:b/>
@@ -2767,7 +3076,7 @@
         </w:tc>
         <w:tc>
           <w:tcPr>
-            <w:tcW w:w="3120" w:type="dxa"/>
+            <w:tcW w:w="2552" w:type="dxa"/>
             <w:tcBorders>
               <w:top w:val="single" w:sz="6" w:space="0" w:color="000000"/>
               <w:left w:val="single" w:sz="6" w:space="0" w:color="000000"/>
@@ -2792,6 +3101,7 @@
                 <w:between w:val="nil"/>
               </w:pBdr>
               <w:spacing w:before="120" w:after="120" w:line="275" w:lineRule="auto"/>
+              <w:jc w:val="center"/>
               <w:rPr>
                 <w:rFonts w:ascii="Google Sans Text" w:eastAsia="Google Sans Text" w:hAnsi="Google Sans Text" w:cs="Google Sans Text"/>
                 <w:b/>
@@ -2812,7 +3122,7 @@
         </w:tc>
         <w:tc>
           <w:tcPr>
-            <w:tcW w:w="3120" w:type="dxa"/>
+            <w:tcW w:w="2551" w:type="dxa"/>
             <w:tcBorders>
               <w:top w:val="single" w:sz="6" w:space="0" w:color="000000"/>
               <w:left w:val="single" w:sz="6" w:space="0" w:color="000000"/>
@@ -2837,6 +3147,7 @@
                 <w:between w:val="nil"/>
               </w:pBdr>
               <w:spacing w:before="120" w:after="120" w:line="275" w:lineRule="auto"/>
+              <w:jc w:val="center"/>
               <w:rPr>
                 <w:rFonts w:ascii="Google Sans Text" w:eastAsia="Google Sans Text" w:hAnsi="Google Sans Text" w:cs="Google Sans Text"/>
                 <w:b/>
@@ -2857,9 +3168,12 @@
         </w:tc>
       </w:tr>
       <w:tr>
+        <w:trPr>
+          <w:jc w:val="center"/>
+        </w:trPr>
         <w:tc>
           <w:tcPr>
-            <w:tcW w:w="3120" w:type="dxa"/>
+            <w:tcW w:w="2260" w:type="dxa"/>
             <w:tcBorders>
               <w:top w:val="single" w:sz="6" w:space="0" w:color="000000"/>
               <w:left w:val="single" w:sz="6" w:space="0" w:color="000000"/>
@@ -2904,7 +3218,7 @@
         </w:tc>
         <w:tc>
           <w:tcPr>
-            <w:tcW w:w="3120" w:type="dxa"/>
+            <w:tcW w:w="2552" w:type="dxa"/>
             <w:tcBorders>
               <w:top w:val="single" w:sz="6" w:space="0" w:color="000000"/>
               <w:left w:val="single" w:sz="6" w:space="0" w:color="000000"/>
@@ -2945,7 +3259,7 @@
         </w:tc>
         <w:tc>
           <w:tcPr>
-            <w:tcW w:w="3120" w:type="dxa"/>
+            <w:tcW w:w="2551" w:type="dxa"/>
             <w:tcBorders>
               <w:top w:val="single" w:sz="6" w:space="0" w:color="000000"/>
               <w:left w:val="single" w:sz="6" w:space="0" w:color="000000"/>
@@ -2986,9 +3300,12 @@
         </w:tc>
       </w:tr>
       <w:tr>
+        <w:trPr>
+          <w:jc w:val="center"/>
+        </w:trPr>
         <w:tc>
           <w:tcPr>
-            <w:tcW w:w="3120" w:type="dxa"/>
+            <w:tcW w:w="2260" w:type="dxa"/>
             <w:tcBorders>
               <w:top w:val="single" w:sz="6" w:space="0" w:color="000000"/>
               <w:left w:val="single" w:sz="6" w:space="0" w:color="000000"/>
@@ -3033,7 +3350,7 @@
         </w:tc>
         <w:tc>
           <w:tcPr>
-            <w:tcW w:w="3120" w:type="dxa"/>
+            <w:tcW w:w="2552" w:type="dxa"/>
             <w:tcBorders>
               <w:top w:val="single" w:sz="6" w:space="0" w:color="000000"/>
               <w:left w:val="single" w:sz="6" w:space="0" w:color="000000"/>
@@ -3074,7 +3391,7 @@
         </w:tc>
         <w:tc>
           <w:tcPr>
-            <w:tcW w:w="3120" w:type="dxa"/>
+            <w:tcW w:w="2551" w:type="dxa"/>
             <w:tcBorders>
               <w:top w:val="single" w:sz="6" w:space="0" w:color="000000"/>
               <w:left w:val="single" w:sz="6" w:space="0" w:color="000000"/>
@@ -3115,9 +3432,12 @@
         </w:tc>
       </w:tr>
       <w:tr>
+        <w:trPr>
+          <w:jc w:val="center"/>
+        </w:trPr>
         <w:tc>
           <w:tcPr>
-            <w:tcW w:w="3120" w:type="dxa"/>
+            <w:tcW w:w="2260" w:type="dxa"/>
             <w:tcBorders>
               <w:top w:val="single" w:sz="6" w:space="0" w:color="000000"/>
               <w:left w:val="single" w:sz="6" w:space="0" w:color="000000"/>
@@ -3162,7 +3482,7 @@
         </w:tc>
         <w:tc>
           <w:tcPr>
-            <w:tcW w:w="3120" w:type="dxa"/>
+            <w:tcW w:w="2552" w:type="dxa"/>
             <w:tcBorders>
               <w:top w:val="single" w:sz="6" w:space="0" w:color="000000"/>
               <w:left w:val="single" w:sz="6" w:space="0" w:color="000000"/>
@@ -3203,7 +3523,7 @@
         </w:tc>
         <w:tc>
           <w:tcPr>
-            <w:tcW w:w="3120" w:type="dxa"/>
+            <w:tcW w:w="2551" w:type="dxa"/>
             <w:tcBorders>
               <w:top w:val="single" w:sz="6" w:space="0" w:color="000000"/>
               <w:left w:val="single" w:sz="6" w:space="0" w:color="000000"/>
@@ -3244,9 +3564,12 @@
         </w:tc>
       </w:tr>
       <w:tr>
+        <w:trPr>
+          <w:jc w:val="center"/>
+        </w:trPr>
         <w:tc>
           <w:tcPr>
-            <w:tcW w:w="3120" w:type="dxa"/>
+            <w:tcW w:w="2260" w:type="dxa"/>
             <w:tcBorders>
               <w:top w:val="single" w:sz="6" w:space="0" w:color="000000"/>
               <w:left w:val="single" w:sz="6" w:space="0" w:color="000000"/>
@@ -3291,7 +3614,7 @@
         </w:tc>
         <w:tc>
           <w:tcPr>
-            <w:tcW w:w="3120" w:type="dxa"/>
+            <w:tcW w:w="2552" w:type="dxa"/>
             <w:tcBorders>
               <w:top w:val="single" w:sz="6" w:space="0" w:color="000000"/>
               <w:left w:val="single" w:sz="6" w:space="0" w:color="000000"/>
@@ -3332,7 +3655,7 @@
         </w:tc>
         <w:tc>
           <w:tcPr>
-            <w:tcW w:w="3120" w:type="dxa"/>
+            <w:tcW w:w="2551" w:type="dxa"/>
             <w:tcBorders>
               <w:top w:val="single" w:sz="6" w:space="0" w:color="000000"/>
               <w:left w:val="single" w:sz="6" w:space="0" w:color="000000"/>
@@ -3373,9 +3696,12 @@
         </w:tc>
       </w:tr>
       <w:tr>
+        <w:trPr>
+          <w:jc w:val="center"/>
+        </w:trPr>
         <w:tc>
           <w:tcPr>
-            <w:tcW w:w="3120" w:type="dxa"/>
+            <w:tcW w:w="2260" w:type="dxa"/>
             <w:tcBorders>
               <w:top w:val="single" w:sz="6" w:space="0" w:color="000000"/>
               <w:left w:val="single" w:sz="6" w:space="0" w:color="000000"/>
@@ -3420,7 +3746,7 @@
         </w:tc>
         <w:tc>
           <w:tcPr>
-            <w:tcW w:w="3120" w:type="dxa"/>
+            <w:tcW w:w="2552" w:type="dxa"/>
             <w:tcBorders>
               <w:top w:val="single" w:sz="6" w:space="0" w:color="000000"/>
               <w:left w:val="single" w:sz="6" w:space="0" w:color="000000"/>
@@ -3461,7 +3787,7 @@
         </w:tc>
         <w:tc>
           <w:tcPr>
-            <w:tcW w:w="3120" w:type="dxa"/>
+            <w:tcW w:w="2551" w:type="dxa"/>
             <w:tcBorders>
               <w:top w:val="single" w:sz="6" w:space="0" w:color="000000"/>
               <w:left w:val="single" w:sz="6" w:space="0" w:color="000000"/>
@@ -3543,22 +3869,13 @@
           <w:rFonts w:ascii="Google Sans Text" w:eastAsia="Google Sans Text" w:hAnsi="Google Sans Text" w:cs="Google Sans Text"/>
           <w:color w:val="1F1F1F"/>
         </w:rPr>
-        <w:lastRenderedPageBreak/>
-        <w:t>O valor total para execução dos serviços descritos, incluindo equipe técnica, equipamentos (Drone, GPS RTK, Estação de Trabalho), deslocamento e impostos, é de:</w:t>
-      </w:r>
-    </w:p>
-    <w:p>
-      <w:pPr>
-        <w:pStyle w:val="Ttulo3"/>
-        <w:spacing w:before="0" w:after="120" w:line="275" w:lineRule="auto"/>
-        <w:rPr>
-          <w:rFonts w:ascii="Google Sans" w:eastAsia="Google Sans" w:hAnsi="Google Sans" w:cs="Google Sans"/>
-          <w:color w:val="1F1F1F"/>
-        </w:rPr>
-      </w:pPr>
-      <w:r>
-        <w:rPr>
-          <w:rFonts w:ascii="Google Sans Text" w:eastAsia="Google Sans Text" w:hAnsi="Google Sans Text" w:cs="Google Sans Text"/>
+        <w:t xml:space="preserve">O valor total para execução dos serviços descritos, incluindo equipe técnica, equipamentos (Drone, GPS RTK, Estação de Trabalho), deslocamento e impostos, é de: </w:t>
+      </w:r>
+      <w:r>
+        <w:rPr>
+          <w:rFonts w:ascii="Google Sans Text" w:eastAsia="Google Sans Text" w:hAnsi="Google Sans Text" w:cs="Google Sans Text"/>
+          <w:b/>
+          <w:bCs/>
           <w:color w:val="1F1F1F"/>
         </w:rPr>
         <w:t>R$ ${</w:t>
@@ -3567,6 +3884,8 @@
       <w:r>
         <w:rPr>
           <w:rFonts w:ascii="Google Sans Text" w:eastAsia="Google Sans Text" w:hAnsi="Google Sans Text" w:cs="Google Sans Text"/>
+          <w:b/>
+          <w:bCs/>
           <w:color w:val="1F1F1F"/>
         </w:rPr>
         <w:t>ValorProposta</w:t>
@@ -3575,21 +3894,34 @@
       <w:r>
         <w:rPr>
           <w:rFonts w:ascii="Google Sans Text" w:eastAsia="Google Sans Text" w:hAnsi="Google Sans Text" w:cs="Google Sans Text"/>
+          <w:b/>
+          <w:bCs/>
           <w:color w:val="1F1F1F"/>
         </w:rPr>
         <w:t>}</w:t>
       </w:r>
       <w:r>
         <w:rPr>
-          <w:rFonts w:ascii="Google Sans" w:eastAsia="Google Sans" w:hAnsi="Google Sans" w:cs="Google Sans"/>
-          <w:color w:val="1F1F1F"/>
-        </w:rPr>
-        <w:t xml:space="preserve"> (${</w:t>
+          <w:rFonts w:ascii="Google Sans Text" w:eastAsia="Google Sans Text" w:hAnsi="Google Sans Text" w:cs="Google Sans Text"/>
+          <w:color w:val="1F1F1F"/>
+        </w:rPr>
+        <w:t xml:space="preserve"> </w:t>
+      </w:r>
+      <w:r>
+        <w:rPr>
+          <w:rFonts w:ascii="Google Sans Text" w:eastAsia="Google Sans Text" w:hAnsi="Google Sans Text" w:cs="Google Sans Text"/>
+          <w:b/>
+          <w:bCs/>
+          <w:color w:val="1F1F1F"/>
+        </w:rPr>
+        <w:t>(${</w:t>
       </w:r>
       <w:proofErr w:type="spellStart"/>
       <w:r>
         <w:rPr>
-          <w:rFonts w:ascii="Google Sans" w:eastAsia="Google Sans" w:hAnsi="Google Sans" w:cs="Google Sans"/>
+          <w:rFonts w:ascii="Google Sans Text" w:eastAsia="Google Sans Text" w:hAnsi="Google Sans Text" w:cs="Google Sans Text"/>
+          <w:b/>
+          <w:bCs/>
           <w:color w:val="1F1F1F"/>
         </w:rPr>
         <w:t>ValorExtenso</w:t>
@@ -3597,10 +3929,19 @@
       <w:proofErr w:type="spellEnd"/>
       <w:r>
         <w:rPr>
-          <w:rFonts w:ascii="Google Sans" w:eastAsia="Google Sans" w:hAnsi="Google Sans" w:cs="Google Sans"/>
+          <w:rFonts w:ascii="Google Sans Text" w:eastAsia="Google Sans Text" w:hAnsi="Google Sans Text" w:cs="Google Sans Text"/>
+          <w:b/>
+          <w:bCs/>
           <w:color w:val="1F1F1F"/>
         </w:rPr>
         <w:t>})</w:t>
+      </w:r>
+      <w:r>
+        <w:rPr>
+          <w:rFonts w:ascii="Google Sans Text" w:eastAsia="Google Sans Text" w:hAnsi="Google Sans Text" w:cs="Google Sans Text"/>
+          <w:color w:val="1F1F1F"/>
+        </w:rPr>
+        <w:t xml:space="preserve"> </w:t>
       </w:r>
     </w:p>
     <w:p>
@@ -3615,16 +3956,12 @@
         <w:spacing w:after="240" w:line="275" w:lineRule="auto"/>
         <w:rPr>
           <w:rFonts w:ascii="Google Sans Text" w:eastAsia="Google Sans Text" w:hAnsi="Google Sans Text" w:cs="Google Sans Text"/>
-          <w:i/>
-          <w:iCs/>
-          <w:color w:val="1F1F1F"/>
-        </w:rPr>
-      </w:pPr>
-      <w:r>
-        <w:rPr>
-          <w:rFonts w:ascii="Google Sans Text" w:eastAsia="Google Sans Text" w:hAnsi="Google Sans Text" w:cs="Google Sans Text"/>
-          <w:i/>
-          <w:iCs/>
+          <w:color w:val="1F1F1F"/>
+        </w:rPr>
+      </w:pPr>
+      <w:r>
+        <w:rPr>
+          <w:rFonts w:ascii="Google Sans Text" w:eastAsia="Google Sans Text" w:hAnsi="Google Sans Text" w:cs="Google Sans Text"/>
           <w:color w:val="1F1F1F"/>
         </w:rPr>
         <w:t>Este investimento reflete o custo-benefício da tecnologia: maior riqueza de dados (milhões de pontos) em menor tempo de execução comparado à topografia tradicional.</w:t>
@@ -3662,6 +3999,7 @@
           <w:rFonts w:ascii="Google Sans" w:eastAsia="Google Sans" w:hAnsi="Google Sans" w:cs="Google Sans"/>
           <w:color w:val="1F1F1F"/>
         </w:rPr>
+        <w:lastRenderedPageBreak/>
         <w:t>10. Condições de Pagamento</w:t>
       </w:r>
     </w:p>
@@ -3827,26 +4165,16 @@
     </w:p>
     <w:p>
       <w:pPr>
-        <w:pBdr>
-          <w:top w:val="nil"/>
-          <w:left w:val="nil"/>
-          <w:bottom w:val="nil"/>
-          <w:right w:val="nil"/>
-          <w:between w:val="nil"/>
-        </w:pBdr>
-        <w:spacing w:before="120" w:after="120" w:line="275" w:lineRule="auto"/>
-        <w:rPr>
-          <w:rFonts w:ascii="Google Sans Text" w:eastAsia="Google Sans Text" w:hAnsi="Google Sans Text" w:cs="Google Sans Text"/>
-          <w:b/>
-          <w:bCs/>
-          <w:color w:val="1F1F1F"/>
-        </w:rPr>
-      </w:pPr>
-      <w:r>
-        <w:rPr>
-          <w:rFonts w:ascii="Google Sans Text" w:eastAsia="Google Sans Text" w:hAnsi="Google Sans Text" w:cs="Google Sans Text"/>
-          <w:b/>
-          <w:bCs/>
+        <w:pStyle w:val="Ttulo2"/>
+        <w:spacing w:before="0" w:after="120" w:line="275" w:lineRule="auto"/>
+        <w:rPr>
+          <w:rFonts w:ascii="Google Sans" w:eastAsia="Google Sans" w:hAnsi="Google Sans" w:cs="Google Sans"/>
+          <w:color w:val="1F1F1F"/>
+        </w:rPr>
+      </w:pPr>
+      <w:r>
+        <w:rPr>
+          <w:rFonts w:ascii="Google Sans" w:eastAsia="Google Sans" w:hAnsi="Google Sans" w:cs="Google Sans"/>
           <w:color w:val="1F1F1F"/>
         </w:rPr>
         <w:t>Dados Bancários:</w:t>
@@ -3913,23 +4241,7 @@
           <w:rFonts w:ascii="Google Sans Text" w:eastAsia="Google Sans Text" w:hAnsi="Google Sans Text" w:cs="Google Sans Text"/>
           <w:color w:val="1F1F1F"/>
         </w:rPr>
-        <w:t xml:space="preserve"> ${Agencia} | </w:t>
-      </w:r>
-      <w:r>
-        <w:rPr>
-          <w:rFonts w:ascii="Google Sans Text" w:eastAsia="Google Sans Text" w:hAnsi="Google Sans Text" w:cs="Google Sans Text"/>
-          <w:b/>
-          <w:bCs/>
-          <w:color w:val="1F1F1F"/>
-        </w:rPr>
-        <w:t>Conta:</w:t>
-      </w:r>
-      <w:r>
-        <w:rPr>
-          <w:rFonts w:ascii="Google Sans Text" w:eastAsia="Google Sans Text" w:hAnsi="Google Sans Text" w:cs="Google Sans Text"/>
-          <w:color w:val="1F1F1F"/>
-        </w:rPr>
-        <w:t xml:space="preserve"> ${Conta}</w:t>
+        <w:t xml:space="preserve"> ${Agencia}</w:t>
       </w:r>
     </w:p>
     <w:p>
@@ -3954,6 +4266,38 @@
           <w:bCs/>
           <w:color w:val="1F1F1F"/>
         </w:rPr>
+        <w:t>Conta:</w:t>
+      </w:r>
+      <w:r>
+        <w:rPr>
+          <w:rFonts w:ascii="Google Sans Text" w:eastAsia="Google Sans Text" w:hAnsi="Google Sans Text" w:cs="Google Sans Text"/>
+          <w:color w:val="1F1F1F"/>
+        </w:rPr>
+        <w:t xml:space="preserve"> ${Conta}</w:t>
+      </w:r>
+    </w:p>
+    <w:p>
+      <w:pPr>
+        <w:numPr>
+          <w:ilvl w:val="0"/>
+          <w:numId w:val="11"/>
+        </w:numPr>
+        <w:pBdr>
+          <w:top w:val="nil"/>
+          <w:left w:val="nil"/>
+          <w:bottom w:val="nil"/>
+          <w:right w:val="nil"/>
+          <w:between w:val="nil"/>
+        </w:pBdr>
+        <w:spacing w:line="275" w:lineRule="auto"/>
+      </w:pPr>
+      <w:r>
+        <w:rPr>
+          <w:rFonts w:ascii="Google Sans Text" w:eastAsia="Google Sans Text" w:hAnsi="Google Sans Text" w:cs="Google Sans Text"/>
+          <w:b/>
+          <w:bCs/>
+          <w:color w:val="1F1F1F"/>
+        </w:rPr>
         <w:t>Titular:</w:t>
       </w:r>
       <w:r>
@@ -4073,41 +4417,8 @@
           <w:rFonts w:ascii="Google Sans Text" w:eastAsia="Google Sans Text" w:hAnsi="Google Sans Text" w:cs="Google Sans Text"/>
           <w:color w:val="1F1F1F"/>
         </w:rPr>
-        <w:t xml:space="preserve">Esta proposta tem validade de 15 dias. A </w:t>
-      </w:r>
-      <w:r>
-        <w:rPr>
-          <w:rFonts w:ascii="Google Sans Text" w:eastAsia="Google Sans Text" w:hAnsi="Google Sans Text" w:cs="Google Sans Text"/>
-          <w:b/>
-          <w:bCs/>
-          <w:color w:val="1F1F1F"/>
-        </w:rPr>
-        <w:t>${Empresa}</w:t>
-      </w:r>
-      <w:r>
-        <w:rPr>
-          <w:rFonts w:ascii="Google Sans Text" w:eastAsia="Google Sans Text" w:hAnsi="Google Sans Text" w:cs="Google Sans Text"/>
-          <w:color w:val="1F1F1F"/>
-        </w:rPr>
-        <w:t xml:space="preserve"> coloca-se à disposição para sanar quaisquer dúvidas técnicas. Garantimos que o produto final entregue será uma ferramenta robusta para o desenvolvimento do seu projeto.</w:t>
-      </w:r>
-    </w:p>
-    <w:p>
-      <w:pPr>
-        <w:pBdr>
-          <w:top w:val="nil"/>
-          <w:left w:val="nil"/>
-          <w:bottom w:val="nil"/>
-          <w:right w:val="nil"/>
-          <w:between w:val="nil"/>
-        </w:pBdr>
-        <w:spacing w:after="240" w:line="275" w:lineRule="auto"/>
-        <w:jc w:val="center"/>
-        <w:rPr>
-          <w:rFonts w:ascii="Google Sans Text" w:eastAsia="Google Sans Text" w:hAnsi="Google Sans Text" w:cs="Google Sans Text"/>
-          <w:color w:val="1F1F1F"/>
-        </w:rPr>
-      </w:pPr>
+        <w:t>Esta proposta tem validade de 15 dias. A ${Empresa} traz em seu DNA uma sólida vivência prática em obras complexas, aplicando o rigor da topografia clássica às inovações do mapeamento aéreo. Entendemos a responsabilidade que um levantamento planialtimétrico carrega em projetos de engenharia e infraestrutura. Por isso, nossa equipe coloca-se à disposição para alinhar as melhores soluções técnicas para a sua demanda, assegurando a entrega de um produto final de altíssima confiabilidade e precisão.</w:t>
+      </w:r>
     </w:p>
     <w:p>
       <w:pPr>
@@ -8411,6 +8722,19 @@
       <w:szCs w:val="36"/>
     </w:rPr>
   </w:style>
+  <w:style w:type="character" w:styleId="CdigoHTML">
+    <w:name w:val="HTML Code"/>
+    <w:basedOn w:val="Fontepargpadro"/>
+    <w:uiPriority w:val="99"/>
+    <w:semiHidden/>
+    <w:unhideWhenUsed/>
+    <w:rsid w:val="00C6124D"/>
+    <w:rPr>
+      <w:rFonts w:ascii="Courier New" w:eastAsia="Times New Roman" w:hAnsi="Courier New" w:cs="Courier New"/>
+      <w:sz w:val="20"/>
+      <w:szCs w:val="20"/>
+    </w:rPr>
+  </w:style>
 </w:styles>
 </file>
 

</xml_diff>

<commit_message>
Backup DiÃ¡rio AutomÃ¡tico: 2026-03-09 18:00:03
</commit_message>
<xml_diff>
--- a/modelos_prod/ModeloPropostaDrone.docx
+++ b/modelos_prod/ModeloPropostaDrone.docx
@@ -78,23 +78,7 @@
                 <w:rFonts w:ascii="Google Sans Text" w:eastAsia="Google Sans Text" w:hAnsi="Google Sans Text" w:cs="Google Sans Text"/>
                 <w:color w:val="1F1F1F"/>
               </w:rPr>
-              <w:t>${Cidade}, ${</w:t>
-            </w:r>
-            <w:proofErr w:type="spellStart"/>
-            <w:r>
-              <w:rPr>
-                <w:rFonts w:ascii="Google Sans Text" w:eastAsia="Google Sans Text" w:hAnsi="Google Sans Text" w:cs="Google Sans Text"/>
-                <w:color w:val="1F1F1F"/>
-              </w:rPr>
-              <w:t>DataExtenso</w:t>
-            </w:r>
-            <w:proofErr w:type="spellEnd"/>
-            <w:r>
-              <w:rPr>
-                <w:rFonts w:ascii="Google Sans Text" w:eastAsia="Google Sans Text" w:hAnsi="Google Sans Text" w:cs="Google Sans Text"/>
-                <w:color w:val="1F1F1F"/>
-              </w:rPr>
-              <w:t>}</w:t>
+              <w:t>${Cidade}, ${DataExtenso}</w:t>
             </w:r>
           </w:p>
         </w:tc>
@@ -140,25 +124,7 @@
                 <w:b/>
                 <w:bCs/>
               </w:rPr>
-              <w:t>${</w:t>
-            </w:r>
-            <w:proofErr w:type="spellStart"/>
-            <w:r>
-              <w:rPr>
-                <w:rFonts w:ascii="Google Sans Text" w:eastAsia="Google Sans Text" w:hAnsi="Google Sans Text" w:cs="Google Sans Text"/>
-                <w:b/>
-                <w:bCs/>
-              </w:rPr>
-              <w:t>numero_proposta</w:t>
-            </w:r>
-            <w:proofErr w:type="spellEnd"/>
-            <w:r>
-              <w:rPr>
-                <w:rFonts w:ascii="Google Sans Text" w:eastAsia="Google Sans Text" w:hAnsi="Google Sans Text" w:cs="Google Sans Text"/>
-                <w:b/>
-                <w:bCs/>
-              </w:rPr>
-              <w:t>}</w:t>
+              <w:t>${numero_proposta}</w:t>
             </w:r>
           </w:p>
         </w:tc>
@@ -235,7 +201,25 @@
                 <w:bCs/>
                 <w:color w:val="1F1F1F"/>
               </w:rPr>
-              <w:t>Nome:</w:t>
+              <w:t>Nome</w:t>
+            </w:r>
+            <w:r>
+              <w:rPr>
+                <w:rFonts w:ascii="Google Sans Text" w:eastAsia="Google Sans Text" w:hAnsi="Google Sans Text" w:cs="Google Sans Text"/>
+                <w:b/>
+                <w:bCs/>
+                <w:color w:val="1F1F1F"/>
+              </w:rPr>
+              <w:t>/Empresa</w:t>
+            </w:r>
+            <w:r>
+              <w:rPr>
+                <w:rFonts w:ascii="Google Sans Text" w:eastAsia="Google Sans Text" w:hAnsi="Google Sans Text" w:cs="Google Sans Text"/>
+                <w:b/>
+                <w:bCs/>
+                <w:color w:val="1F1F1F"/>
+              </w:rPr>
+              <w:t>:</w:t>
             </w:r>
             <w:r>
               <w:rPr>
@@ -260,17 +244,82 @@
                 <w:rFonts w:ascii="Google Sans Text" w:eastAsia="Google Sans Text" w:hAnsi="Google Sans Text" w:cs="Google Sans Text"/>
                 <w:color w:val="1F1F1F"/>
               </w:rPr>
-              <w:t>${</w:t>
+              <w:t>${nome_cliente_salvo}</w:t>
             </w:r>
-            <w:proofErr w:type="spellStart"/>
+          </w:p>
+        </w:tc>
+      </w:tr>
+      <w:tr>
+        <w:tc>
+          <w:tcPr>
+            <w:tcW w:w="1755" w:type="dxa"/>
+            <w:gridSpan w:val="2"/>
+            <w:vAlign w:val="center"/>
+          </w:tcPr>
+          <w:p>
+            <w:pPr>
+              <w:spacing w:after="240" w:line="275" w:lineRule="auto"/>
+              <w:rPr>
+                <w:rFonts w:ascii="Google Sans Text" w:eastAsia="Google Sans Text" w:hAnsi="Google Sans Text" w:cs="Google Sans Text"/>
+                <w:b/>
+                <w:bCs/>
+                <w:color w:val="1F1F1F"/>
+              </w:rPr>
+            </w:pPr>
+            <w:r>
+              <w:rPr>
+                <w:rFonts w:ascii="Google Sans Text" w:eastAsia="Google Sans Text" w:hAnsi="Google Sans Text" w:cs="Google Sans Text"/>
+                <w:b/>
+                <w:bCs/>
+                <w:color w:val="1F1F1F"/>
+              </w:rPr>
+              <w:t>Conrato</w:t>
+            </w:r>
+            <w:r>
+              <w:rPr>
+                <w:rFonts w:ascii="Google Sans Text" w:eastAsia="Google Sans Text" w:hAnsi="Google Sans Text" w:cs="Google Sans Text"/>
+                <w:b/>
+                <w:bCs/>
+                <w:color w:val="1F1F1F"/>
+              </w:rPr>
+              <w:t>:</w:t>
+            </w:r>
             <w:r>
               <w:rPr>
                 <w:rFonts w:ascii="Google Sans Text" w:eastAsia="Google Sans Text" w:hAnsi="Google Sans Text" w:cs="Google Sans Text"/>
                 <w:color w:val="1F1F1F"/>
               </w:rPr>
-              <w:t>nome_cliente_salvo</w:t>
+              <w:t xml:space="preserve"> </w:t>
             </w:r>
-            <w:proofErr w:type="spellEnd"/>
+          </w:p>
+        </w:tc>
+        <w:tc>
+          <w:tcPr>
+            <w:tcW w:w="6745" w:type="dxa"/>
+            <w:vAlign w:val="center"/>
+          </w:tcPr>
+          <w:p>
+            <w:pPr>
+              <w:spacing w:after="240" w:line="275" w:lineRule="auto"/>
+              <w:rPr>
+                <w:rFonts w:ascii="Google Sans Text" w:eastAsia="Google Sans Text" w:hAnsi="Google Sans Text" w:cs="Google Sans Text"/>
+                <w:color w:val="1F1F1F"/>
+              </w:rPr>
+            </w:pPr>
+            <w:r>
+              <w:rPr>
+                <w:rFonts w:ascii="Google Sans Text" w:eastAsia="Google Sans Text" w:hAnsi="Google Sans Text" w:cs="Google Sans Text"/>
+                <w:color w:val="1F1F1F"/>
+              </w:rPr>
+              <w:t>${</w:t>
+            </w:r>
+            <w:r>
+              <w:rPr>
+                <w:rFonts w:ascii="Google Sans Text" w:eastAsia="Google Sans Text" w:hAnsi="Google Sans Text" w:cs="Google Sans Text"/>
+                <w:color w:val="1F1F1F"/>
+              </w:rPr>
+              <w:t>contato</w:t>
+            </w:r>
             <w:r>
               <w:rPr>
                 <w:rFonts w:ascii="Google Sans Text" w:eastAsia="Google Sans Text" w:hAnsi="Google Sans Text" w:cs="Google Sans Text"/>
@@ -300,8 +349,13 @@
                 <w:right w:val="none" w:sz="4" w:space="0" w:color="000000"/>
                 <w:between w:val="none" w:sz="4" w:space="0" w:color="000000"/>
               </w:pBdr>
-              <w:spacing w:line="275" w:lineRule="auto"/>
-              <w:ind w:left="105"/>
+              <w:spacing w:after="240" w:line="275" w:lineRule="auto"/>
+              <w:rPr>
+                <w:rFonts w:ascii="Google Sans Text" w:eastAsia="Google Sans Text" w:hAnsi="Google Sans Text" w:cs="Google Sans Text"/>
+                <w:b/>
+                <w:bCs/>
+                <w:color w:val="1F1F1F"/>
+              </w:rPr>
             </w:pPr>
             <w:r>
               <w:rPr>
@@ -315,6 +369,8 @@
             <w:r>
               <w:rPr>
                 <w:rFonts w:ascii="Google Sans Text" w:eastAsia="Google Sans Text" w:hAnsi="Google Sans Text" w:cs="Google Sans Text"/>
+                <w:b/>
+                <w:bCs/>
                 <w:color w:val="1F1F1F"/>
               </w:rPr>
               <w:t xml:space="preserve"> </w:t>
@@ -335,31 +391,22 @@
                 <w:right w:val="none" w:sz="4" w:space="0" w:color="000000"/>
                 <w:between w:val="none" w:sz="4" w:space="0" w:color="000000"/>
               </w:pBdr>
-              <w:spacing w:line="275" w:lineRule="auto"/>
-              <w:ind w:left="105"/>
+              <w:spacing w:after="240" w:line="275" w:lineRule="auto"/>
+              <w:rPr>
+                <w:rFonts w:ascii="Google Sans Text" w:eastAsia="Google Sans Text" w:hAnsi="Google Sans Text" w:cs="Google Sans Text"/>
+                <w:b/>
+                <w:bCs/>
+                <w:color w:val="1F1F1F"/>
+              </w:rPr>
             </w:pPr>
             <w:r>
               <w:rPr>
                 <w:rFonts w:ascii="Google Sans Text" w:eastAsia="Google Sans Text" w:hAnsi="Google Sans Text" w:cs="Google Sans Text"/>
+                <w:b/>
+                <w:bCs/>
                 <w:color w:val="1F1F1F"/>
               </w:rPr>
-              <w:t>${</w:t>
-            </w:r>
-            <w:proofErr w:type="spellStart"/>
-            <w:r>
-              <w:rPr>
-                <w:rFonts w:ascii="Google Sans Text" w:eastAsia="Google Sans Text" w:hAnsi="Google Sans Text" w:cs="Google Sans Text"/>
-                <w:color w:val="1F1F1F"/>
-              </w:rPr>
-              <w:t>email_salvo</w:t>
-            </w:r>
-            <w:proofErr w:type="spellEnd"/>
-            <w:r>
-              <w:rPr>
-                <w:rFonts w:ascii="Google Sans Text" w:eastAsia="Google Sans Text" w:hAnsi="Google Sans Text" w:cs="Google Sans Text"/>
-                <w:color w:val="1F1F1F"/>
-              </w:rPr>
-              <w:t>}</w:t>
+              <w:t>${email_salvo}</w:t>
             </w:r>
           </w:p>
         </w:tc>
@@ -414,23 +461,7 @@
                 <w:rFonts w:ascii="Google Sans Text" w:eastAsia="Google Sans Text" w:hAnsi="Google Sans Text" w:cs="Google Sans Text"/>
                 <w:color w:val="1F1F1F"/>
               </w:rPr>
-              <w:t>${</w:t>
-            </w:r>
-            <w:proofErr w:type="spellStart"/>
-            <w:r>
-              <w:rPr>
-                <w:rFonts w:ascii="Google Sans Text" w:eastAsia="Google Sans Text" w:hAnsi="Google Sans Text" w:cs="Google Sans Text"/>
-                <w:color w:val="1F1F1F"/>
-              </w:rPr>
-              <w:t>telefone_salvo</w:t>
-            </w:r>
-            <w:proofErr w:type="spellEnd"/>
-            <w:r>
-              <w:rPr>
-                <w:rFonts w:ascii="Google Sans Text" w:eastAsia="Google Sans Text" w:hAnsi="Google Sans Text" w:cs="Google Sans Text"/>
-                <w:color w:val="1F1F1F"/>
-              </w:rPr>
-              <w:t>}</w:t>
+              <w:t>${telefone_salvo}</w:t>
             </w:r>
           </w:p>
         </w:tc>
@@ -479,23 +510,7 @@
                 <w:rFonts w:ascii="Google Sans Text" w:eastAsia="Google Sans Text" w:hAnsi="Google Sans Text" w:cs="Google Sans Text"/>
                 <w:color w:val="1F1F1F"/>
               </w:rPr>
-              <w:t>${</w:t>
-            </w:r>
-            <w:proofErr w:type="spellStart"/>
-            <w:r>
-              <w:rPr>
-                <w:rFonts w:ascii="Google Sans Text" w:eastAsia="Google Sans Text" w:hAnsi="Google Sans Text" w:cs="Google Sans Text"/>
-                <w:color w:val="1F1F1F"/>
-              </w:rPr>
-              <w:t>celular_salvo</w:t>
-            </w:r>
-            <w:proofErr w:type="spellEnd"/>
-            <w:r>
-              <w:rPr>
-                <w:rFonts w:ascii="Google Sans Text" w:eastAsia="Google Sans Text" w:hAnsi="Google Sans Text" w:cs="Google Sans Text"/>
-                <w:color w:val="1F1F1F"/>
-              </w:rPr>
-              <w:t>}</w:t>
+              <w:t>${celular_salvo}</w:t>
             </w:r>
           </w:p>
         </w:tc>
@@ -552,23 +567,7 @@
                 <w:rFonts w:ascii="Google Sans Text" w:eastAsia="Google Sans Text" w:hAnsi="Google Sans Text" w:cs="Google Sans Text"/>
                 <w:color w:val="1F1F1F"/>
               </w:rPr>
-              <w:t>${</w:t>
-            </w:r>
-            <w:proofErr w:type="spellStart"/>
-            <w:r>
-              <w:rPr>
-                <w:rFonts w:ascii="Google Sans Text" w:eastAsia="Google Sans Text" w:hAnsi="Google Sans Text" w:cs="Google Sans Text"/>
-                <w:color w:val="1F1F1F"/>
-              </w:rPr>
-              <w:t>whatsapp_salvo</w:t>
-            </w:r>
-            <w:proofErr w:type="spellEnd"/>
-            <w:r>
-              <w:rPr>
-                <w:rFonts w:ascii="Google Sans Text" w:eastAsia="Google Sans Text" w:hAnsi="Google Sans Text" w:cs="Google Sans Text"/>
-                <w:color w:val="1F1F1F"/>
-              </w:rPr>
-              <w:t>}</w:t>
+              <w:t>${whatsapp_salvo}</w:t>
             </w:r>
           </w:p>
         </w:tc>
@@ -666,89 +665,7 @@
                 <w:rFonts w:ascii="Google Sans Text" w:eastAsia="Google Sans Text" w:hAnsi="Google Sans Text" w:cs="Google Sans Text"/>
                 <w:color w:val="1F1F1F"/>
               </w:rPr>
-              <w:t>${</w:t>
-            </w:r>
-            <w:proofErr w:type="spellStart"/>
-            <w:r>
-              <w:rPr>
-                <w:rFonts w:ascii="Google Sans Text" w:eastAsia="Google Sans Text" w:hAnsi="Google Sans Text" w:cs="Google Sans Text"/>
-                <w:color w:val="1F1F1F"/>
-              </w:rPr>
-              <w:t>endereco_obra</w:t>
-            </w:r>
-            <w:proofErr w:type="spellEnd"/>
-            <w:r>
-              <w:rPr>
-                <w:rFonts w:ascii="Google Sans Text" w:eastAsia="Google Sans Text" w:hAnsi="Google Sans Text" w:cs="Google Sans Text"/>
-                <w:color w:val="1F1F1F"/>
-              </w:rPr>
-              <w:t>}</w:t>
-            </w:r>
-          </w:p>
-        </w:tc>
-      </w:tr>
-      <w:tr>
-        <w:tc>
-          <w:tcPr>
-            <w:tcW w:w="1980" w:type="dxa"/>
-          </w:tcPr>
-          <w:p>
-            <w:pPr>
-              <w:pBdr>
-                <w:top w:val="none" w:sz="4" w:space="0" w:color="000000"/>
-                <w:left w:val="none" w:sz="4" w:space="0" w:color="000000"/>
-                <w:bottom w:val="none" w:sz="4" w:space="0" w:color="000000"/>
-                <w:right w:val="none" w:sz="4" w:space="0" w:color="000000"/>
-                <w:between w:val="none" w:sz="4" w:space="0" w:color="000000"/>
-              </w:pBdr>
-              <w:spacing w:line="275" w:lineRule="auto"/>
-              <w:ind w:left="105"/>
-            </w:pPr>
-            <w:r>
-              <w:rPr>
-                <w:rFonts w:ascii="Google Sans Text" w:eastAsia="Google Sans Text" w:hAnsi="Google Sans Text" w:cs="Google Sans Text"/>
-                <w:b/>
-                <w:bCs/>
-                <w:color w:val="1F1F1F"/>
-              </w:rPr>
-              <w:t>Endereço:</w:t>
-            </w:r>
-            <w:r>
-              <w:rPr>
-                <w:rFonts w:ascii="Google Sans Text" w:eastAsia="Google Sans Text" w:hAnsi="Google Sans Text" w:cs="Google Sans Text"/>
-                <w:color w:val="1F1F1F"/>
-              </w:rPr>
-              <w:t xml:space="preserve"> </w:t>
-            </w:r>
-          </w:p>
-        </w:tc>
-        <w:tc>
-          <w:tcPr>
-            <w:tcW w:w="8090" w:type="dxa"/>
-          </w:tcPr>
-          <w:p>
-            <w:r>
-              <w:rPr>
-                <w:rFonts w:ascii="Google Sans Text" w:eastAsia="Google Sans Text" w:hAnsi="Google Sans Text" w:cs="Google Sans Text"/>
-                <w:color w:val="1F1F1F"/>
-              </w:rPr>
-              <w:t>${</w:t>
-            </w:r>
-            <w:proofErr w:type="spellStart"/>
-            <w:r>
-              <w:rPr>
-                <w:rFonts w:ascii="Google Sans Text" w:eastAsia="Google Sans Text" w:hAnsi="Google Sans Text" w:cs="Google Sans Text"/>
-                <w:color w:val="1F1F1F"/>
-              </w:rPr>
-              <w:t>endereco_obra</w:t>
-            </w:r>
-            <w:proofErr w:type="spellEnd"/>
-            <w:r>
-              <w:rPr>
-                <w:rFonts w:ascii="Google Sans Text" w:eastAsia="Google Sans Text" w:hAnsi="Google Sans Text" w:cs="Google Sans Text"/>
-                <w:color w:val="1F1F1F"/>
-              </w:rPr>
-              <w:t>}</w:t>
+              <w:t>${endereco_obra}</w:t>
             </w:r>
           </w:p>
         </w:tc>
@@ -798,23 +715,7 @@
                 <w:rFonts w:ascii="Google Sans Text" w:eastAsia="Google Sans Text" w:hAnsi="Google Sans Text" w:cs="Google Sans Text"/>
                 <w:color w:val="1F1F1F"/>
               </w:rPr>
-              <w:t>${</w:t>
-            </w:r>
-            <w:proofErr w:type="spellStart"/>
-            <w:r>
-              <w:rPr>
-                <w:rFonts w:ascii="Google Sans Text" w:eastAsia="Google Sans Text" w:hAnsi="Google Sans Text" w:cs="Google Sans Text"/>
-                <w:color w:val="1F1F1F"/>
-              </w:rPr>
-              <w:t>bairro_obra</w:t>
-            </w:r>
-            <w:proofErr w:type="spellEnd"/>
-            <w:r>
-              <w:rPr>
-                <w:rFonts w:ascii="Google Sans Text" w:eastAsia="Google Sans Text" w:hAnsi="Google Sans Text" w:cs="Google Sans Text"/>
-                <w:color w:val="1F1F1F"/>
-              </w:rPr>
-              <w:t>}</w:t>
+              <w:t>${bairro_obra}</w:t>
             </w:r>
           </w:p>
         </w:tc>
@@ -864,39 +765,7 @@
                 <w:rFonts w:ascii="Google Sans Text" w:eastAsia="Google Sans Text" w:hAnsi="Google Sans Text" w:cs="Google Sans Text"/>
                 <w:color w:val="1F1F1F"/>
               </w:rPr>
-              <w:t>${</w:t>
-            </w:r>
-            <w:proofErr w:type="spellStart"/>
-            <w:r>
-              <w:rPr>
-                <w:rFonts w:ascii="Google Sans Text" w:eastAsia="Google Sans Text" w:hAnsi="Google Sans Text" w:cs="Google Sans Text"/>
-                <w:color w:val="1F1F1F"/>
-              </w:rPr>
-              <w:t>cidade_obra</w:t>
-            </w:r>
-            <w:proofErr w:type="spellEnd"/>
-            <w:r>
-              <w:rPr>
-                <w:rFonts w:ascii="Google Sans Text" w:eastAsia="Google Sans Text" w:hAnsi="Google Sans Text" w:cs="Google Sans Text"/>
-                <w:color w:val="1F1F1F"/>
-              </w:rPr>
-              <w:t>} - ${</w:t>
-            </w:r>
-            <w:proofErr w:type="spellStart"/>
-            <w:r>
-              <w:rPr>
-                <w:rFonts w:ascii="Google Sans Text" w:eastAsia="Google Sans Text" w:hAnsi="Google Sans Text" w:cs="Google Sans Text"/>
-                <w:color w:val="1F1F1F"/>
-              </w:rPr>
-              <w:t>estado_obra</w:t>
-            </w:r>
-            <w:proofErr w:type="spellEnd"/>
-            <w:r>
-              <w:rPr>
-                <w:rFonts w:ascii="Google Sans Text" w:eastAsia="Google Sans Text" w:hAnsi="Google Sans Text" w:cs="Google Sans Text"/>
-                <w:color w:val="1F1F1F"/>
-              </w:rPr>
-              <w:t>}</w:t>
+              <w:t>${cidade_obra} - ${estado_obra}</w:t>
             </w:r>
           </w:p>
         </w:tc>
@@ -946,23 +815,7 @@
                 <w:rFonts w:ascii="Google Sans Text" w:eastAsia="Google Sans Text" w:hAnsi="Google Sans Text" w:cs="Google Sans Text"/>
                 <w:color w:val="1F1F1F"/>
               </w:rPr>
-              <w:t>${</w:t>
-            </w:r>
-            <w:proofErr w:type="spellStart"/>
-            <w:r>
-              <w:rPr>
-                <w:rFonts w:ascii="Google Sans Text" w:eastAsia="Google Sans Text" w:hAnsi="Google Sans Text" w:cs="Google Sans Text"/>
-                <w:color w:val="1F1F1F"/>
-              </w:rPr>
-              <w:t>AreaEstimada</w:t>
-            </w:r>
-            <w:proofErr w:type="spellEnd"/>
-            <w:r>
-              <w:rPr>
-                <w:rFonts w:ascii="Google Sans Text" w:eastAsia="Google Sans Text" w:hAnsi="Google Sans Text" w:cs="Google Sans Text"/>
-                <w:color w:val="1F1F1F"/>
-              </w:rPr>
-              <w:t>}</w:t>
+              <w:t>${AreaEstimada}</w:t>
             </w:r>
           </w:p>
         </w:tc>
@@ -1034,27 +887,7 @@
           <w:bCs/>
           <w:color w:val="1F1F1F"/>
         </w:rPr>
-        <w:t>Aerofotogrametria com Drones (</w:t>
-      </w:r>
-      <w:proofErr w:type="spellStart"/>
-      <w:r>
-        <w:rPr>
-          <w:rFonts w:ascii="Google Sans Text" w:eastAsia="Google Sans Text" w:hAnsi="Google Sans Text" w:cs="Google Sans Text"/>
-          <w:b/>
-          <w:bCs/>
-          <w:color w:val="1F1F1F"/>
-        </w:rPr>
-        <w:t>VANTs</w:t>
-      </w:r>
-      <w:proofErr w:type="spellEnd"/>
-      <w:r>
-        <w:rPr>
-          <w:rFonts w:ascii="Google Sans Text" w:eastAsia="Google Sans Text" w:hAnsi="Google Sans Text" w:cs="Google Sans Text"/>
-          <w:b/>
-          <w:bCs/>
-          <w:color w:val="1F1F1F"/>
-        </w:rPr>
-        <w:t>)</w:t>
+        <w:t>Aerofotogrametria com Drones (VANTs)</w:t>
       </w:r>
       <w:r>
         <w:rPr>
@@ -1115,6 +948,7 @@
           <w:iCs/>
           <w:color w:val="1F1F1F"/>
         </w:rPr>
+        <w:lastRenderedPageBreak/>
         <w:t>${finalidade}</w:t>
       </w:r>
     </w:p>
@@ -1132,7 +966,6 @@
           <w:rFonts w:ascii="Google Sans" w:eastAsia="Google Sans" w:hAnsi="Google Sans" w:cs="Google Sans"/>
           <w:color w:val="1F1F1F"/>
         </w:rPr>
-        <w:lastRenderedPageBreak/>
         <w:t>3. Escopo do Serviço</w:t>
       </w:r>
     </w:p>
@@ -1179,107 +1012,7 @@
           <w:sz w:val="24"/>
           <w:szCs w:val="24"/>
         </w:rPr>
-        <w:t>Execução de levantamento na área de ${</w:t>
-      </w:r>
-      <w:proofErr w:type="spellStart"/>
-      <w:r>
-        <w:rPr>
-          <w:rFonts w:ascii="Times New Roman" w:eastAsia="Times New Roman" w:hAnsi="Times New Roman" w:cs="Times New Roman"/>
-          <w:i/>
-          <w:iCs/>
-          <w:sz w:val="24"/>
-          <w:szCs w:val="24"/>
-        </w:rPr>
-        <w:t>AreaEstimada</w:t>
-      </w:r>
-      <w:proofErr w:type="spellEnd"/>
-      <w:r>
-        <w:rPr>
-          <w:rFonts w:ascii="Times New Roman" w:eastAsia="Times New Roman" w:hAnsi="Times New Roman" w:cs="Times New Roman"/>
-          <w:i/>
-          <w:iCs/>
-          <w:sz w:val="24"/>
-          <w:szCs w:val="24"/>
-        </w:rPr>
-        <w:t>} ${</w:t>
-      </w:r>
-      <w:proofErr w:type="spellStart"/>
-      <w:r>
-        <w:rPr>
-          <w:rFonts w:ascii="Times New Roman" w:eastAsia="Times New Roman" w:hAnsi="Times New Roman" w:cs="Times New Roman"/>
-          <w:i/>
-          <w:iCs/>
-          <w:sz w:val="24"/>
-          <w:szCs w:val="24"/>
-        </w:rPr>
-        <w:t>unidade_area</w:t>
-      </w:r>
-      <w:proofErr w:type="spellEnd"/>
-      <w:r>
-        <w:rPr>
-          <w:rFonts w:ascii="Times New Roman" w:eastAsia="Times New Roman" w:hAnsi="Times New Roman" w:cs="Times New Roman"/>
-          <w:i/>
-          <w:iCs/>
-          <w:sz w:val="24"/>
-          <w:szCs w:val="24"/>
-        </w:rPr>
-        <w:t>}, localizada em ${</w:t>
-      </w:r>
-      <w:proofErr w:type="spellStart"/>
-      <w:r>
-        <w:rPr>
-          <w:rFonts w:ascii="Times New Roman" w:eastAsia="Times New Roman" w:hAnsi="Times New Roman" w:cs="Times New Roman"/>
-          <w:i/>
-          <w:iCs/>
-          <w:sz w:val="24"/>
-          <w:szCs w:val="24"/>
-        </w:rPr>
-        <w:t>cidade_obra</w:t>
-      </w:r>
-      <w:proofErr w:type="spellEnd"/>
-      <w:r>
-        <w:rPr>
-          <w:rFonts w:ascii="Times New Roman" w:eastAsia="Times New Roman" w:hAnsi="Times New Roman" w:cs="Times New Roman"/>
-          <w:i/>
-          <w:iCs/>
-          <w:sz w:val="24"/>
-          <w:szCs w:val="24"/>
-        </w:rPr>
-        <w:t>} -${</w:t>
-      </w:r>
-      <w:proofErr w:type="spellStart"/>
-      <w:r>
-        <w:rPr>
-          <w:rFonts w:ascii="Times New Roman" w:eastAsia="Times New Roman" w:hAnsi="Times New Roman" w:cs="Times New Roman"/>
-          <w:i/>
-          <w:iCs/>
-          <w:sz w:val="24"/>
-          <w:szCs w:val="24"/>
-        </w:rPr>
-        <w:t>estado_obra</w:t>
-      </w:r>
-      <w:proofErr w:type="spellEnd"/>
-      <w:proofErr w:type="gramStart"/>
-      <w:r>
-        <w:rPr>
-          <w:rFonts w:ascii="Times New Roman" w:eastAsia="Times New Roman" w:hAnsi="Times New Roman" w:cs="Times New Roman"/>
-          <w:i/>
-          <w:iCs/>
-          <w:sz w:val="24"/>
-          <w:szCs w:val="24"/>
-        </w:rPr>
-        <w:t>} ,</w:t>
-      </w:r>
-      <w:proofErr w:type="gramEnd"/>
-      <w:r>
-        <w:rPr>
-          <w:rFonts w:ascii="Times New Roman" w:eastAsia="Times New Roman" w:hAnsi="Times New Roman" w:cs="Times New Roman"/>
-          <w:i/>
-          <w:iCs/>
-          <w:sz w:val="24"/>
-          <w:szCs w:val="24"/>
-        </w:rPr>
-        <w:t xml:space="preserve"> com as seguintes características:</w:t>
+        <w:t>Execução de levantamento na área de ${AreaEstimada} ${unidade_area}, localizada em ${cidade_obra} -${estado_obra} , com as seguintes características:</w:t>
       </w:r>
     </w:p>
     <w:tbl>
@@ -1354,25 +1087,7 @@
                 <w:sz w:val="24"/>
                 <w:szCs w:val="24"/>
               </w:rPr>
-              <w:t>${</w:t>
-            </w:r>
-            <w:proofErr w:type="spellStart"/>
-            <w:r>
-              <w:rPr>
-                <w:rFonts w:ascii="Times New Roman" w:eastAsia="Times New Roman" w:hAnsi="Times New Roman" w:cs="Times New Roman"/>
-                <w:sz w:val="24"/>
-                <w:szCs w:val="24"/>
-              </w:rPr>
-              <w:t>TipoTerreno</w:t>
-            </w:r>
-            <w:proofErr w:type="spellEnd"/>
-            <w:r>
-              <w:rPr>
-                <w:rFonts w:ascii="Times New Roman" w:eastAsia="Times New Roman" w:hAnsi="Times New Roman" w:cs="Times New Roman"/>
-                <w:sz w:val="24"/>
-                <w:szCs w:val="24"/>
-              </w:rPr>
-              <w:t>};</w:t>
+              <w:t>${TipoTerreno};</w:t>
             </w:r>
           </w:p>
         </w:tc>
@@ -1439,25 +1154,7 @@
                 <w:sz w:val="24"/>
                 <w:szCs w:val="24"/>
               </w:rPr>
-              <w:t>${</w:t>
-            </w:r>
-            <w:proofErr w:type="spellStart"/>
-            <w:r>
-              <w:rPr>
-                <w:rFonts w:ascii="Times New Roman" w:eastAsia="Times New Roman" w:hAnsi="Times New Roman" w:cs="Times New Roman"/>
-                <w:sz w:val="24"/>
-                <w:szCs w:val="24"/>
-              </w:rPr>
-              <w:t>CoberturaVegetal</w:t>
-            </w:r>
-            <w:proofErr w:type="spellEnd"/>
-            <w:r>
-              <w:rPr>
-                <w:rFonts w:ascii="Times New Roman" w:eastAsia="Times New Roman" w:hAnsi="Times New Roman" w:cs="Times New Roman"/>
-                <w:sz w:val="24"/>
-                <w:szCs w:val="24"/>
-              </w:rPr>
-              <w:t>};</w:t>
+              <w:t>${CoberturaVegetal};</w:t>
             </w:r>
           </w:p>
         </w:tc>
@@ -1524,25 +1221,7 @@
                 <w:sz w:val="24"/>
                 <w:szCs w:val="24"/>
               </w:rPr>
-              <w:t>${</w:t>
-            </w:r>
-            <w:proofErr w:type="spellStart"/>
-            <w:r>
-              <w:rPr>
-                <w:rFonts w:ascii="Times New Roman" w:eastAsia="Times New Roman" w:hAnsi="Times New Roman" w:cs="Times New Roman"/>
-                <w:sz w:val="24"/>
-                <w:szCs w:val="24"/>
-              </w:rPr>
-              <w:t>AcessoLocal</w:t>
-            </w:r>
-            <w:proofErr w:type="spellEnd"/>
-            <w:r>
-              <w:rPr>
-                <w:rFonts w:ascii="Times New Roman" w:eastAsia="Times New Roman" w:hAnsi="Times New Roman" w:cs="Times New Roman"/>
-                <w:sz w:val="24"/>
-                <w:szCs w:val="24"/>
-              </w:rPr>
-              <w:t>};</w:t>
+              <w:t>${AcessoLocal};</w:t>
             </w:r>
           </w:p>
         </w:tc>
@@ -1609,25 +1288,7 @@
                 <w:sz w:val="24"/>
                 <w:szCs w:val="24"/>
               </w:rPr>
-              <w:t>${</w:t>
-            </w:r>
-            <w:proofErr w:type="spellStart"/>
-            <w:r>
-              <w:rPr>
-                <w:rFonts w:ascii="Times New Roman" w:eastAsia="Times New Roman" w:hAnsi="Times New Roman" w:cs="Times New Roman"/>
-                <w:sz w:val="24"/>
-                <w:szCs w:val="24"/>
-              </w:rPr>
-              <w:t>RestricoesAereas</w:t>
-            </w:r>
-            <w:proofErr w:type="spellEnd"/>
-            <w:r>
-              <w:rPr>
-                <w:rFonts w:ascii="Times New Roman" w:eastAsia="Times New Roman" w:hAnsi="Times New Roman" w:cs="Times New Roman"/>
-                <w:sz w:val="24"/>
-                <w:szCs w:val="24"/>
-              </w:rPr>
-              <w:t>}.</w:t>
+              <w:t>${RestricoesAereas}.</w:t>
             </w:r>
           </w:p>
         </w:tc>
@@ -1693,43 +1354,7 @@
                 <w:sz w:val="24"/>
                 <w:szCs w:val="24"/>
               </w:rPr>
-              <w:t>Planejamento de voo e estudo de viabilidade aérea (consulta DECEA para ${</w:t>
-            </w:r>
-            <w:proofErr w:type="spellStart"/>
-            <w:r>
-              <w:rPr>
-                <w:rFonts w:ascii="Times New Roman" w:eastAsia="Times New Roman" w:hAnsi="Times New Roman" w:cs="Times New Roman"/>
-                <w:sz w:val="24"/>
-                <w:szCs w:val="24"/>
-              </w:rPr>
-              <w:t>cidade_obra</w:t>
-            </w:r>
-            <w:proofErr w:type="spellEnd"/>
-            <w:r>
-              <w:rPr>
-                <w:rFonts w:ascii="Times New Roman" w:eastAsia="Times New Roman" w:hAnsi="Times New Roman" w:cs="Times New Roman"/>
-                <w:sz w:val="24"/>
-                <w:szCs w:val="24"/>
-              </w:rPr>
-              <w:t>} -${</w:t>
-            </w:r>
-            <w:proofErr w:type="spellStart"/>
-            <w:r>
-              <w:rPr>
-                <w:rFonts w:ascii="Times New Roman" w:eastAsia="Times New Roman" w:hAnsi="Times New Roman" w:cs="Times New Roman"/>
-                <w:sz w:val="24"/>
-                <w:szCs w:val="24"/>
-              </w:rPr>
-              <w:t>estado_obra</w:t>
-            </w:r>
-            <w:proofErr w:type="spellEnd"/>
-            <w:r>
-              <w:rPr>
-                <w:rFonts w:ascii="Times New Roman" w:eastAsia="Times New Roman" w:hAnsi="Times New Roman" w:cs="Times New Roman"/>
-                <w:sz w:val="24"/>
-                <w:szCs w:val="24"/>
-              </w:rPr>
-              <w:t>}</w:t>
+              <w:t>Planejamento de voo e estudo de viabilidade aérea (consulta DECEA para ${cidade_obra} -${estado_obra}</w:t>
             </w:r>
           </w:p>
         </w:tc>
@@ -1761,25 +1386,7 @@
                 <w:sz w:val="24"/>
                 <w:szCs w:val="24"/>
               </w:rPr>
-              <w:t>Implantação de Pontos de Controle Terrestre (</w:t>
-            </w:r>
-            <w:proofErr w:type="spellStart"/>
-            <w:r>
-              <w:rPr>
-                <w:rFonts w:ascii="Times New Roman" w:eastAsia="Times New Roman" w:hAnsi="Times New Roman" w:cs="Times New Roman"/>
-                <w:sz w:val="24"/>
-                <w:szCs w:val="24"/>
-              </w:rPr>
-              <w:t>GCPs</w:t>
-            </w:r>
-            <w:proofErr w:type="spellEnd"/>
-            <w:r>
-              <w:rPr>
-                <w:rFonts w:ascii="Times New Roman" w:eastAsia="Times New Roman" w:hAnsi="Times New Roman" w:cs="Times New Roman"/>
-                <w:sz w:val="24"/>
-                <w:szCs w:val="24"/>
-              </w:rPr>
-              <w:t>) com GPS RTK;</w:t>
+              <w:t>Implantação de Pontos de Controle Terrestre (GCPs) com GPS RTK;</w:t>
             </w:r>
           </w:p>
         </w:tc>
@@ -2131,23 +1738,7 @@
           <w:rFonts w:ascii="Google Sans Text" w:eastAsia="Google Sans Text" w:hAnsi="Google Sans Text" w:cs="Google Sans Text"/>
           <w:color w:val="1F1F1F"/>
         </w:rPr>
-        <w:t xml:space="preserve"> Configuração de sobreposição (</w:t>
-      </w:r>
-      <w:proofErr w:type="spellStart"/>
-      <w:r>
-        <w:rPr>
-          <w:rFonts w:ascii="Google Sans Text" w:eastAsia="Google Sans Text" w:hAnsi="Google Sans Text" w:cs="Google Sans Text"/>
-          <w:color w:val="1F1F1F"/>
-        </w:rPr>
-        <w:t>overlap</w:t>
-      </w:r>
-      <w:proofErr w:type="spellEnd"/>
-      <w:r>
-        <w:rPr>
-          <w:rFonts w:ascii="Google Sans Text" w:eastAsia="Google Sans Text" w:hAnsi="Google Sans Text" w:cs="Google Sans Text"/>
-          <w:color w:val="1F1F1F"/>
-        </w:rPr>
-        <w:t>) frontal e lateral (geralmente 75/80%) para garantir a estereoscopia (visão 3D) no processamento.</w:t>
+        <w:t xml:space="preserve"> Configuração de sobreposição (overlap) frontal e lateral (geralmente 75/80%) para garantir a estereoscopia (visão 3D) no processamento.</w:t>
       </w:r>
     </w:p>
     <w:p>
@@ -2185,7 +1776,17 @@
           <w:bCs w:val="0"/>
           <w:color w:val="1F1F1F"/>
         </w:rPr>
-        <w:t>Pontos de Controle (Campo) Esta é a etapa que diferencia uma foto comum de um mapa topográfico.</w:t>
+        <w:t xml:space="preserve">Pontos de Controle (Campo) Esta é a etapa que diferencia </w:t>
+      </w:r>
+      <w:r>
+        <w:rPr>
+          <w:rFonts w:ascii="Google Sans" w:eastAsia="Google Sans" w:hAnsi="Google Sans" w:cs="Google Sans"/>
+          <w:b w:val="0"/>
+          <w:bCs w:val="0"/>
+          <w:color w:val="1F1F1F"/>
+        </w:rPr>
+        <w:lastRenderedPageBreak/>
+        <w:t>uma foto comum de um mapa topográfico.</w:t>
       </w:r>
     </w:p>
     <w:p>
@@ -2217,15 +1818,7 @@
           <w:rFonts w:ascii="Google Sans Text" w:eastAsia="Google Sans Text" w:hAnsi="Google Sans Text" w:cs="Google Sans Text"/>
           <w:color w:val="1F1F1F"/>
         </w:rPr>
-        <w:t xml:space="preserve"> Antes do drone decolar, nossa equipe distribui e pinta alvos no chão ou utiliza marcos </w:t>
-      </w:r>
-      <w:r>
-        <w:rPr>
-          <w:rFonts w:ascii="Google Sans Text" w:eastAsia="Google Sans Text" w:hAnsi="Google Sans Text" w:cs="Google Sans Text"/>
-          <w:color w:val="1F1F1F"/>
-        </w:rPr>
-        <w:lastRenderedPageBreak/>
-        <w:t xml:space="preserve">naturais. As coordenadas exatas do centro desses alvos são coletadas com </w:t>
+        <w:t xml:space="preserve"> Antes do drone decolar, nossa equipe distribui e pinta alvos no chão ou utiliza marcos naturais. As coordenadas exatas do centro desses alvos são coletadas com </w:t>
       </w:r>
       <w:r>
         <w:rPr>
@@ -2431,23 +2024,7 @@
           <w:rFonts w:ascii="Google Sans Text" w:eastAsia="Google Sans Text" w:hAnsi="Google Sans Text" w:cs="Google Sans Text"/>
           <w:color w:val="1F1F1F"/>
         </w:rPr>
-        <w:t xml:space="preserve"> Coleta de imagens brutas (</w:t>
-      </w:r>
-      <w:proofErr w:type="spellStart"/>
-      <w:r>
-        <w:rPr>
-          <w:rFonts w:ascii="Google Sans Text" w:eastAsia="Google Sans Text" w:hAnsi="Google Sans Text" w:cs="Google Sans Text"/>
-          <w:color w:val="1F1F1F"/>
-        </w:rPr>
-        <w:t>Raw</w:t>
-      </w:r>
-      <w:proofErr w:type="spellEnd"/>
-      <w:r>
-        <w:rPr>
-          <w:rFonts w:ascii="Google Sans Text" w:eastAsia="Google Sans Text" w:hAnsi="Google Sans Text" w:cs="Google Sans Text"/>
-          <w:color w:val="1F1F1F"/>
-        </w:rPr>
-        <w:t xml:space="preserve"> Data) que, isoladamente, não possuem escala, mas que juntas formarão o mapa.</w:t>
+        <w:t xml:space="preserve"> Coleta de imagens brutas (Raw Data) que, isoladamente, não possuem escala, mas que juntas formarão o mapa.</w:t>
       </w:r>
     </w:p>
     <w:p>
@@ -2866,6 +2443,7 @@
                 <w:bCs/>
                 <w:color w:val="1F1F1F"/>
               </w:rPr>
+              <w:lastRenderedPageBreak/>
               <w:t>GPS - Geodésia:</w:t>
             </w:r>
           </w:p>
@@ -2944,32 +2522,7 @@
                 <w:rFonts w:ascii="Google Sans Text" w:eastAsia="Google Sans Text" w:hAnsi="Google Sans Text" w:cs="Google Sans Text"/>
                 <w:color w:val="1F1F1F"/>
               </w:rPr>
-              <w:t>${</w:t>
-            </w:r>
-            <w:proofErr w:type="spellStart"/>
-            <w:r>
-              <w:rPr>
-                <w:rFonts w:ascii="Google Sans Text" w:eastAsia="Google Sans Text" w:hAnsi="Google Sans Text" w:cs="Google Sans Text"/>
-                <w:color w:val="1F1F1F"/>
-              </w:rPr>
-              <w:t>Estacao</w:t>
-            </w:r>
-            <w:proofErr w:type="gramStart"/>
-            <w:r>
-              <w:rPr>
-                <w:rFonts w:ascii="Google Sans Text" w:eastAsia="Google Sans Text" w:hAnsi="Google Sans Text" w:cs="Google Sans Text"/>
-                <w:color w:val="1F1F1F"/>
-              </w:rPr>
-              <w:t>_Total</w:t>
-            </w:r>
-            <w:proofErr w:type="spellEnd"/>
-            <w:proofErr w:type="gramEnd"/>
-            <w:r>
-              <w:rPr>
-                <w:rFonts w:ascii="Google Sans Text" w:eastAsia="Google Sans Text" w:hAnsi="Google Sans Text" w:cs="Google Sans Text"/>
-                <w:color w:val="1F1F1F"/>
-              </w:rPr>
-              <w:t>} (Se necessário para áreas de sombra de GPS).</w:t>
+              <w:t>${Estacao_Total} (Se necessário para áreas de sombra de GPS).</w:t>
             </w:r>
           </w:p>
         </w:tc>
@@ -2995,7 +2548,6 @@
                 <w:bCs/>
                 <w:color w:val="1F1F1F"/>
               </w:rPr>
-              <w:lastRenderedPageBreak/>
               <w:t>Processamento:</w:t>
             </w:r>
           </w:p>
@@ -3319,23 +2871,7 @@
                 <w:rFonts w:ascii="Google Sans Text" w:eastAsia="Google Sans Text" w:hAnsi="Google Sans Text" w:cs="Google Sans Text"/>
                 <w:color w:val="1F1F1F"/>
               </w:rPr>
-              <w:t>Arquivo pronto para abertura em AutoCAD, contendo a topografia do terreno com equidistância definida (</w:t>
-            </w:r>
-            <w:proofErr w:type="spellStart"/>
-            <w:r>
-              <w:rPr>
-                <w:rFonts w:ascii="Google Sans Text" w:eastAsia="Google Sans Text" w:hAnsi="Google Sans Text" w:cs="Google Sans Text"/>
-                <w:color w:val="1F1F1F"/>
-              </w:rPr>
-              <w:t>ex</w:t>
-            </w:r>
-            <w:proofErr w:type="spellEnd"/>
-            <w:r>
-              <w:rPr>
-                <w:rFonts w:ascii="Google Sans Text" w:eastAsia="Google Sans Text" w:hAnsi="Google Sans Text" w:cs="Google Sans Text"/>
-                <w:color w:val="1F1F1F"/>
-              </w:rPr>
-              <w:t>: 1 em 1 metro).</w:t>
+              <w:t>Arquivo pronto para abertura em AutoCAD, contendo a topografia do terreno com equidistância definida (ex: 1 em 1 metro).</w:t>
             </w:r>
           </w:p>
         </w:tc>
@@ -3809,7 +3345,15 @@
                 <w:rFonts w:ascii="Google Sans Text" w:eastAsia="Google Sans Text" w:hAnsi="Google Sans Text" w:cs="Google Sans Text"/>
                 <w:color w:val="1F1F1F"/>
               </w:rPr>
-              <w:t>Planejamento e ida a campo</w:t>
+              <w:t xml:space="preserve">Planejamento e ida a </w:t>
+            </w:r>
+            <w:r>
+              <w:rPr>
+                <w:rFonts w:ascii="Google Sans Text" w:eastAsia="Google Sans Text" w:hAnsi="Google Sans Text" w:cs="Google Sans Text"/>
+                <w:color w:val="1F1F1F"/>
+              </w:rPr>
+              <w:lastRenderedPageBreak/>
+              <w:t>campo</w:t>
             </w:r>
           </w:p>
         </w:tc>
@@ -3850,6 +3394,7 @@
                 <w:rFonts w:ascii="Google Sans Text" w:eastAsia="Google Sans Text" w:hAnsi="Google Sans Text" w:cs="Google Sans Text"/>
                 <w:color w:val="1F1F1F"/>
               </w:rPr>
+              <w:lastRenderedPageBreak/>
               <w:t>Até 02 dias após aceite</w:t>
             </w:r>
           </w:p>
@@ -4032,7 +3577,6 @@
                 <w:bCs/>
                 <w:color w:val="1F1F1F"/>
               </w:rPr>
-              <w:lastRenderedPageBreak/>
               <w:t>3. Processamento</w:t>
             </w:r>
           </w:p>
@@ -4431,27 +3975,7 @@
           <w:bCs/>
           <w:color w:val="1F1F1F"/>
         </w:rPr>
-        <w:t>R$ ${</w:t>
-      </w:r>
-      <w:proofErr w:type="spellStart"/>
-      <w:r>
-        <w:rPr>
-          <w:rFonts w:ascii="Google Sans Text" w:eastAsia="Google Sans Text" w:hAnsi="Google Sans Text" w:cs="Google Sans Text"/>
-          <w:b/>
-          <w:bCs/>
-          <w:color w:val="1F1F1F"/>
-        </w:rPr>
-        <w:t>ValorProposta</w:t>
-      </w:r>
-      <w:proofErr w:type="spellEnd"/>
-      <w:r>
-        <w:rPr>
-          <w:rFonts w:ascii="Google Sans Text" w:eastAsia="Google Sans Text" w:hAnsi="Google Sans Text" w:cs="Google Sans Text"/>
-          <w:b/>
-          <w:bCs/>
-          <w:color w:val="1F1F1F"/>
-        </w:rPr>
-        <w:t>}</w:t>
+        <w:t>R$ ${ValorProposta}</w:t>
       </w:r>
       <w:r>
         <w:rPr>
@@ -4467,27 +3991,7 @@
           <w:bCs/>
           <w:color w:val="1F1F1F"/>
         </w:rPr>
-        <w:t>(${</w:t>
-      </w:r>
-      <w:proofErr w:type="spellStart"/>
-      <w:r>
-        <w:rPr>
-          <w:rFonts w:ascii="Google Sans Text" w:eastAsia="Google Sans Text" w:hAnsi="Google Sans Text" w:cs="Google Sans Text"/>
-          <w:b/>
-          <w:bCs/>
-          <w:color w:val="1F1F1F"/>
-        </w:rPr>
-        <w:t>ValorExtenso</w:t>
-      </w:r>
-      <w:proofErr w:type="spellEnd"/>
-      <w:r>
-        <w:rPr>
-          <w:rFonts w:ascii="Google Sans Text" w:eastAsia="Google Sans Text" w:hAnsi="Google Sans Text" w:cs="Google Sans Text"/>
-          <w:b/>
-          <w:bCs/>
-          <w:color w:val="1F1F1F"/>
-        </w:rPr>
-        <w:t>})</w:t>
+        <w:t>(${ValorExtenso})</w:t>
       </w:r>
       <w:r>
         <w:rPr>
@@ -4608,67 +4112,7 @@
                 <w:bCs/>
                 <w:color w:val="1F1F1F"/>
               </w:rPr>
-              <w:t>${</w:t>
-            </w:r>
-            <w:proofErr w:type="spellStart"/>
-            <w:r>
-              <w:rPr>
-                <w:rFonts w:ascii="Google Sans Text" w:eastAsia="Google Sans Text" w:hAnsi="Google Sans Text" w:cs="Google Sans Text"/>
-                <w:b/>
-                <w:bCs/>
-                <w:color w:val="1F1F1F"/>
-              </w:rPr>
-              <w:t>mobilizacao_</w:t>
-            </w:r>
-            <w:proofErr w:type="gramStart"/>
-            <w:r>
-              <w:rPr>
-                <w:rFonts w:ascii="Google Sans Text" w:eastAsia="Google Sans Text" w:hAnsi="Google Sans Text" w:cs="Google Sans Text"/>
-                <w:b/>
-                <w:bCs/>
-                <w:color w:val="1F1F1F"/>
-              </w:rPr>
-              <w:t>percentual</w:t>
-            </w:r>
-            <w:proofErr w:type="spellEnd"/>
-            <w:r>
-              <w:rPr>
-                <w:rFonts w:ascii="Google Sans Text" w:eastAsia="Google Sans Text" w:hAnsi="Google Sans Text" w:cs="Google Sans Text"/>
-                <w:b/>
-                <w:bCs/>
-                <w:color w:val="1F1F1F"/>
-              </w:rPr>
-              <w:t>}%</w:t>
-            </w:r>
-            <w:proofErr w:type="gramEnd"/>
-            <w:r>
-              <w:rPr>
-                <w:rFonts w:ascii="Google Sans Text" w:eastAsia="Google Sans Text" w:hAnsi="Google Sans Text" w:cs="Google Sans Text"/>
-                <w:b/>
-                <w:bCs/>
-                <w:color w:val="1F1F1F"/>
-              </w:rPr>
-              <w:t xml:space="preserve"> – R$ ${</w:t>
-            </w:r>
-            <w:proofErr w:type="spellStart"/>
-            <w:r>
-              <w:rPr>
-                <w:rFonts w:ascii="Google Sans Text" w:eastAsia="Google Sans Text" w:hAnsi="Google Sans Text" w:cs="Google Sans Text"/>
-                <w:b/>
-                <w:bCs/>
-                <w:color w:val="1F1F1F"/>
-              </w:rPr>
-              <w:t>mobilizacao_valor</w:t>
-            </w:r>
-            <w:proofErr w:type="spellEnd"/>
-            <w:r>
-              <w:rPr>
-                <w:rFonts w:ascii="Google Sans Text" w:eastAsia="Google Sans Text" w:hAnsi="Google Sans Text" w:cs="Google Sans Text"/>
-                <w:b/>
-                <w:bCs/>
-                <w:color w:val="1F1F1F"/>
-              </w:rPr>
-              <w:t>}</w:t>
+              <w:t>${mobilizacao_percentual}% – R$ ${mobilizacao_valor}</w:t>
             </w:r>
             <w:r>
               <w:rPr>
@@ -4722,67 +4166,7 @@
                 <w:bCs/>
                 <w:color w:val="1F1F1F"/>
               </w:rPr>
-              <w:t>${</w:t>
-            </w:r>
-            <w:proofErr w:type="spellStart"/>
-            <w:r>
-              <w:rPr>
-                <w:rFonts w:ascii="Google Sans Text" w:eastAsia="Google Sans Text" w:hAnsi="Google Sans Text" w:cs="Google Sans Text"/>
-                <w:b/>
-                <w:bCs/>
-                <w:color w:val="1F1F1F"/>
-              </w:rPr>
-              <w:t>restante_</w:t>
-            </w:r>
-            <w:proofErr w:type="gramStart"/>
-            <w:r>
-              <w:rPr>
-                <w:rFonts w:ascii="Google Sans Text" w:eastAsia="Google Sans Text" w:hAnsi="Google Sans Text" w:cs="Google Sans Text"/>
-                <w:b/>
-                <w:bCs/>
-                <w:color w:val="1F1F1F"/>
-              </w:rPr>
-              <w:t>percentual</w:t>
-            </w:r>
-            <w:proofErr w:type="spellEnd"/>
-            <w:r>
-              <w:rPr>
-                <w:rFonts w:ascii="Google Sans Text" w:eastAsia="Google Sans Text" w:hAnsi="Google Sans Text" w:cs="Google Sans Text"/>
-                <w:b/>
-                <w:bCs/>
-                <w:color w:val="1F1F1F"/>
-              </w:rPr>
-              <w:t>}%</w:t>
-            </w:r>
-            <w:proofErr w:type="gramEnd"/>
-            <w:r>
-              <w:rPr>
-                <w:rFonts w:ascii="Google Sans Text" w:eastAsia="Google Sans Text" w:hAnsi="Google Sans Text" w:cs="Google Sans Text"/>
-                <w:b/>
-                <w:bCs/>
-                <w:color w:val="1F1F1F"/>
-              </w:rPr>
-              <w:t xml:space="preserve"> – R$ ${</w:t>
-            </w:r>
-            <w:proofErr w:type="spellStart"/>
-            <w:r>
-              <w:rPr>
-                <w:rFonts w:ascii="Google Sans Text" w:eastAsia="Google Sans Text" w:hAnsi="Google Sans Text" w:cs="Google Sans Text"/>
-                <w:b/>
-                <w:bCs/>
-                <w:color w:val="1F1F1F"/>
-              </w:rPr>
-              <w:t>restante_valor</w:t>
-            </w:r>
-            <w:proofErr w:type="spellEnd"/>
-            <w:r>
-              <w:rPr>
-                <w:rFonts w:ascii="Google Sans Text" w:eastAsia="Google Sans Text" w:hAnsi="Google Sans Text" w:cs="Google Sans Text"/>
-                <w:b/>
-                <w:bCs/>
-                <w:color w:val="1F1F1F"/>
-              </w:rPr>
-              <w:t>}</w:t>
+              <w:t>${restante_percentual}% – R$ ${restante_valor}</w:t>
             </w:r>
             <w:r>
               <w:rPr>
@@ -5104,6 +4488,7 @@
           <w:rFonts w:ascii="Google Sans" w:eastAsia="Google Sans" w:hAnsi="Google Sans" w:cs="Google Sans"/>
           <w:color w:val="1F1F1F"/>
         </w:rPr>
+        <w:lastRenderedPageBreak/>
         <w:t>11. Considerações Finais</w:t>
       </w:r>
     </w:p>
@@ -5143,15 +4528,7 @@
           <w:rFonts w:ascii="Google Sans Text" w:eastAsia="Google Sans Text" w:hAnsi="Google Sans Text" w:cs="Google Sans Text"/>
           <w:color w:val="1F1F1F"/>
         </w:rPr>
-        <w:t xml:space="preserve">traz em seu DNA uma sólida vivência prática em obras complexas, aplicando o rigor da topografia clássica às inovações do mapeamento aéreo. Entendemos a </w:t>
-      </w:r>
-      <w:r>
-        <w:rPr>
-          <w:rFonts w:ascii="Google Sans Text" w:eastAsia="Google Sans Text" w:hAnsi="Google Sans Text" w:cs="Google Sans Text"/>
-          <w:color w:val="1F1F1F"/>
-        </w:rPr>
-        <w:lastRenderedPageBreak/>
-        <w:t>responsabilidade que um levantamento planialtimétrico carrega em projetos de engenharia e infraestrutura. Por isso, nossa equipe coloca-se à disposição para alinhar as melhores soluções técnicas para a sua demanda, assegurando a entrega de um produto final de altíssima confiabilidade e precisão.</w:t>
+        <w:t>traz em seu DNA uma sólida vivência prática em obras complexas, aplicando o rigor da topografia clássica às inovações do mapeamento aéreo. Entendemos a responsabilidade que um levantamento planialtimétrico carrega em projetos de engenharia e infraestrutura. Por isso, nossa equipe coloca-se à disposição para alinhar as melhores soluções técnicas para a sua demanda, assegurando a entrega de um produto final de altíssima confiabilidade e precisão.</w:t>
       </w:r>
     </w:p>
     <w:p>
@@ -5333,21 +4710,7 @@
         <w:rPr>
           <w:rFonts w:ascii="Google Sans Text" w:eastAsia="Google Sans Text" w:hAnsi="Google Sans Text" w:cs="Google Sans Text"/>
         </w:rPr>
-        <w:t>${Empresa} - ${</w:t>
-      </w:r>
-      <w:proofErr w:type="spellStart"/>
-      <w:r>
-        <w:rPr>
-          <w:rFonts w:ascii="Google Sans Text" w:eastAsia="Google Sans Text" w:hAnsi="Google Sans Text" w:cs="Google Sans Text"/>
-        </w:rPr>
-        <w:t>whatsapp</w:t>
-      </w:r>
-      <w:proofErr w:type="spellEnd"/>
-      <w:r>
-        <w:rPr>
-          <w:rFonts w:ascii="Google Sans Text" w:eastAsia="Google Sans Text" w:hAnsi="Google Sans Text" w:cs="Google Sans Text"/>
-        </w:rPr>
-        <w:t>}</w:t>
+        <w:t>${Empresa} - ${whatsapp}</w:t>
       </w:r>
     </w:p>
     <w:sectPr>
@@ -5479,39 +4842,7 @@
         <w:b/>
         <w:bCs/>
       </w:rPr>
-      <w:t>${</w:t>
-    </w:r>
-    <w:proofErr w:type="spellStart"/>
-    <w:r>
-      <w:rPr>
-        <w:b/>
-        <w:bCs/>
-      </w:rPr>
-      <w:t>empresa_proponente_nome</w:t>
-    </w:r>
-    <w:proofErr w:type="spellEnd"/>
-    <w:r>
-      <w:rPr>
-        <w:b/>
-        <w:bCs/>
-      </w:rPr>
-      <w:t>} | ${</w:t>
-    </w:r>
-    <w:proofErr w:type="spellStart"/>
-    <w:r>
-      <w:rPr>
-        <w:b/>
-        <w:bCs/>
-      </w:rPr>
-      <w:t>empresa_proponente_cidade</w:t>
-    </w:r>
-    <w:proofErr w:type="spellEnd"/>
-    <w:r>
-      <w:rPr>
-        <w:b/>
-        <w:bCs/>
-      </w:rPr>
-      <w:t>}</w:t>
+      <w:t>${empresa_proponente_nome} | ${empresa_proponente_cidade}</w:t>
     </w:r>
   </w:p>
   <w:p>
@@ -5564,15 +4895,7 @@
       <w:pStyle w:val="Cabealho"/>
     </w:pPr>
     <w:r>
-      <w:t>${</w:t>
-    </w:r>
-    <w:proofErr w:type="spellStart"/>
-    <w:r>
-      <w:t>logo_empresa</w:t>
-    </w:r>
-    <w:proofErr w:type="spellEnd"/>
-    <w:r>
-      <w:t>}</w:t>
+      <w:t>${logo_empresa}</w:t>
     </w:r>
   </w:p>
 </w:hdr>

</xml_diff>